<commit_message>
Add Kelas Jabatan Prestasi Yang Diharapkan
</commit_message>
<xml_diff>
--- a/public/templates/anjab.docx
+++ b/public/templates/anjab.docx
@@ -10510,12 +10510,13 @@
     <w:p>
       <w:pPr>
         <w:pStyle w:val="NormalWeb"/>
+        <w:keepNext/>
         <w:numPr>
           <w:ilvl w:val="0"/>
           <w:numId w:val="2"/>
         </w:numPr>
         <w:spacing w:beforeLines="0" w:before="120" w:afterLines="0" w:after="120"/>
-        <w:ind w:left="426" w:hanging="426"/>
+        <w:ind w:left="425" w:hanging="425"/>
         <w:jc w:val="both"/>
         <w:rPr>
           <w:rFonts w:ascii="Tahoma" w:hAnsi="Tahoma" w:cs="Tahoma"/>
@@ -10562,15 +10563,15 @@
         <w:tblLook w:val="04A0" w:firstRow="1" w:lastRow="0" w:firstColumn="1" w:lastColumn="0" w:noHBand="0" w:noVBand="1"/>
       </w:tblPr>
       <w:tblGrid>
-        <w:gridCol w:w="455"/>
-        <w:gridCol w:w="2090"/>
+        <w:gridCol w:w="426"/>
+        <w:gridCol w:w="3184"/>
         <w:gridCol w:w="344"/>
-        <w:gridCol w:w="5955"/>
+        <w:gridCol w:w="4890"/>
       </w:tblGrid>
       <w:tr>
         <w:tc>
           <w:tcPr>
-            <w:tcW w:w="455" w:type="dxa"/>
+            <w:tcW w:w="426" w:type="dxa"/>
           </w:tcPr>
           <w:p>
             <w:pPr>
@@ -10593,7 +10594,7 @@
         </w:tc>
         <w:tc>
           <w:tcPr>
-            <w:tcW w:w="2090" w:type="dxa"/>
+            <w:tcW w:w="3184" w:type="dxa"/>
           </w:tcPr>
           <w:p>
             <w:pPr>
@@ -10604,37 +10605,22 @@
                 <w:bCs/>
               </w:rPr>
             </w:pPr>
-            <w:proofErr w:type="spellStart"/>
-            <w:r>
-              <w:rPr>
-                <w:rFonts w:ascii="Tahoma" w:hAnsi="Tahoma" w:cs="Tahoma"/>
-                <w:bCs/>
-              </w:rPr>
-              <w:t>Keterampilan</w:t>
-            </w:r>
-            <w:proofErr w:type="spellEnd"/>
-            <w:r>
-              <w:rPr>
-                <w:rFonts w:ascii="Tahoma" w:hAnsi="Tahoma" w:cs="Tahoma"/>
-                <w:bCs/>
-              </w:rPr>
-              <w:t xml:space="preserve"> </w:t>
-            </w:r>
-            <w:proofErr w:type="spellStart"/>
-            <w:r>
-              <w:rPr>
-                <w:rFonts w:ascii="Tahoma" w:hAnsi="Tahoma" w:cs="Tahoma"/>
-                <w:bCs/>
-              </w:rPr>
-              <w:t>Kerja</w:t>
-            </w:r>
-            <w:proofErr w:type="spellEnd"/>
-            <w:r>
-              <w:rPr>
-                <w:rFonts w:ascii="Tahoma" w:hAnsi="Tahoma" w:cs="Tahoma"/>
-                <w:bCs/>
-              </w:rPr>
-              <w:t xml:space="preserve"> </w:t>
+            <w:r>
+              <w:rPr>
+                <w:rFonts w:ascii="Tahoma" w:hAnsi="Tahoma" w:cs="Tahoma"/>
+                <w:bCs/>
+                <w:sz w:val="22"/>
+                <w:szCs w:val="22"/>
+                <w:lang w:val="en-ID"/>
+              </w:rPr>
+              <w:t>{#syarat_jabatan}</w:t>
+            </w:r>
+            <w:r>
+              <w:rPr>
+                <w:rFonts w:ascii="Tahoma" w:hAnsi="Tahoma" w:cs="Tahoma"/>
+                <w:bCs/>
+              </w:rPr>
+              <w:t xml:space="preserve">Keterampilan Kerja </w:t>
             </w:r>
           </w:p>
         </w:tc>
@@ -10671,7 +10657,7 @@
         </w:tc>
         <w:tc>
           <w:tcPr>
-            <w:tcW w:w="5955" w:type="dxa"/>
+            <w:tcW w:w="4890" w:type="dxa"/>
           </w:tcPr>
           <w:p>
             <w:pPr>
@@ -10686,7 +10672,7 @@
                 <w:bCs/>
                 <w:color w:val="auto"/>
                 <w:szCs w:val="20"/>
-                <w:lang w:val="id-ID"/>
+                <w:lang w:val="en-ID"/>
               </w:rPr>
             </w:pPr>
             <w:r>
@@ -10696,20 +10682,27 @@
                 <w:bCs/>
                 <w:color w:val="auto"/>
                 <w:szCs w:val="20"/>
-                <w:lang w:val="id-ID"/>
-              </w:rPr>
-              <w:t xml:space="preserve">Mengoperasikan </w:t>
-            </w:r>
-            <w:r>
+                <w:lang w:val="en-ID"/>
+              </w:rPr>
+              <w:t>{#keterampilan}</w:t>
+            </w:r>
+          </w:p>
+          <w:p>
+            <w:pPr>
+              <w:tabs>
+                <w:tab w:val="left" w:pos="366"/>
+              </w:tabs>
+              <w:spacing w:before="60" w:after="60"/>
+              <w:jc w:val="both"/>
               <w:rPr>
                 <w:rFonts w:ascii="Tahoma" w:hAnsi="Tahoma" w:cs="Tahoma"/>
                 <w:b w:val="0"/>
                 <w:bCs/>
                 <w:color w:val="auto"/>
                 <w:szCs w:val="20"/>
-              </w:rPr>
-              <w:t>K</w:t>
-            </w:r>
+                <w:lang w:val="en-ID"/>
+              </w:rPr>
+            </w:pPr>
             <w:r>
               <w:rPr>
                 <w:rFonts w:ascii="Tahoma" w:hAnsi="Tahoma" w:cs="Tahoma"/>
@@ -10717,10 +10710,11 @@
                 <w:bCs/>
                 <w:color w:val="auto"/>
                 <w:szCs w:val="20"/>
-                <w:lang w:val="id-ID"/>
-              </w:rPr>
-              <w:t>omputer</w:t>
-            </w:r>
+                <w:lang w:val="en-ID"/>
+              </w:rPr>
+              <w:t>{</w:t>
+            </w:r>
+            <w:proofErr w:type="spellStart"/>
             <w:r>
               <w:rPr>
                 <w:rFonts w:ascii="Tahoma" w:hAnsi="Tahoma" w:cs="Tahoma"/>
@@ -10728,9 +10722,11 @@
                 <w:bCs/>
                 <w:color w:val="auto"/>
                 <w:szCs w:val="20"/>
-              </w:rPr>
-              <w:t xml:space="preserve">, </w:t>
-            </w:r>
+                <w:lang w:val="en-ID"/>
+              </w:rPr>
+              <w:t>teks</w:t>
+            </w:r>
+            <w:proofErr w:type="spellEnd"/>
             <w:r>
               <w:rPr>
                 <w:rFonts w:ascii="Tahoma" w:hAnsi="Tahoma" w:cs="Tahoma"/>
@@ -10738,20 +10734,27 @@
                 <w:bCs/>
                 <w:color w:val="auto"/>
                 <w:szCs w:val="20"/>
-                <w:lang w:val="id-ID"/>
-              </w:rPr>
-              <w:t>Mengoperasikan</w:t>
-            </w:r>
-            <w:r>
+                <w:lang w:val="en-ID"/>
+              </w:rPr>
+              <w:t>}</w:t>
+            </w:r>
+          </w:p>
+          <w:p>
+            <w:pPr>
+              <w:tabs>
+                <w:tab w:val="left" w:pos="366"/>
+              </w:tabs>
+              <w:spacing w:before="60" w:after="60"/>
+              <w:jc w:val="both"/>
               <w:rPr>
                 <w:rFonts w:ascii="Tahoma" w:hAnsi="Tahoma" w:cs="Tahoma"/>
                 <w:b w:val="0"/>
                 <w:bCs/>
                 <w:color w:val="auto"/>
                 <w:szCs w:val="20"/>
-              </w:rPr>
-              <w:t xml:space="preserve"> </w:t>
-            </w:r>
+                <w:lang w:val="en-ID"/>
+              </w:rPr>
+            </w:pPr>
             <w:r>
               <w:rPr>
                 <w:rFonts w:ascii="Tahoma" w:hAnsi="Tahoma" w:cs="Tahoma"/>
@@ -10759,9 +10762,11 @@
                 <w:bCs/>
                 <w:color w:val="auto"/>
                 <w:szCs w:val="20"/>
-              </w:rPr>
-              <w:t xml:space="preserve">Internet, </w:t>
-            </w:r>
+                <w:lang w:val="en-ID"/>
+              </w:rPr>
+              <w:t>{/</w:t>
+            </w:r>
+            <w:proofErr w:type="spellStart"/>
             <w:r>
               <w:rPr>
                 <w:rFonts w:ascii="Tahoma" w:hAnsi="Tahoma" w:cs="Tahoma"/>
@@ -10769,9 +10774,11 @@
                 <w:bCs/>
                 <w:color w:val="auto"/>
                 <w:szCs w:val="20"/>
-              </w:rPr>
-              <w:t>P</w:t>
-            </w:r>
+                <w:lang w:val="en-ID"/>
+              </w:rPr>
+              <w:t>keterampilan</w:t>
+            </w:r>
+            <w:proofErr w:type="spellEnd"/>
             <w:r>
               <w:rPr>
                 <w:rFonts w:ascii="Tahoma" w:hAnsi="Tahoma" w:cs="Tahoma"/>
@@ -10779,85 +10786,9 @@
                 <w:bCs/>
                 <w:color w:val="auto"/>
                 <w:szCs w:val="20"/>
-                <w:lang w:val="id-ID"/>
-              </w:rPr>
-              <w:t>resentasi</w:t>
-            </w:r>
-            <w:r>
-              <w:rPr>
-                <w:rFonts w:ascii="Tahoma" w:hAnsi="Tahoma" w:cs="Tahoma"/>
-                <w:b w:val="0"/>
-                <w:bCs/>
-                <w:color w:val="auto"/>
-                <w:szCs w:val="20"/>
-              </w:rPr>
-              <w:t xml:space="preserve">, </w:t>
-            </w:r>
-            <w:proofErr w:type="spellStart"/>
-            <w:r>
-              <w:rPr>
-                <w:rFonts w:ascii="Tahoma" w:hAnsi="Tahoma" w:cs="Tahoma"/>
-                <w:b w:val="0"/>
-                <w:bCs/>
-                <w:color w:val="auto"/>
-                <w:szCs w:val="20"/>
-              </w:rPr>
-              <w:t>Menganalisis</w:t>
-            </w:r>
-            <w:proofErr w:type="spellEnd"/>
-            <w:r>
-              <w:rPr>
-                <w:rFonts w:ascii="Tahoma" w:hAnsi="Tahoma" w:cs="Tahoma"/>
-                <w:b w:val="0"/>
-                <w:bCs/>
-                <w:color w:val="auto"/>
-                <w:szCs w:val="20"/>
-              </w:rPr>
-              <w:t xml:space="preserve"> </w:t>
-            </w:r>
-            <w:proofErr w:type="spellStart"/>
-            <w:r>
-              <w:rPr>
-                <w:rFonts w:ascii="Tahoma" w:hAnsi="Tahoma" w:cs="Tahoma"/>
-                <w:b w:val="0"/>
-                <w:bCs/>
-                <w:color w:val="auto"/>
-                <w:szCs w:val="20"/>
-              </w:rPr>
-              <w:t>Persoalan</w:t>
-            </w:r>
-            <w:proofErr w:type="spellEnd"/>
-            <w:r>
-              <w:rPr>
-                <w:rFonts w:ascii="Tahoma" w:hAnsi="Tahoma" w:cs="Tahoma"/>
-                <w:b w:val="0"/>
-                <w:bCs/>
-                <w:color w:val="auto"/>
-                <w:szCs w:val="20"/>
-              </w:rPr>
-              <w:t xml:space="preserve"> dan </w:t>
-            </w:r>
-            <w:proofErr w:type="spellStart"/>
-            <w:r>
-              <w:rPr>
-                <w:rFonts w:ascii="Tahoma" w:hAnsi="Tahoma" w:cs="Tahoma"/>
-                <w:b w:val="0"/>
-                <w:bCs/>
-                <w:color w:val="auto"/>
-                <w:szCs w:val="20"/>
-              </w:rPr>
-              <w:t>Memberikan</w:t>
-            </w:r>
-            <w:proofErr w:type="spellEnd"/>
-            <w:r>
-              <w:rPr>
-                <w:rFonts w:ascii="Tahoma" w:hAnsi="Tahoma" w:cs="Tahoma"/>
-                <w:b w:val="0"/>
-                <w:bCs/>
-                <w:color w:val="auto"/>
-                <w:szCs w:val="20"/>
-              </w:rPr>
-              <w:t xml:space="preserve"> Solusi</w:t>
+                <w:lang w:val="en-ID"/>
+              </w:rPr>
+              <w:t>}</w:t>
             </w:r>
           </w:p>
         </w:tc>
@@ -10865,7 +10796,7 @@
       <w:tr>
         <w:tc>
           <w:tcPr>
-            <w:tcW w:w="455" w:type="dxa"/>
+            <w:tcW w:w="426" w:type="dxa"/>
           </w:tcPr>
           <w:p>
             <w:pPr>
@@ -10888,7 +10819,7 @@
         </w:tc>
         <w:tc>
           <w:tcPr>
-            <w:tcW w:w="2090" w:type="dxa"/>
+            <w:tcW w:w="3184" w:type="dxa"/>
           </w:tcPr>
           <w:p>
             <w:pPr>
@@ -10957,7 +10888,7 @@
         </w:tc>
         <w:tc>
           <w:tcPr>
-            <w:tcW w:w="5955" w:type="dxa"/>
+            <w:tcW w:w="4890" w:type="dxa"/>
           </w:tcPr>
           <w:p>
             <w:pPr>
@@ -10970,7 +10901,7 @@
                 <w:bCs/>
                 <w:color w:val="auto"/>
                 <w:szCs w:val="20"/>
-                <w:lang w:val="sv-SE"/>
+                <w:lang w:val="en-ID"/>
               </w:rPr>
             </w:pPr>
             <w:r>
@@ -10980,29 +10911,65 @@
                 <w:bCs/>
                 <w:color w:val="auto"/>
                 <w:szCs w:val="20"/>
-                <w:lang w:val="sv-SE"/>
-              </w:rPr>
-              <w:t xml:space="preserve">G  =  </w:t>
-            </w:r>
-            <w:r>
-              <w:rPr>
-                <w:rFonts w:ascii="Tahoma" w:hAnsi="Tahoma" w:cs="Tahoma"/>
-                <w:b w:val="0"/>
-                <w:bCs/>
-                <w:i/>
+                <w:lang w:val="en-ID"/>
+              </w:rPr>
+              <w:t>{#bakat}</w:t>
+            </w:r>
+          </w:p>
+          <w:p>
+            <w:pPr>
+              <w:spacing w:before="60" w:after="60"/>
+              <w:ind w:right="57"/>
+              <w:jc w:val="both"/>
+              <w:rPr>
+                <w:rFonts w:ascii="Tahoma" w:hAnsi="Tahoma" w:cs="Tahoma"/>
+                <w:b w:val="0"/>
+                <w:bCs/>
                 <w:color w:val="auto"/>
                 <w:szCs w:val="20"/>
-                <w:lang w:val="sv-SE"/>
-              </w:rPr>
-              <w:t>Intelegensia</w:t>
-            </w:r>
-          </w:p>
-          <w:p>
-            <w:pPr>
-              <w:tabs>
-                <w:tab w:val="left" w:pos="366"/>
-              </w:tabs>
+                <w:lang w:val="en-ID"/>
+              </w:rPr>
+            </w:pPr>
+            <w:r>
+              <w:rPr>
+                <w:rFonts w:ascii="Tahoma" w:hAnsi="Tahoma" w:cs="Tahoma"/>
+                <w:b w:val="0"/>
+                <w:bCs/>
+                <w:color w:val="auto"/>
+                <w:szCs w:val="20"/>
+                <w:lang w:val="en-ID"/>
+              </w:rPr>
+              <w:t>{</w:t>
+            </w:r>
+            <w:proofErr w:type="spellStart"/>
+            <w:r>
+              <w:rPr>
+                <w:rFonts w:ascii="Tahoma" w:hAnsi="Tahoma" w:cs="Tahoma"/>
+                <w:b w:val="0"/>
+                <w:bCs/>
+                <w:color w:val="auto"/>
+                <w:szCs w:val="20"/>
+                <w:lang w:val="en-ID"/>
+              </w:rPr>
+              <w:t>teks</w:t>
+            </w:r>
+            <w:proofErr w:type="spellEnd"/>
+            <w:r>
+              <w:rPr>
+                <w:rFonts w:ascii="Tahoma" w:hAnsi="Tahoma" w:cs="Tahoma"/>
+                <w:b w:val="0"/>
+                <w:bCs/>
+                <w:color w:val="auto"/>
+                <w:szCs w:val="20"/>
+                <w:lang w:val="en-ID"/>
+              </w:rPr>
+              <w:t>}</w:t>
+            </w:r>
+          </w:p>
+          <w:p>
+            <w:pPr>
               <w:spacing w:before="60" w:after="60"/>
+              <w:ind w:right="57"/>
               <w:jc w:val="both"/>
               <w:rPr>
                 <w:rFonts w:ascii="Tahoma" w:hAnsi="Tahoma" w:cs="Tahoma"/>
@@ -11010,7 +10977,7 @@
                 <w:bCs/>
                 <w:color w:val="auto"/>
                 <w:szCs w:val="20"/>
-                <w:lang w:val="id-ID"/>
+                <w:lang w:val="en-ID"/>
               </w:rPr>
             </w:pPr>
             <w:r>
@@ -11020,9 +10987,33 @@
                 <w:bCs/>
                 <w:color w:val="auto"/>
                 <w:szCs w:val="20"/>
-                <w:lang w:val="id-ID"/>
-              </w:rPr>
-              <w:t>Kemampuan belajar secara umum</w:t>
+                <w:lang w:val="en-ID"/>
+              </w:rPr>
+              <w:t>{/</w:t>
+            </w:r>
+            <w:proofErr w:type="spellStart"/>
+            <w:r>
+              <w:rPr>
+                <w:rFonts w:ascii="Tahoma" w:hAnsi="Tahoma" w:cs="Tahoma"/>
+                <w:b w:val="0"/>
+                <w:bCs/>
+                <w:color w:val="auto"/>
+                <w:szCs w:val="20"/>
+                <w:lang w:val="en-ID"/>
+              </w:rPr>
+              <w:t>bakat</w:t>
+            </w:r>
+            <w:proofErr w:type="spellEnd"/>
+            <w:r>
+              <w:rPr>
+                <w:rFonts w:ascii="Tahoma" w:hAnsi="Tahoma" w:cs="Tahoma"/>
+                <w:b w:val="0"/>
+                <w:bCs/>
+                <w:color w:val="auto"/>
+                <w:szCs w:val="20"/>
+                <w:lang w:val="en-ID"/>
+              </w:rPr>
+              <w:t>}</w:t>
             </w:r>
           </w:p>
         </w:tc>
@@ -11030,7 +11021,7 @@
       <w:tr>
         <w:tc>
           <w:tcPr>
-            <w:tcW w:w="455" w:type="dxa"/>
+            <w:tcW w:w="426" w:type="dxa"/>
           </w:tcPr>
           <w:p>
             <w:pPr>
@@ -11040,14 +11031,20 @@
               <w:rPr>
                 <w:rFonts w:ascii="Tahoma" w:hAnsi="Tahoma" w:cs="Tahoma"/>
                 <w:bCs/>
-                <w:lang w:val="sv-SE"/>
-              </w:rPr>
-            </w:pPr>
+              </w:rPr>
+            </w:pPr>
+            <w:r>
+              <w:rPr>
+                <w:rFonts w:ascii="Tahoma" w:hAnsi="Tahoma" w:cs="Tahoma"/>
+                <w:bCs/>
+              </w:rPr>
+              <w:t>c.</w:t>
+            </w:r>
           </w:p>
         </w:tc>
         <w:tc>
           <w:tcPr>
-            <w:tcW w:w="2090" w:type="dxa"/>
+            <w:tcW w:w="3184" w:type="dxa"/>
           </w:tcPr>
           <w:p>
             <w:pPr>
@@ -11056,9 +11053,40 @@
               <w:rPr>
                 <w:rFonts w:ascii="Tahoma" w:hAnsi="Tahoma" w:cs="Tahoma"/>
                 <w:bCs/>
-                <w:lang w:val="sv-SE"/>
-              </w:rPr>
-            </w:pPr>
+              </w:rPr>
+            </w:pPr>
+            <w:proofErr w:type="spellStart"/>
+            <w:r>
+              <w:rPr>
+                <w:rFonts w:ascii="Tahoma" w:hAnsi="Tahoma" w:cs="Tahoma"/>
+                <w:bCs/>
+              </w:rPr>
+              <w:t>Temperamen</w:t>
+            </w:r>
+            <w:proofErr w:type="spellEnd"/>
+            <w:r>
+              <w:rPr>
+                <w:rFonts w:ascii="Tahoma" w:hAnsi="Tahoma" w:cs="Tahoma"/>
+                <w:bCs/>
+              </w:rPr>
+              <w:t xml:space="preserve"> </w:t>
+            </w:r>
+            <w:proofErr w:type="spellStart"/>
+            <w:r>
+              <w:rPr>
+                <w:rFonts w:ascii="Tahoma" w:hAnsi="Tahoma" w:cs="Tahoma"/>
+                <w:bCs/>
+              </w:rPr>
+              <w:t>Kerja</w:t>
+            </w:r>
+            <w:proofErr w:type="spellEnd"/>
+            <w:r>
+              <w:rPr>
+                <w:rFonts w:ascii="Tahoma" w:hAnsi="Tahoma" w:cs="Tahoma"/>
+                <w:bCs/>
+              </w:rPr>
+              <w:t xml:space="preserve"> </w:t>
+            </w:r>
           </w:p>
         </w:tc>
         <w:tc>
@@ -11076,14 +11104,23 @@
                 <w:bCs/>
                 <w:color w:val="auto"/>
                 <w:szCs w:val="20"/>
-                <w:lang w:val="sv-SE"/>
-              </w:rPr>
-            </w:pPr>
+              </w:rPr>
+            </w:pPr>
+            <w:r>
+              <w:rPr>
+                <w:rFonts w:ascii="Tahoma" w:hAnsi="Tahoma" w:cs="Tahoma"/>
+                <w:b w:val="0"/>
+                <w:bCs/>
+                <w:color w:val="auto"/>
+                <w:szCs w:val="20"/>
+              </w:rPr>
+              <w:t>:</w:t>
+            </w:r>
           </w:p>
         </w:tc>
         <w:tc>
           <w:tcPr>
-            <w:tcW w:w="5955" w:type="dxa"/>
+            <w:tcW w:w="4890" w:type="dxa"/>
           </w:tcPr>
           <w:p>
             <w:pPr>
@@ -11096,7 +11133,7 @@
                 <w:bCs/>
                 <w:color w:val="auto"/>
                 <w:szCs w:val="20"/>
-                <w:lang w:val="sv-SE"/>
+                <w:lang w:val="en-ID"/>
               </w:rPr>
             </w:pPr>
             <w:r>
@@ -11106,29 +11143,65 @@
                 <w:bCs/>
                 <w:color w:val="auto"/>
                 <w:szCs w:val="20"/>
-                <w:lang w:val="sv-SE"/>
-              </w:rPr>
-              <w:t xml:space="preserve">V  =  </w:t>
-            </w:r>
-            <w:r>
-              <w:rPr>
-                <w:rFonts w:ascii="Tahoma" w:hAnsi="Tahoma" w:cs="Tahoma"/>
-                <w:b w:val="0"/>
-                <w:bCs/>
-                <w:i/>
+                <w:lang w:val="en-ID"/>
+              </w:rPr>
+              <w:t>{#temperamen}</w:t>
+            </w:r>
+          </w:p>
+          <w:p>
+            <w:pPr>
+              <w:spacing w:before="60" w:after="60"/>
+              <w:ind w:right="57"/>
+              <w:jc w:val="both"/>
+              <w:rPr>
+                <w:rFonts w:ascii="Tahoma" w:hAnsi="Tahoma" w:cs="Tahoma"/>
+                <w:b w:val="0"/>
+                <w:bCs/>
                 <w:color w:val="auto"/>
                 <w:szCs w:val="20"/>
-                <w:lang w:val="sv-SE"/>
-              </w:rPr>
-              <w:t>Verbal</w:t>
-            </w:r>
-          </w:p>
-          <w:p>
-            <w:pPr>
-              <w:tabs>
-                <w:tab w:val="left" w:pos="366"/>
-              </w:tabs>
+                <w:lang w:val="en-ID"/>
+              </w:rPr>
+            </w:pPr>
+            <w:r>
+              <w:rPr>
+                <w:rFonts w:ascii="Tahoma" w:hAnsi="Tahoma" w:cs="Tahoma"/>
+                <w:b w:val="0"/>
+                <w:bCs/>
+                <w:color w:val="auto"/>
+                <w:szCs w:val="20"/>
+                <w:lang w:val="en-ID"/>
+              </w:rPr>
+              <w:t>{</w:t>
+            </w:r>
+            <w:proofErr w:type="spellStart"/>
+            <w:r>
+              <w:rPr>
+                <w:rFonts w:ascii="Tahoma" w:hAnsi="Tahoma" w:cs="Tahoma"/>
+                <w:b w:val="0"/>
+                <w:bCs/>
+                <w:color w:val="auto"/>
+                <w:szCs w:val="20"/>
+                <w:lang w:val="en-ID"/>
+              </w:rPr>
+              <w:t>teks</w:t>
+            </w:r>
+            <w:proofErr w:type="spellEnd"/>
+            <w:r>
+              <w:rPr>
+                <w:rFonts w:ascii="Tahoma" w:hAnsi="Tahoma" w:cs="Tahoma"/>
+                <w:b w:val="0"/>
+                <w:bCs/>
+                <w:color w:val="auto"/>
+                <w:szCs w:val="20"/>
+                <w:lang w:val="en-ID"/>
+              </w:rPr>
+              <w:t>}</w:t>
+            </w:r>
+          </w:p>
+          <w:p>
+            <w:pPr>
               <w:spacing w:before="60" w:after="60"/>
+              <w:ind w:right="57"/>
               <w:jc w:val="both"/>
               <w:rPr>
                 <w:rFonts w:ascii="Tahoma" w:hAnsi="Tahoma" w:cs="Tahoma"/>
@@ -11136,7 +11209,7 @@
                 <w:bCs/>
                 <w:color w:val="auto"/>
                 <w:szCs w:val="20"/>
-                <w:lang w:val="id-ID"/>
+                <w:lang w:val="en-ID"/>
               </w:rPr>
             </w:pPr>
             <w:r>
@@ -11146,9 +11219,33 @@
                 <w:bCs/>
                 <w:color w:val="auto"/>
                 <w:szCs w:val="20"/>
-                <w:lang w:val="id-ID"/>
-              </w:rPr>
-              <w:t xml:space="preserve">kemampuan untuk memahami arti kata-kata dan penggunaannya secara tepat dan efektif;  </w:t>
+                <w:lang w:val="en-ID"/>
+              </w:rPr>
+              <w:t>{/</w:t>
+            </w:r>
+            <w:proofErr w:type="spellStart"/>
+            <w:r>
+              <w:rPr>
+                <w:rFonts w:ascii="Tahoma" w:hAnsi="Tahoma" w:cs="Tahoma"/>
+                <w:b w:val="0"/>
+                <w:bCs/>
+                <w:color w:val="auto"/>
+                <w:szCs w:val="20"/>
+                <w:lang w:val="en-ID"/>
+              </w:rPr>
+              <w:t>temperamen</w:t>
+            </w:r>
+            <w:proofErr w:type="spellEnd"/>
+            <w:r>
+              <w:rPr>
+                <w:rFonts w:ascii="Tahoma" w:hAnsi="Tahoma" w:cs="Tahoma"/>
+                <w:b w:val="0"/>
+                <w:bCs/>
+                <w:color w:val="auto"/>
+                <w:szCs w:val="20"/>
+                <w:lang w:val="en-ID"/>
+              </w:rPr>
+              <w:t>}</w:t>
             </w:r>
           </w:p>
         </w:tc>
@@ -11156,7 +11253,7 @@
       <w:tr>
         <w:tc>
           <w:tcPr>
-            <w:tcW w:w="455" w:type="dxa"/>
+            <w:tcW w:w="426" w:type="dxa"/>
           </w:tcPr>
           <w:p>
             <w:pPr>
@@ -11166,14 +11263,20 @@
               <w:rPr>
                 <w:rFonts w:ascii="Tahoma" w:hAnsi="Tahoma" w:cs="Tahoma"/>
                 <w:bCs/>
-                <w:lang w:val="sv-SE"/>
-              </w:rPr>
-            </w:pPr>
+              </w:rPr>
+            </w:pPr>
+            <w:r>
+              <w:rPr>
+                <w:rFonts w:ascii="Tahoma" w:hAnsi="Tahoma" w:cs="Tahoma"/>
+                <w:bCs/>
+              </w:rPr>
+              <w:t>d.</w:t>
+            </w:r>
           </w:p>
         </w:tc>
         <w:tc>
           <w:tcPr>
-            <w:tcW w:w="2090" w:type="dxa"/>
+            <w:tcW w:w="3184" w:type="dxa"/>
           </w:tcPr>
           <w:p>
             <w:pPr>
@@ -11182,9 +11285,31 @@
               <w:rPr>
                 <w:rFonts w:ascii="Tahoma" w:hAnsi="Tahoma" w:cs="Tahoma"/>
                 <w:bCs/>
-                <w:lang w:val="sv-SE"/>
-              </w:rPr>
-            </w:pPr>
+              </w:rPr>
+            </w:pPr>
+            <w:r>
+              <w:rPr>
+                <w:rFonts w:ascii="Tahoma" w:hAnsi="Tahoma" w:cs="Tahoma"/>
+                <w:bCs/>
+              </w:rPr>
+              <w:t xml:space="preserve">Minat </w:t>
+            </w:r>
+            <w:proofErr w:type="spellStart"/>
+            <w:r>
+              <w:rPr>
+                <w:rFonts w:ascii="Tahoma" w:hAnsi="Tahoma" w:cs="Tahoma"/>
+                <w:bCs/>
+              </w:rPr>
+              <w:t>Kerja</w:t>
+            </w:r>
+            <w:proofErr w:type="spellEnd"/>
+            <w:r>
+              <w:rPr>
+                <w:rFonts w:ascii="Tahoma" w:hAnsi="Tahoma" w:cs="Tahoma"/>
+                <w:bCs/>
+              </w:rPr>
+              <w:t xml:space="preserve"> </w:t>
+            </w:r>
           </w:p>
         </w:tc>
         <w:tc>
@@ -11202,14 +11327,23 @@
                 <w:bCs/>
                 <w:color w:val="auto"/>
                 <w:szCs w:val="20"/>
-                <w:lang w:val="sv-SE"/>
-              </w:rPr>
-            </w:pPr>
+              </w:rPr>
+            </w:pPr>
+            <w:r>
+              <w:rPr>
+                <w:rFonts w:ascii="Tahoma" w:hAnsi="Tahoma" w:cs="Tahoma"/>
+                <w:b w:val="0"/>
+                <w:bCs/>
+                <w:color w:val="auto"/>
+                <w:szCs w:val="20"/>
+              </w:rPr>
+              <w:t>:</w:t>
+            </w:r>
           </w:p>
         </w:tc>
         <w:tc>
           <w:tcPr>
-            <w:tcW w:w="5955" w:type="dxa"/>
+            <w:tcW w:w="4890" w:type="dxa"/>
           </w:tcPr>
           <w:p>
             <w:pPr>
@@ -11220,10 +11354,9 @@
                 <w:rFonts w:ascii="Tahoma" w:hAnsi="Tahoma" w:cs="Tahoma"/>
                 <w:b w:val="0"/>
                 <w:bCs/>
-                <w:i/>
                 <w:color w:val="auto"/>
                 <w:szCs w:val="20"/>
-                <w:lang w:val="sv-SE"/>
+                <w:lang w:val="en-ID"/>
               </w:rPr>
             </w:pPr>
             <w:r>
@@ -11233,21 +11366,9 @@
                 <w:bCs/>
                 <w:color w:val="auto"/>
                 <w:szCs w:val="20"/>
-                <w:lang w:val="sv-SE"/>
-              </w:rPr>
-              <w:t xml:space="preserve">N  =  </w:t>
-            </w:r>
-            <w:r>
-              <w:rPr>
-                <w:rFonts w:ascii="Tahoma" w:hAnsi="Tahoma" w:cs="Tahoma"/>
-                <w:b w:val="0"/>
-                <w:bCs/>
-                <w:i/>
-                <w:color w:val="auto"/>
-                <w:szCs w:val="20"/>
-                <w:lang w:val="sv-SE"/>
-              </w:rPr>
-              <w:t>Numerik</w:t>
+                <w:lang w:val="en-ID"/>
+              </w:rPr>
+              <w:t>{#minat}</w:t>
             </w:r>
           </w:p>
           <w:p>
@@ -11261,7 +11382,7 @@
                 <w:bCs/>
                 <w:color w:val="auto"/>
                 <w:szCs w:val="20"/>
-                <w:lang w:val="id-ID"/>
+                <w:lang w:val="en-ID"/>
               </w:rPr>
             </w:pPr>
             <w:r>
@@ -11271,22 +11392,24 @@
                 <w:bCs/>
                 <w:color w:val="auto"/>
                 <w:szCs w:val="20"/>
-                <w:lang w:val="id-ID"/>
-              </w:rPr>
-              <w:t xml:space="preserve">Kemampuan untuk melakukan operasi </w:t>
-            </w:r>
-            <w:r>
-              <w:rPr>
-                <w:rFonts w:ascii="Tahoma" w:hAnsi="Tahoma" w:cs="Tahoma"/>
-                <w:b w:val="0"/>
-                <w:bCs/>
-                <w:i/>
+                <w:lang w:val="en-ID"/>
+              </w:rPr>
+              <w:lastRenderedPageBreak/>
+              <w:t>{</w:t>
+            </w:r>
+            <w:proofErr w:type="spellStart"/>
+            <w:r>
+              <w:rPr>
+                <w:rFonts w:ascii="Tahoma" w:hAnsi="Tahoma" w:cs="Tahoma"/>
+                <w:b w:val="0"/>
+                <w:bCs/>
                 <w:color w:val="auto"/>
                 <w:szCs w:val="20"/>
-                <w:lang w:val="id-ID"/>
-              </w:rPr>
-              <w:t xml:space="preserve">arithmatik </w:t>
-            </w:r>
+                <w:lang w:val="en-ID"/>
+              </w:rPr>
+              <w:t>teks</w:t>
+            </w:r>
+            <w:proofErr w:type="spellEnd"/>
             <w:r>
               <w:rPr>
                 <w:rFonts w:ascii="Tahoma" w:hAnsi="Tahoma" w:cs="Tahoma"/>
@@ -11294,9 +11417,59 @@
                 <w:bCs/>
                 <w:color w:val="auto"/>
                 <w:szCs w:val="20"/>
-                <w:lang w:val="id-ID"/>
-              </w:rPr>
-              <w:t>secara tepat dan akurat</w:t>
+                <w:lang w:val="en-ID"/>
+              </w:rPr>
+              <w:t>}</w:t>
+            </w:r>
+          </w:p>
+          <w:p>
+            <w:pPr>
+              <w:spacing w:before="60" w:after="60"/>
+              <w:ind w:right="57"/>
+              <w:jc w:val="both"/>
+              <w:rPr>
+                <w:rFonts w:ascii="Tahoma" w:hAnsi="Tahoma" w:cs="Tahoma"/>
+                <w:b w:val="0"/>
+                <w:bCs/>
+                <w:color w:val="auto"/>
+                <w:szCs w:val="20"/>
+                <w:lang w:val="en-ID"/>
+              </w:rPr>
+            </w:pPr>
+            <w:r>
+              <w:rPr>
+                <w:rFonts w:ascii="Tahoma" w:hAnsi="Tahoma" w:cs="Tahoma"/>
+                <w:b w:val="0"/>
+                <w:bCs/>
+                <w:color w:val="auto"/>
+                <w:szCs w:val="20"/>
+                <w:lang w:val="en-ID"/>
+              </w:rPr>
+              <w:t>{/</w:t>
+            </w:r>
+            <w:proofErr w:type="spellStart"/>
+            <w:r>
+              <w:rPr>
+                <w:rFonts w:ascii="Tahoma" w:hAnsi="Tahoma" w:cs="Tahoma"/>
+                <w:b w:val="0"/>
+                <w:bCs/>
+                <w:color w:val="auto"/>
+                <w:szCs w:val="20"/>
+                <w:lang w:val="en-ID"/>
+              </w:rPr>
+              <w:t>minat</w:t>
+            </w:r>
+            <w:proofErr w:type="spellEnd"/>
+            <w:r>
+              <w:rPr>
+                <w:rFonts w:ascii="Tahoma" w:hAnsi="Tahoma" w:cs="Tahoma"/>
+                <w:b w:val="0"/>
+                <w:bCs/>
+                <w:color w:val="auto"/>
+                <w:szCs w:val="20"/>
+                <w:lang w:val="en-ID"/>
+              </w:rPr>
+              <w:t>}</w:t>
             </w:r>
           </w:p>
         </w:tc>
@@ -11304,7 +11477,7 @@
       <w:tr>
         <w:tc>
           <w:tcPr>
-            <w:tcW w:w="455" w:type="dxa"/>
+            <w:tcW w:w="426" w:type="dxa"/>
           </w:tcPr>
           <w:p>
             <w:pPr>
@@ -11322,13 +11495,13 @@
                 <w:bCs/>
               </w:rPr>
               <w:lastRenderedPageBreak/>
-              <w:t>c.</w:t>
+              <w:t>e.</w:t>
             </w:r>
           </w:p>
         </w:tc>
         <w:tc>
           <w:tcPr>
-            <w:tcW w:w="2090" w:type="dxa"/>
+            <w:tcW w:w="3184" w:type="dxa"/>
           </w:tcPr>
           <w:p>
             <w:pPr>
@@ -11339,29 +11512,20 @@
                 <w:bCs/>
               </w:rPr>
             </w:pPr>
+            <w:r>
+              <w:rPr>
+                <w:rFonts w:ascii="Tahoma" w:hAnsi="Tahoma" w:cs="Tahoma"/>
+                <w:bCs/>
+              </w:rPr>
+              <w:t xml:space="preserve">Upaya </w:t>
+            </w:r>
             <w:proofErr w:type="spellStart"/>
             <w:r>
               <w:rPr>
                 <w:rFonts w:ascii="Tahoma" w:hAnsi="Tahoma" w:cs="Tahoma"/>
                 <w:bCs/>
               </w:rPr>
-              <w:t>Temperamen</w:t>
-            </w:r>
-            <w:proofErr w:type="spellEnd"/>
-            <w:r>
-              <w:rPr>
-                <w:rFonts w:ascii="Tahoma" w:hAnsi="Tahoma" w:cs="Tahoma"/>
-                <w:bCs/>
-              </w:rPr>
-              <w:t xml:space="preserve"> </w:t>
-            </w:r>
-            <w:proofErr w:type="spellStart"/>
-            <w:r>
-              <w:rPr>
-                <w:rFonts w:ascii="Tahoma" w:hAnsi="Tahoma" w:cs="Tahoma"/>
-                <w:bCs/>
-              </w:rPr>
-              <w:t>Kerja</w:t>
+              <w:t>Fisik</w:t>
             </w:r>
             <w:proofErr w:type="spellEnd"/>
             <w:r>
@@ -11404,7 +11568,7 @@
         </w:tc>
         <w:tc>
           <w:tcPr>
-            <w:tcW w:w="5955" w:type="dxa"/>
+            <w:tcW w:w="4890" w:type="dxa"/>
           </w:tcPr>
           <w:p>
             <w:pPr>
@@ -11417,6 +11581,7 @@
                 <w:bCs/>
                 <w:color w:val="auto"/>
                 <w:szCs w:val="20"/>
+                <w:lang w:val="en-ID"/>
               </w:rPr>
             </w:pPr>
             <w:r>
@@ -11426,43 +11591,9 @@
                 <w:bCs/>
                 <w:color w:val="auto"/>
                 <w:szCs w:val="20"/>
-              </w:rPr>
-              <w:t xml:space="preserve">D = </w:t>
-            </w:r>
-            <w:r>
-              <w:rPr>
-                <w:rFonts w:ascii="Tahoma" w:hAnsi="Tahoma" w:cs="Tahoma"/>
-                <w:b w:val="0"/>
-                <w:bCs/>
-                <w:i/>
-                <w:color w:val="auto"/>
-                <w:szCs w:val="20"/>
-              </w:rPr>
-              <w:t>Directing-</w:t>
-            </w:r>
-            <w:proofErr w:type="spellStart"/>
-            <w:r>
-              <w:rPr>
-                <w:rFonts w:ascii="Tahoma" w:hAnsi="Tahoma" w:cs="Tahoma"/>
-                <w:b w:val="0"/>
-                <w:bCs/>
-                <w:i/>
-                <w:color w:val="auto"/>
-                <w:szCs w:val="20"/>
-              </w:rPr>
-              <w:t>Controling</w:t>
-            </w:r>
-            <w:proofErr w:type="spellEnd"/>
-            <w:r>
-              <w:rPr>
-                <w:rFonts w:ascii="Tahoma" w:hAnsi="Tahoma" w:cs="Tahoma"/>
-                <w:b w:val="0"/>
-                <w:bCs/>
-                <w:i/>
-                <w:color w:val="auto"/>
-                <w:szCs w:val="20"/>
-              </w:rPr>
-              <w:t>-Planning</w:t>
+                <w:lang w:val="en-ID"/>
+              </w:rPr>
+              <w:t>{#upaya_fisik}</w:t>
             </w:r>
           </w:p>
           <w:p>
@@ -11476,7 +11607,7 @@
                 <w:bCs/>
                 <w:color w:val="auto"/>
                 <w:szCs w:val="20"/>
-                <w:lang w:val="id-ID"/>
+                <w:lang w:val="en-ID"/>
               </w:rPr>
             </w:pPr>
             <w:r>
@@ -11486,9 +11617,83 @@
                 <w:bCs/>
                 <w:color w:val="auto"/>
                 <w:szCs w:val="20"/>
-                <w:lang w:val="id-ID"/>
-              </w:rPr>
-              <w:t>Kemampuan menyesuaikan diri menerima tanggung jawab untuk kegiatan memimpin, mengendalikan, atau merencanakan</w:t>
+                <w:lang w:val="en-ID"/>
+              </w:rPr>
+              <w:t>{</w:t>
+            </w:r>
+            <w:proofErr w:type="spellStart"/>
+            <w:r>
+              <w:rPr>
+                <w:rFonts w:ascii="Tahoma" w:hAnsi="Tahoma" w:cs="Tahoma"/>
+                <w:b w:val="0"/>
+                <w:bCs/>
+                <w:color w:val="auto"/>
+                <w:szCs w:val="20"/>
+                <w:lang w:val="en-ID"/>
+              </w:rPr>
+              <w:t>teks</w:t>
+            </w:r>
+            <w:proofErr w:type="spellEnd"/>
+            <w:r>
+              <w:rPr>
+                <w:rFonts w:ascii="Tahoma" w:hAnsi="Tahoma" w:cs="Tahoma"/>
+                <w:b w:val="0"/>
+                <w:bCs/>
+                <w:color w:val="auto"/>
+                <w:szCs w:val="20"/>
+                <w:lang w:val="en-ID"/>
+              </w:rPr>
+              <w:t>}</w:t>
+            </w:r>
+          </w:p>
+          <w:p>
+            <w:pPr>
+              <w:spacing w:before="60" w:after="60"/>
+              <w:ind w:right="57"/>
+              <w:jc w:val="both"/>
+              <w:rPr>
+                <w:rFonts w:ascii="Tahoma" w:hAnsi="Tahoma" w:cs="Tahoma"/>
+                <w:b w:val="0"/>
+                <w:bCs/>
+                <w:color w:val="auto"/>
+                <w:szCs w:val="20"/>
+                <w:lang w:val="en-ID"/>
+              </w:rPr>
+            </w:pPr>
+            <w:r>
+              <w:rPr>
+                <w:rFonts w:ascii="Tahoma" w:hAnsi="Tahoma" w:cs="Tahoma"/>
+                <w:b w:val="0"/>
+                <w:bCs/>
+                <w:color w:val="auto"/>
+                <w:szCs w:val="20"/>
+                <w:lang w:val="en-ID"/>
+              </w:rPr>
+              <w:t>{/</w:t>
+            </w:r>
+            <w:proofErr w:type="spellStart"/>
+            <w:r>
+              <w:rPr>
+                <w:rFonts w:ascii="Tahoma" w:hAnsi="Tahoma" w:cs="Tahoma"/>
+                <w:b w:val="0"/>
+                <w:bCs/>
+                <w:color w:val="auto"/>
+                <w:szCs w:val="20"/>
+                <w:lang w:val="en-ID"/>
+              </w:rPr>
+              <w:t>upaya_fisik</w:t>
+            </w:r>
+            <w:proofErr w:type="spellEnd"/>
+            <w:r>
+              <w:rPr>
+                <w:rFonts w:ascii="Tahoma" w:hAnsi="Tahoma" w:cs="Tahoma"/>
+                <w:b w:val="0"/>
+                <w:bCs/>
+                <w:color w:val="auto"/>
+                <w:szCs w:val="20"/>
+                <w:lang w:val="en-ID"/>
+              </w:rPr>
+              <w:t>}</w:t>
             </w:r>
           </w:p>
         </w:tc>
@@ -11496,7 +11701,7 @@
       <w:tr>
         <w:tc>
           <w:tcPr>
-            <w:tcW w:w="455" w:type="dxa"/>
+            <w:tcW w:w="426" w:type="dxa"/>
           </w:tcPr>
           <w:p>
             <w:pPr>
@@ -11508,11 +11713,18 @@
                 <w:bCs/>
               </w:rPr>
             </w:pPr>
+            <w:r>
+              <w:rPr>
+                <w:rFonts w:ascii="Tahoma" w:hAnsi="Tahoma" w:cs="Tahoma"/>
+                <w:bCs/>
+              </w:rPr>
+              <w:t>f.</w:t>
+            </w:r>
           </w:p>
         </w:tc>
         <w:tc>
           <w:tcPr>
-            <w:tcW w:w="2090" w:type="dxa"/>
+            <w:tcW w:w="3184" w:type="dxa"/>
           </w:tcPr>
           <w:p>
             <w:pPr>
@@ -11523,6 +11735,31 @@
                 <w:bCs/>
               </w:rPr>
             </w:pPr>
+            <w:proofErr w:type="spellStart"/>
+            <w:r>
+              <w:rPr>
+                <w:rFonts w:ascii="Tahoma" w:hAnsi="Tahoma" w:cs="Tahoma"/>
+                <w:bCs/>
+              </w:rPr>
+              <w:t>Kondisi</w:t>
+            </w:r>
+            <w:proofErr w:type="spellEnd"/>
+            <w:r>
+              <w:rPr>
+                <w:rFonts w:ascii="Tahoma" w:hAnsi="Tahoma" w:cs="Tahoma"/>
+                <w:bCs/>
+              </w:rPr>
+              <w:t xml:space="preserve"> </w:t>
+            </w:r>
+            <w:proofErr w:type="spellStart"/>
+            <w:r>
+              <w:rPr>
+                <w:rFonts w:ascii="Tahoma" w:hAnsi="Tahoma" w:cs="Tahoma"/>
+                <w:bCs/>
+              </w:rPr>
+              <w:t>Fisik</w:t>
+            </w:r>
+            <w:proofErr w:type="spellEnd"/>
           </w:p>
         </w:tc>
         <w:tc>
@@ -11540,14 +11777,23 @@
                 <w:bCs/>
                 <w:color w:val="auto"/>
                 <w:szCs w:val="20"/>
-                <w:lang w:val="id-ID"/>
-              </w:rPr>
-            </w:pPr>
+              </w:rPr>
+            </w:pPr>
+            <w:r>
+              <w:rPr>
+                <w:rFonts w:ascii="Tahoma" w:hAnsi="Tahoma" w:cs="Tahoma"/>
+                <w:b w:val="0"/>
+                <w:bCs/>
+                <w:color w:val="auto"/>
+                <w:szCs w:val="20"/>
+              </w:rPr>
+              <w:t>:</w:t>
+            </w:r>
           </w:p>
         </w:tc>
         <w:tc>
           <w:tcPr>
-            <w:tcW w:w="5955" w:type="dxa"/>
+            <w:tcW w:w="4890" w:type="dxa"/>
           </w:tcPr>
           <w:p>
             <w:pPr>
@@ -11558,68 +11804,18 @@
                 <w:rFonts w:ascii="Tahoma" w:hAnsi="Tahoma" w:cs="Tahoma"/>
                 <w:b w:val="0"/>
                 <w:bCs/>
-                <w:i/>
                 <w:color w:val="auto"/>
                 <w:szCs w:val="20"/>
                 <w:lang w:val="id-ID"/>
               </w:rPr>
             </w:pPr>
-            <w:r>
-              <w:rPr>
-                <w:rFonts w:ascii="Tahoma" w:hAnsi="Tahoma" w:cs="Tahoma"/>
-                <w:b w:val="0"/>
-                <w:bCs/>
-                <w:color w:val="auto"/>
-                <w:szCs w:val="20"/>
-                <w:lang w:val="id-ID"/>
-              </w:rPr>
-              <w:t xml:space="preserve">I = </w:t>
-            </w:r>
-            <w:r>
-              <w:rPr>
-                <w:rFonts w:ascii="Tahoma" w:hAnsi="Tahoma" w:cs="Tahoma"/>
-                <w:b w:val="0"/>
-                <w:bCs/>
-                <w:i/>
-                <w:color w:val="auto"/>
-                <w:szCs w:val="20"/>
-                <w:lang w:val="id-ID"/>
-              </w:rPr>
-              <w:t>Influ / Influencing</w:t>
-            </w:r>
-          </w:p>
-          <w:p>
-            <w:pPr>
-              <w:spacing w:before="60" w:after="60"/>
-              <w:ind w:right="57"/>
-              <w:jc w:val="both"/>
-              <w:rPr>
-                <w:rFonts w:ascii="Tahoma" w:hAnsi="Tahoma" w:cs="Tahoma"/>
-                <w:b w:val="0"/>
-                <w:bCs/>
-                <w:color w:val="auto"/>
-                <w:szCs w:val="20"/>
-                <w:lang w:val="id-ID"/>
-              </w:rPr>
-            </w:pPr>
-            <w:r>
-              <w:rPr>
-                <w:rFonts w:ascii="Tahoma" w:hAnsi="Tahoma" w:cs="Tahoma"/>
-                <w:b w:val="0"/>
-                <w:bCs/>
-                <w:color w:val="auto"/>
-                <w:szCs w:val="20"/>
-                <w:lang w:val="id-ID"/>
-              </w:rPr>
-              <w:t>Kemampuan menyesuaikan diri untuk pekerjaan-pekerjaan mempengaruhi orang lain dalam pendapat, sikap atau pertimbangan mengenai gagasan</w:t>
-            </w:r>
           </w:p>
         </w:tc>
       </w:tr>
       <w:tr>
         <w:tc>
           <w:tcPr>
-            <w:tcW w:w="455" w:type="dxa"/>
+            <w:tcW w:w="426" w:type="dxa"/>
           </w:tcPr>
           <w:p>
             <w:pPr>
@@ -11629,737 +11825,13 @@
               <w:rPr>
                 <w:rFonts w:ascii="Tahoma" w:hAnsi="Tahoma" w:cs="Tahoma"/>
                 <w:bCs/>
-                <w:lang w:val="sv-SE"/>
               </w:rPr>
             </w:pPr>
           </w:p>
         </w:tc>
         <w:tc>
           <w:tcPr>
-            <w:tcW w:w="2090" w:type="dxa"/>
-          </w:tcPr>
-          <w:p>
-            <w:pPr>
-              <w:pStyle w:val="NormalWeb"/>
-              <w:spacing w:beforeLines="0" w:before="60" w:afterLines="0" w:after="60"/>
-              <w:rPr>
-                <w:rFonts w:ascii="Tahoma" w:hAnsi="Tahoma" w:cs="Tahoma"/>
-                <w:bCs/>
-                <w:lang w:val="sv-SE"/>
-              </w:rPr>
-            </w:pPr>
-          </w:p>
-        </w:tc>
-        <w:tc>
-          <w:tcPr>
-            <w:tcW w:w="344" w:type="dxa"/>
-          </w:tcPr>
-          <w:p>
-            <w:pPr>
-              <w:spacing w:before="60" w:after="60"/>
-              <w:ind w:right="57"/>
-              <w:jc w:val="both"/>
-              <w:rPr>
-                <w:rFonts w:ascii="Tahoma" w:hAnsi="Tahoma" w:cs="Tahoma"/>
-                <w:b w:val="0"/>
-                <w:bCs/>
-                <w:color w:val="auto"/>
-                <w:szCs w:val="20"/>
-                <w:lang w:val="id-ID"/>
-              </w:rPr>
-            </w:pPr>
-          </w:p>
-        </w:tc>
-        <w:tc>
-          <w:tcPr>
-            <w:tcW w:w="5955" w:type="dxa"/>
-          </w:tcPr>
-          <w:p>
-            <w:pPr>
-              <w:spacing w:before="60" w:after="60"/>
-              <w:ind w:right="57"/>
-              <w:jc w:val="both"/>
-              <w:rPr>
-                <w:rFonts w:ascii="Tahoma" w:hAnsi="Tahoma" w:cs="Tahoma"/>
-                <w:b w:val="0"/>
-                <w:bCs/>
-                <w:color w:val="auto"/>
-                <w:szCs w:val="20"/>
-                <w:lang w:val="id-ID"/>
-              </w:rPr>
-            </w:pPr>
-            <w:r>
-              <w:rPr>
-                <w:rFonts w:ascii="Tahoma" w:hAnsi="Tahoma" w:cs="Tahoma"/>
-                <w:b w:val="0"/>
-                <w:bCs/>
-                <w:color w:val="auto"/>
-                <w:szCs w:val="20"/>
-                <w:lang w:val="id-ID"/>
-              </w:rPr>
-              <w:t xml:space="preserve">M = </w:t>
-            </w:r>
-            <w:r>
-              <w:rPr>
-                <w:rFonts w:ascii="Tahoma" w:hAnsi="Tahoma" w:cs="Tahoma"/>
-                <w:b w:val="0"/>
-                <w:bCs/>
-                <w:i/>
-                <w:color w:val="auto"/>
-                <w:szCs w:val="20"/>
-                <w:lang w:val="id-ID"/>
-              </w:rPr>
-              <w:t>Measurable and Veri Fiable Criteria</w:t>
-            </w:r>
-          </w:p>
-          <w:p>
-            <w:pPr>
-              <w:spacing w:before="60" w:after="60"/>
-              <w:ind w:right="57"/>
-              <w:jc w:val="both"/>
-              <w:rPr>
-                <w:rFonts w:ascii="Tahoma" w:hAnsi="Tahoma" w:cs="Tahoma"/>
-                <w:b w:val="0"/>
-                <w:bCs/>
-                <w:color w:val="auto"/>
-                <w:szCs w:val="20"/>
-                <w:lang w:val="id-ID"/>
-              </w:rPr>
-            </w:pPr>
-            <w:r>
-              <w:rPr>
-                <w:rFonts w:ascii="Tahoma" w:hAnsi="Tahoma" w:cs="Tahoma"/>
-                <w:b w:val="0"/>
-                <w:bCs/>
-                <w:color w:val="auto"/>
-                <w:szCs w:val="20"/>
-                <w:lang w:val="id-ID"/>
-              </w:rPr>
-              <w:t>Kemampuan menyesuaikan diri dengan kegiatan pengambilan kesimpulan, pembuatan pertimbangan, atau pembuatan peraturan/keputusan berdasarkan kriteria yang diukur atau yang dapat diuji</w:t>
-            </w:r>
-          </w:p>
-        </w:tc>
-      </w:tr>
-      <w:tr>
-        <w:tc>
-          <w:tcPr>
-            <w:tcW w:w="455" w:type="dxa"/>
-          </w:tcPr>
-          <w:p>
-            <w:pPr>
-              <w:pStyle w:val="NormalWeb"/>
-              <w:spacing w:beforeLines="0" w:before="60" w:afterLines="0" w:after="60"/>
-              <w:jc w:val="center"/>
-              <w:rPr>
-                <w:rFonts w:ascii="Tahoma" w:hAnsi="Tahoma" w:cs="Tahoma"/>
-                <w:bCs/>
-                <w:lang w:val="sv-SE"/>
-              </w:rPr>
-            </w:pPr>
-          </w:p>
-        </w:tc>
-        <w:tc>
-          <w:tcPr>
-            <w:tcW w:w="2090" w:type="dxa"/>
-          </w:tcPr>
-          <w:p>
-            <w:pPr>
-              <w:pStyle w:val="NormalWeb"/>
-              <w:spacing w:beforeLines="0" w:before="60" w:afterLines="0" w:after="60"/>
-              <w:rPr>
-                <w:rFonts w:ascii="Tahoma" w:hAnsi="Tahoma" w:cs="Tahoma"/>
-                <w:bCs/>
-                <w:lang w:val="sv-SE"/>
-              </w:rPr>
-            </w:pPr>
-          </w:p>
-        </w:tc>
-        <w:tc>
-          <w:tcPr>
-            <w:tcW w:w="344" w:type="dxa"/>
-          </w:tcPr>
-          <w:p>
-            <w:pPr>
-              <w:spacing w:before="60" w:after="60"/>
-              <w:ind w:right="57"/>
-              <w:jc w:val="both"/>
-              <w:rPr>
-                <w:rFonts w:ascii="Tahoma" w:hAnsi="Tahoma" w:cs="Tahoma"/>
-                <w:b w:val="0"/>
-                <w:bCs/>
-                <w:color w:val="auto"/>
-                <w:szCs w:val="20"/>
-                <w:lang w:val="sv-SE"/>
-              </w:rPr>
-            </w:pPr>
-          </w:p>
-        </w:tc>
-        <w:tc>
-          <w:tcPr>
-            <w:tcW w:w="5955" w:type="dxa"/>
-          </w:tcPr>
-          <w:p>
-            <w:pPr>
-              <w:spacing w:before="60" w:after="60"/>
-              <w:ind w:right="57"/>
-              <w:jc w:val="both"/>
-              <w:rPr>
-                <w:rFonts w:ascii="Tahoma" w:hAnsi="Tahoma" w:cs="Tahoma"/>
-                <w:b w:val="0"/>
-                <w:bCs/>
-                <w:color w:val="auto"/>
-                <w:szCs w:val="20"/>
-                <w:lang w:val="sv-SE"/>
-              </w:rPr>
-            </w:pPr>
-            <w:r>
-              <w:rPr>
-                <w:rFonts w:ascii="Tahoma" w:hAnsi="Tahoma" w:cs="Tahoma"/>
-                <w:b w:val="0"/>
-                <w:bCs/>
-                <w:color w:val="auto"/>
-                <w:szCs w:val="20"/>
-                <w:lang w:val="sv-SE"/>
-              </w:rPr>
-              <w:t xml:space="preserve">P  =  </w:t>
-            </w:r>
-            <w:r>
-              <w:rPr>
-                <w:rFonts w:ascii="Tahoma" w:hAnsi="Tahoma" w:cs="Tahoma"/>
-                <w:b w:val="0"/>
-                <w:bCs/>
-                <w:i/>
-                <w:color w:val="auto"/>
-                <w:szCs w:val="20"/>
-                <w:lang w:val="sv-SE"/>
-              </w:rPr>
-              <w:t>Dealing with People</w:t>
-            </w:r>
-          </w:p>
-          <w:p>
-            <w:pPr>
-              <w:spacing w:before="60" w:after="60"/>
-              <w:ind w:right="57"/>
-              <w:jc w:val="both"/>
-              <w:rPr>
-                <w:rFonts w:ascii="Tahoma" w:hAnsi="Tahoma" w:cs="Tahoma"/>
-                <w:b w:val="0"/>
-                <w:bCs/>
-                <w:color w:val="auto"/>
-                <w:szCs w:val="20"/>
-                <w:lang w:val="id-ID"/>
-              </w:rPr>
-            </w:pPr>
-            <w:r>
-              <w:rPr>
-                <w:rFonts w:ascii="Tahoma" w:hAnsi="Tahoma" w:cs="Tahoma"/>
-                <w:b w:val="0"/>
-                <w:bCs/>
-                <w:color w:val="auto"/>
-                <w:szCs w:val="20"/>
-                <w:lang w:val="id-ID"/>
-              </w:rPr>
-              <w:t>Kemampuan menyesuaikan diri dalam berhubungan dengan orang lain lebih dari hanya penerimaan dan pembuatan instruksi</w:t>
-            </w:r>
-          </w:p>
-        </w:tc>
-      </w:tr>
-      <w:tr>
-        <w:tc>
-          <w:tcPr>
-            <w:tcW w:w="455" w:type="dxa"/>
-          </w:tcPr>
-          <w:p>
-            <w:pPr>
-              <w:pStyle w:val="NormalWeb"/>
-              <w:spacing w:beforeLines="0" w:before="60" w:afterLines="0" w:after="60"/>
-              <w:jc w:val="center"/>
-              <w:rPr>
-                <w:rFonts w:ascii="Tahoma" w:hAnsi="Tahoma" w:cs="Tahoma"/>
-                <w:bCs/>
-              </w:rPr>
-            </w:pPr>
-            <w:r>
-              <w:rPr>
-                <w:rFonts w:ascii="Tahoma" w:hAnsi="Tahoma" w:cs="Tahoma"/>
-                <w:bCs/>
-              </w:rPr>
-              <w:t>d.</w:t>
-            </w:r>
-          </w:p>
-        </w:tc>
-        <w:tc>
-          <w:tcPr>
-            <w:tcW w:w="2090" w:type="dxa"/>
-          </w:tcPr>
-          <w:p>
-            <w:pPr>
-              <w:pStyle w:val="NormalWeb"/>
-              <w:spacing w:beforeLines="0" w:before="60" w:afterLines="0" w:after="60"/>
-              <w:rPr>
-                <w:rFonts w:ascii="Tahoma" w:hAnsi="Tahoma" w:cs="Tahoma"/>
-                <w:bCs/>
-              </w:rPr>
-            </w:pPr>
-            <w:r>
-              <w:rPr>
-                <w:rFonts w:ascii="Tahoma" w:hAnsi="Tahoma" w:cs="Tahoma"/>
-                <w:bCs/>
-              </w:rPr>
-              <w:t xml:space="preserve">Minat </w:t>
-            </w:r>
-            <w:proofErr w:type="spellStart"/>
-            <w:r>
-              <w:rPr>
-                <w:rFonts w:ascii="Tahoma" w:hAnsi="Tahoma" w:cs="Tahoma"/>
-                <w:bCs/>
-              </w:rPr>
-              <w:t>Kerja</w:t>
-            </w:r>
-            <w:proofErr w:type="spellEnd"/>
-            <w:r>
-              <w:rPr>
-                <w:rFonts w:ascii="Tahoma" w:hAnsi="Tahoma" w:cs="Tahoma"/>
-                <w:bCs/>
-              </w:rPr>
-              <w:t xml:space="preserve"> </w:t>
-            </w:r>
-          </w:p>
-        </w:tc>
-        <w:tc>
-          <w:tcPr>
-            <w:tcW w:w="344" w:type="dxa"/>
-          </w:tcPr>
-          <w:p>
-            <w:pPr>
-              <w:spacing w:before="60" w:after="60"/>
-              <w:ind w:right="57"/>
-              <w:jc w:val="both"/>
-              <w:rPr>
-                <w:rFonts w:ascii="Tahoma" w:hAnsi="Tahoma" w:cs="Tahoma"/>
-                <w:b w:val="0"/>
-                <w:bCs/>
-                <w:color w:val="auto"/>
-                <w:szCs w:val="20"/>
-              </w:rPr>
-            </w:pPr>
-            <w:r>
-              <w:rPr>
-                <w:rFonts w:ascii="Tahoma" w:hAnsi="Tahoma" w:cs="Tahoma"/>
-                <w:b w:val="0"/>
-                <w:bCs/>
-                <w:color w:val="auto"/>
-                <w:szCs w:val="20"/>
-              </w:rPr>
-              <w:t>:</w:t>
-            </w:r>
-          </w:p>
-        </w:tc>
-        <w:tc>
-          <w:tcPr>
-            <w:tcW w:w="5955" w:type="dxa"/>
-          </w:tcPr>
-          <w:p>
-            <w:pPr>
-              <w:spacing w:before="60" w:after="60"/>
-              <w:ind w:right="57"/>
-              <w:jc w:val="both"/>
-              <w:rPr>
-                <w:rFonts w:ascii="Tahoma" w:hAnsi="Tahoma" w:cs="Tahoma"/>
-                <w:b w:val="0"/>
-                <w:bCs/>
-                <w:color w:val="auto"/>
-                <w:szCs w:val="20"/>
-                <w:lang w:val="id-ID"/>
-              </w:rPr>
-            </w:pPr>
-            <w:r>
-              <w:rPr>
-                <w:rFonts w:ascii="Tahoma" w:hAnsi="Tahoma" w:cs="Tahoma"/>
-                <w:b w:val="0"/>
-                <w:bCs/>
-                <w:color w:val="auto"/>
-                <w:szCs w:val="20"/>
-              </w:rPr>
-              <w:t xml:space="preserve">I = </w:t>
-            </w:r>
-            <w:r>
-              <w:rPr>
-                <w:rFonts w:ascii="Tahoma" w:hAnsi="Tahoma" w:cs="Tahoma"/>
-                <w:b w:val="0"/>
-                <w:bCs/>
-                <w:i/>
-                <w:color w:val="auto"/>
-                <w:szCs w:val="20"/>
-                <w:lang w:val="id-ID"/>
-              </w:rPr>
-              <w:t>Investigatif</w:t>
-            </w:r>
-          </w:p>
-        </w:tc>
-      </w:tr>
-      <w:tr>
-        <w:tc>
-          <w:tcPr>
-            <w:tcW w:w="455" w:type="dxa"/>
-          </w:tcPr>
-          <w:p>
-            <w:pPr>
-              <w:pStyle w:val="NormalWeb"/>
-              <w:spacing w:beforeLines="0" w:before="60" w:afterLines="0" w:after="60"/>
-              <w:jc w:val="center"/>
-              <w:rPr>
-                <w:rFonts w:ascii="Tahoma" w:hAnsi="Tahoma" w:cs="Tahoma"/>
-                <w:bCs/>
-              </w:rPr>
-            </w:pPr>
-          </w:p>
-        </w:tc>
-        <w:tc>
-          <w:tcPr>
-            <w:tcW w:w="2090" w:type="dxa"/>
-          </w:tcPr>
-          <w:p>
-            <w:pPr>
-              <w:pStyle w:val="NormalWeb"/>
-              <w:spacing w:beforeLines="0" w:before="60" w:afterLines="0" w:after="60"/>
-              <w:rPr>
-                <w:rFonts w:ascii="Tahoma" w:hAnsi="Tahoma" w:cs="Tahoma"/>
-                <w:bCs/>
-              </w:rPr>
-            </w:pPr>
-          </w:p>
-        </w:tc>
-        <w:tc>
-          <w:tcPr>
-            <w:tcW w:w="344" w:type="dxa"/>
-          </w:tcPr>
-          <w:p>
-            <w:pPr>
-              <w:spacing w:before="60" w:after="60"/>
-              <w:ind w:right="57"/>
-              <w:jc w:val="both"/>
-              <w:rPr>
-                <w:rFonts w:ascii="Tahoma" w:hAnsi="Tahoma" w:cs="Tahoma"/>
-                <w:b w:val="0"/>
-                <w:bCs/>
-                <w:color w:val="auto"/>
-                <w:szCs w:val="20"/>
-              </w:rPr>
-            </w:pPr>
-          </w:p>
-        </w:tc>
-        <w:tc>
-          <w:tcPr>
-            <w:tcW w:w="5955" w:type="dxa"/>
-          </w:tcPr>
-          <w:p>
-            <w:pPr>
-              <w:spacing w:before="60" w:after="60"/>
-              <w:ind w:right="57"/>
-              <w:jc w:val="both"/>
-              <w:rPr>
-                <w:rFonts w:ascii="Tahoma" w:hAnsi="Tahoma" w:cs="Tahoma"/>
-                <w:b w:val="0"/>
-                <w:bCs/>
-                <w:color w:val="auto"/>
-                <w:szCs w:val="20"/>
-              </w:rPr>
-            </w:pPr>
-            <w:r>
-              <w:rPr>
-                <w:rFonts w:ascii="Tahoma" w:hAnsi="Tahoma" w:cs="Tahoma"/>
-                <w:b w:val="0"/>
-                <w:bCs/>
-                <w:color w:val="auto"/>
-                <w:szCs w:val="20"/>
-              </w:rPr>
-              <w:t xml:space="preserve">C = </w:t>
-            </w:r>
-            <w:proofErr w:type="spellStart"/>
-            <w:r>
-              <w:rPr>
-                <w:rFonts w:ascii="Tahoma" w:hAnsi="Tahoma" w:cs="Tahoma"/>
-                <w:b w:val="0"/>
-                <w:bCs/>
-                <w:i/>
-                <w:color w:val="auto"/>
-                <w:szCs w:val="20"/>
-              </w:rPr>
-              <w:t>Konvensional</w:t>
-            </w:r>
-            <w:proofErr w:type="spellEnd"/>
-          </w:p>
-        </w:tc>
-      </w:tr>
-      <w:tr>
-        <w:tc>
-          <w:tcPr>
-            <w:tcW w:w="455" w:type="dxa"/>
-          </w:tcPr>
-          <w:p>
-            <w:pPr>
-              <w:pStyle w:val="NormalWeb"/>
-              <w:spacing w:beforeLines="0" w:before="60" w:afterLines="0" w:after="60"/>
-              <w:jc w:val="center"/>
-              <w:rPr>
-                <w:rFonts w:ascii="Tahoma" w:hAnsi="Tahoma" w:cs="Tahoma"/>
-                <w:bCs/>
-              </w:rPr>
-            </w:pPr>
-            <w:r>
-              <w:rPr>
-                <w:rFonts w:ascii="Tahoma" w:hAnsi="Tahoma" w:cs="Tahoma"/>
-                <w:bCs/>
-              </w:rPr>
-              <w:t>e.</w:t>
-            </w:r>
-          </w:p>
-        </w:tc>
-        <w:tc>
-          <w:tcPr>
-            <w:tcW w:w="2090" w:type="dxa"/>
-          </w:tcPr>
-          <w:p>
-            <w:pPr>
-              <w:pStyle w:val="NormalWeb"/>
-              <w:spacing w:beforeLines="0" w:before="60" w:afterLines="0" w:after="60"/>
-              <w:rPr>
-                <w:rFonts w:ascii="Tahoma" w:hAnsi="Tahoma" w:cs="Tahoma"/>
-                <w:bCs/>
-              </w:rPr>
-            </w:pPr>
-            <w:r>
-              <w:rPr>
-                <w:rFonts w:ascii="Tahoma" w:hAnsi="Tahoma" w:cs="Tahoma"/>
-                <w:bCs/>
-              </w:rPr>
-              <w:t xml:space="preserve">Upaya </w:t>
-            </w:r>
-            <w:proofErr w:type="spellStart"/>
-            <w:r>
-              <w:rPr>
-                <w:rFonts w:ascii="Tahoma" w:hAnsi="Tahoma" w:cs="Tahoma"/>
-                <w:bCs/>
-              </w:rPr>
-              <w:t>Fisik</w:t>
-            </w:r>
-            <w:proofErr w:type="spellEnd"/>
-            <w:r>
-              <w:rPr>
-                <w:rFonts w:ascii="Tahoma" w:hAnsi="Tahoma" w:cs="Tahoma"/>
-                <w:bCs/>
-              </w:rPr>
-              <w:t xml:space="preserve"> </w:t>
-            </w:r>
-          </w:p>
-        </w:tc>
-        <w:tc>
-          <w:tcPr>
-            <w:tcW w:w="344" w:type="dxa"/>
-          </w:tcPr>
-          <w:p>
-            <w:pPr>
-              <w:spacing w:before="60" w:after="60"/>
-              <w:ind w:right="57"/>
-              <w:jc w:val="both"/>
-              <w:rPr>
-                <w:rFonts w:ascii="Tahoma" w:hAnsi="Tahoma" w:cs="Tahoma"/>
-                <w:b w:val="0"/>
-                <w:bCs/>
-                <w:color w:val="auto"/>
-                <w:szCs w:val="20"/>
-              </w:rPr>
-            </w:pPr>
-            <w:r>
-              <w:rPr>
-                <w:rFonts w:ascii="Tahoma" w:hAnsi="Tahoma" w:cs="Tahoma"/>
-                <w:b w:val="0"/>
-                <w:bCs/>
-                <w:color w:val="auto"/>
-                <w:szCs w:val="20"/>
-              </w:rPr>
-              <w:t>:</w:t>
-            </w:r>
-          </w:p>
-        </w:tc>
-        <w:tc>
-          <w:tcPr>
-            <w:tcW w:w="5955" w:type="dxa"/>
-          </w:tcPr>
-          <w:p>
-            <w:pPr>
-              <w:spacing w:before="60" w:after="60"/>
-              <w:ind w:right="57"/>
-              <w:jc w:val="both"/>
-              <w:rPr>
-                <w:rFonts w:ascii="Tahoma" w:hAnsi="Tahoma" w:cs="Tahoma"/>
-                <w:b w:val="0"/>
-                <w:bCs/>
-                <w:color w:val="auto"/>
-                <w:szCs w:val="20"/>
-                <w:lang w:val="sv-SE"/>
-              </w:rPr>
-            </w:pPr>
-            <w:r>
-              <w:rPr>
-                <w:rFonts w:ascii="Tahoma" w:hAnsi="Tahoma" w:cs="Tahoma"/>
-                <w:b w:val="0"/>
-                <w:bCs/>
-                <w:color w:val="auto"/>
-                <w:szCs w:val="20"/>
-                <w:lang w:val="id-ID"/>
-              </w:rPr>
-              <w:t xml:space="preserve">Duduk, Berdiri, Berjalan, </w:t>
-            </w:r>
-            <w:r>
-              <w:rPr>
-                <w:rFonts w:ascii="Tahoma" w:hAnsi="Tahoma" w:cs="Tahoma"/>
-                <w:b w:val="0"/>
-                <w:bCs/>
-                <w:color w:val="auto"/>
-                <w:szCs w:val="20"/>
-                <w:lang w:val="sv-SE"/>
-              </w:rPr>
-              <w:t>Berbicara, Mendengar</w:t>
-            </w:r>
-          </w:p>
-        </w:tc>
-      </w:tr>
-      <w:tr>
-        <w:tc>
-          <w:tcPr>
-            <w:tcW w:w="455" w:type="dxa"/>
-          </w:tcPr>
-          <w:p>
-            <w:pPr>
-              <w:pStyle w:val="NormalWeb"/>
-              <w:spacing w:beforeLines="0" w:before="60" w:afterLines="0" w:after="60"/>
-              <w:jc w:val="center"/>
-              <w:rPr>
-                <w:rFonts w:ascii="Tahoma" w:hAnsi="Tahoma" w:cs="Tahoma"/>
-                <w:bCs/>
-              </w:rPr>
-            </w:pPr>
-            <w:r>
-              <w:rPr>
-                <w:rFonts w:ascii="Tahoma" w:hAnsi="Tahoma" w:cs="Tahoma"/>
-                <w:bCs/>
-              </w:rPr>
-              <w:t>f.</w:t>
-            </w:r>
-          </w:p>
-        </w:tc>
-        <w:tc>
-          <w:tcPr>
-            <w:tcW w:w="2090" w:type="dxa"/>
-          </w:tcPr>
-          <w:p>
-            <w:pPr>
-              <w:pStyle w:val="NormalWeb"/>
-              <w:spacing w:beforeLines="0" w:before="60" w:afterLines="0" w:after="60"/>
-              <w:rPr>
-                <w:rFonts w:ascii="Tahoma" w:hAnsi="Tahoma" w:cs="Tahoma"/>
-                <w:bCs/>
-              </w:rPr>
-            </w:pPr>
-            <w:proofErr w:type="spellStart"/>
-            <w:r>
-              <w:rPr>
-                <w:rFonts w:ascii="Tahoma" w:hAnsi="Tahoma" w:cs="Tahoma"/>
-                <w:bCs/>
-              </w:rPr>
-              <w:t>Kondisi</w:t>
-            </w:r>
-            <w:proofErr w:type="spellEnd"/>
-            <w:r>
-              <w:rPr>
-                <w:rFonts w:ascii="Tahoma" w:hAnsi="Tahoma" w:cs="Tahoma"/>
-                <w:bCs/>
-              </w:rPr>
-              <w:t xml:space="preserve"> </w:t>
-            </w:r>
-            <w:proofErr w:type="spellStart"/>
-            <w:r>
-              <w:rPr>
-                <w:rFonts w:ascii="Tahoma" w:hAnsi="Tahoma" w:cs="Tahoma"/>
-                <w:bCs/>
-              </w:rPr>
-              <w:t>Fisik</w:t>
-            </w:r>
-            <w:proofErr w:type="spellEnd"/>
-          </w:p>
-        </w:tc>
-        <w:tc>
-          <w:tcPr>
-            <w:tcW w:w="344" w:type="dxa"/>
-          </w:tcPr>
-          <w:p>
-            <w:pPr>
-              <w:spacing w:before="60" w:after="60"/>
-              <w:ind w:right="57"/>
-              <w:jc w:val="both"/>
-              <w:rPr>
-                <w:rFonts w:ascii="Tahoma" w:hAnsi="Tahoma" w:cs="Tahoma"/>
-                <w:b w:val="0"/>
-                <w:bCs/>
-                <w:color w:val="auto"/>
-                <w:szCs w:val="20"/>
-              </w:rPr>
-            </w:pPr>
-            <w:r>
-              <w:rPr>
-                <w:rFonts w:ascii="Tahoma" w:hAnsi="Tahoma" w:cs="Tahoma"/>
-                <w:b w:val="0"/>
-                <w:bCs/>
-                <w:color w:val="auto"/>
-                <w:szCs w:val="20"/>
-              </w:rPr>
-              <w:t>:</w:t>
-            </w:r>
-          </w:p>
-        </w:tc>
-        <w:tc>
-          <w:tcPr>
-            <w:tcW w:w="5955" w:type="dxa"/>
-          </w:tcPr>
-          <w:p>
-            <w:pPr>
-              <w:spacing w:before="60" w:after="60"/>
-              <w:ind w:right="57"/>
-              <w:jc w:val="both"/>
-              <w:rPr>
-                <w:rFonts w:ascii="Tahoma" w:hAnsi="Tahoma" w:cs="Tahoma"/>
-                <w:b w:val="0"/>
-                <w:bCs/>
-                <w:color w:val="auto"/>
-                <w:szCs w:val="20"/>
-                <w:lang w:val="id-ID"/>
-              </w:rPr>
-            </w:pPr>
-          </w:p>
-        </w:tc>
-      </w:tr>
-      <w:tr>
-        <w:tc>
-          <w:tcPr>
-            <w:tcW w:w="455" w:type="dxa"/>
-          </w:tcPr>
-          <w:p>
-            <w:pPr>
-              <w:pStyle w:val="NormalWeb"/>
-              <w:spacing w:beforeLines="0" w:before="60" w:afterLines="0" w:after="60"/>
-              <w:jc w:val="center"/>
-              <w:rPr>
-                <w:rFonts w:ascii="Tahoma" w:hAnsi="Tahoma" w:cs="Tahoma"/>
-                <w:bCs/>
-              </w:rPr>
-            </w:pPr>
-          </w:p>
-        </w:tc>
-        <w:tc>
-          <w:tcPr>
-            <w:tcW w:w="2090" w:type="dxa"/>
+            <w:tcW w:w="3184" w:type="dxa"/>
           </w:tcPr>
           <w:p>
             <w:pPr>
@@ -12415,7 +11887,7 @@
         </w:tc>
         <w:tc>
           <w:tcPr>
-            <w:tcW w:w="5955" w:type="dxa"/>
+            <w:tcW w:w="4890" w:type="dxa"/>
           </w:tcPr>
           <w:p>
             <w:pPr>
@@ -12435,10 +11907,35 @@
                 <w:rFonts w:ascii="Tahoma" w:hAnsi="Tahoma" w:cs="Tahoma"/>
                 <w:b w:val="0"/>
                 <w:bCs/>
-                <w:color w:val="auto"/>
-                <w:szCs w:val="20"/>
-              </w:rPr>
-              <w:t>Pria/ Wanita</w:t>
+                <w:sz w:val="22"/>
+                <w:szCs w:val="22"/>
+                <w:lang w:val="en-ID"/>
+              </w:rPr>
+              <w:t>{</w:t>
+            </w:r>
+            <w:proofErr w:type="spellStart"/>
+            <w:r>
+              <w:rPr>
+                <w:rFonts w:ascii="Tahoma" w:hAnsi="Tahoma" w:cs="Tahoma"/>
+                <w:b w:val="0"/>
+                <w:bCs/>
+                <w:sz w:val="22"/>
+                <w:szCs w:val="22"/>
+                <w:lang w:val="en-ID"/>
+              </w:rPr>
+              <w:t>kondisi_fisik_jenkel</w:t>
+            </w:r>
+            <w:proofErr w:type="spellEnd"/>
+            <w:r>
+              <w:rPr>
+                <w:rFonts w:ascii="Tahoma" w:hAnsi="Tahoma" w:cs="Tahoma"/>
+                <w:b w:val="0"/>
+                <w:bCs/>
+                <w:sz w:val="22"/>
+                <w:szCs w:val="22"/>
+                <w:lang w:val="en-ID"/>
+              </w:rPr>
+              <w:t>}</w:t>
             </w:r>
           </w:p>
         </w:tc>
@@ -12446,7 +11943,7 @@
       <w:tr>
         <w:tc>
           <w:tcPr>
-            <w:tcW w:w="455" w:type="dxa"/>
+            <w:tcW w:w="426" w:type="dxa"/>
           </w:tcPr>
           <w:p>
             <w:pPr>
@@ -12462,7 +11959,7 @@
         </w:tc>
         <w:tc>
           <w:tcPr>
-            <w:tcW w:w="2090" w:type="dxa"/>
+            <w:tcW w:w="3184" w:type="dxa"/>
           </w:tcPr>
           <w:p>
             <w:pPr>
@@ -12527,7 +12024,7 @@
         </w:tc>
         <w:tc>
           <w:tcPr>
-            <w:tcW w:w="5955" w:type="dxa"/>
+            <w:tcW w:w="4890" w:type="dxa"/>
           </w:tcPr>
           <w:p>
             <w:pPr>
@@ -12543,25 +12040,48 @@
                 <w:lang w:val="id-ID"/>
               </w:rPr>
             </w:pPr>
+            <w:r>
+              <w:rPr>
+                <w:rFonts w:ascii="Tahoma" w:hAnsi="Tahoma" w:cs="Tahoma"/>
+                <w:b w:val="0"/>
+                <w:bCs/>
+                <w:sz w:val="22"/>
+                <w:szCs w:val="22"/>
+                <w:lang w:val="en-ID"/>
+              </w:rPr>
+              <w:t>{</w:t>
+            </w:r>
             <w:proofErr w:type="spellStart"/>
             <w:r>
               <w:rPr>
                 <w:rFonts w:ascii="Tahoma" w:hAnsi="Tahoma" w:cs="Tahoma"/>
                 <w:b w:val="0"/>
-                <w:color w:val="auto"/>
-                <w:sz w:val="22"/>
-                <w:szCs w:val="22"/>
-              </w:rPr>
-              <w:t>Disesuaikan</w:t>
+                <w:bCs/>
+                <w:sz w:val="22"/>
+                <w:szCs w:val="22"/>
+                <w:lang w:val="en-ID"/>
+              </w:rPr>
+              <w:t>kondisi_fisik_umur</w:t>
             </w:r>
             <w:proofErr w:type="spellEnd"/>
+            <w:r>
+              <w:rPr>
+                <w:rFonts w:ascii="Tahoma" w:hAnsi="Tahoma" w:cs="Tahoma"/>
+                <w:b w:val="0"/>
+                <w:bCs/>
+                <w:sz w:val="22"/>
+                <w:szCs w:val="22"/>
+                <w:lang w:val="en-ID"/>
+              </w:rPr>
+              <w:t>}</w:t>
+            </w:r>
           </w:p>
         </w:tc>
       </w:tr>
       <w:tr>
         <w:tc>
           <w:tcPr>
-            <w:tcW w:w="455" w:type="dxa"/>
+            <w:tcW w:w="426" w:type="dxa"/>
           </w:tcPr>
           <w:p>
             <w:pPr>
@@ -12577,7 +12097,7 @@
         </w:tc>
         <w:tc>
           <w:tcPr>
-            <w:tcW w:w="2090" w:type="dxa"/>
+            <w:tcW w:w="3184" w:type="dxa"/>
           </w:tcPr>
           <w:p>
             <w:pPr>
@@ -12633,7 +12153,7 @@
         </w:tc>
         <w:tc>
           <w:tcPr>
-            <w:tcW w:w="5955" w:type="dxa"/>
+            <w:tcW w:w="4890" w:type="dxa"/>
           </w:tcPr>
           <w:p>
             <w:pPr>
@@ -12649,25 +12169,59 @@
                 <w:lang w:val="id-ID"/>
               </w:rPr>
             </w:pPr>
+            <w:r>
+              <w:rPr>
+                <w:rFonts w:ascii="Tahoma" w:hAnsi="Tahoma" w:cs="Tahoma"/>
+                <w:b w:val="0"/>
+                <w:bCs/>
+                <w:sz w:val="22"/>
+                <w:szCs w:val="22"/>
+                <w:lang w:val="en-ID"/>
+              </w:rPr>
+              <w:t>{</w:t>
+            </w:r>
             <w:proofErr w:type="spellStart"/>
             <w:r>
               <w:rPr>
                 <w:rFonts w:ascii="Tahoma" w:hAnsi="Tahoma" w:cs="Tahoma"/>
                 <w:b w:val="0"/>
-                <w:color w:val="auto"/>
-                <w:sz w:val="22"/>
-                <w:szCs w:val="22"/>
-              </w:rPr>
-              <w:t>Disesuaikan</w:t>
+                <w:bCs/>
+                <w:sz w:val="22"/>
+                <w:szCs w:val="22"/>
+                <w:lang w:val="en-ID"/>
+              </w:rPr>
+              <w:t>kondisi_fisik_</w:t>
+            </w:r>
+            <w:r>
+              <w:rPr>
+                <w:rFonts w:ascii="Tahoma" w:hAnsi="Tahoma" w:cs="Tahoma"/>
+                <w:b w:val="0"/>
+                <w:bCs/>
+                <w:sz w:val="22"/>
+                <w:szCs w:val="22"/>
+                <w:lang w:val="en-ID"/>
+              </w:rPr>
+              <w:t>tb</w:t>
             </w:r>
             <w:proofErr w:type="spellEnd"/>
+            <w:r>
+              <w:rPr>
+                <w:rFonts w:ascii="Tahoma" w:hAnsi="Tahoma" w:cs="Tahoma"/>
+                <w:b w:val="0"/>
+                <w:bCs/>
+                <w:sz w:val="22"/>
+                <w:szCs w:val="22"/>
+                <w:lang w:val="en-ID"/>
+              </w:rPr>
+              <w:t>}</w:t>
+            </w:r>
           </w:p>
         </w:tc>
       </w:tr>
       <w:tr>
         <w:tc>
           <w:tcPr>
-            <w:tcW w:w="455" w:type="dxa"/>
+            <w:tcW w:w="426" w:type="dxa"/>
           </w:tcPr>
           <w:p>
             <w:pPr>
@@ -12683,7 +12237,7 @@
         </w:tc>
         <w:tc>
           <w:tcPr>
-            <w:tcW w:w="2090" w:type="dxa"/>
+            <w:tcW w:w="3184" w:type="dxa"/>
           </w:tcPr>
           <w:p>
             <w:pPr>
@@ -12739,7 +12293,7 @@
         </w:tc>
         <w:tc>
           <w:tcPr>
-            <w:tcW w:w="5955" w:type="dxa"/>
+            <w:tcW w:w="4890" w:type="dxa"/>
           </w:tcPr>
           <w:p>
             <w:pPr>
@@ -12755,25 +12309,70 @@
                 <w:lang w:val="id-ID"/>
               </w:rPr>
             </w:pPr>
+            <w:r>
+              <w:rPr>
+                <w:rFonts w:ascii="Tahoma" w:hAnsi="Tahoma" w:cs="Tahoma"/>
+                <w:b w:val="0"/>
+                <w:bCs/>
+                <w:sz w:val="22"/>
+                <w:szCs w:val="22"/>
+                <w:lang w:val="en-ID"/>
+              </w:rPr>
+              <w:t>{</w:t>
+            </w:r>
             <w:proofErr w:type="spellStart"/>
             <w:r>
               <w:rPr>
                 <w:rFonts w:ascii="Tahoma" w:hAnsi="Tahoma" w:cs="Tahoma"/>
                 <w:b w:val="0"/>
-                <w:color w:val="auto"/>
-                <w:sz w:val="22"/>
-                <w:szCs w:val="22"/>
-              </w:rPr>
-              <w:t>Disesuaikan</w:t>
+                <w:bCs/>
+                <w:sz w:val="22"/>
+                <w:szCs w:val="22"/>
+                <w:lang w:val="en-ID"/>
+              </w:rPr>
+              <w:t>kondisi_fisik_</w:t>
+            </w:r>
+            <w:r>
+              <w:rPr>
+                <w:rFonts w:ascii="Tahoma" w:hAnsi="Tahoma" w:cs="Tahoma"/>
+                <w:b w:val="0"/>
+                <w:bCs/>
+                <w:sz w:val="22"/>
+                <w:szCs w:val="22"/>
+                <w:lang w:val="en-ID"/>
+              </w:rPr>
+              <w:t>b</w:t>
+            </w:r>
+            <w:r>
+              <w:rPr>
+                <w:rFonts w:ascii="Tahoma" w:hAnsi="Tahoma" w:cs="Tahoma"/>
+                <w:b w:val="0"/>
+                <w:bCs/>
+                <w:sz w:val="22"/>
+                <w:szCs w:val="22"/>
+                <w:lang w:val="en-ID"/>
+              </w:rPr>
+              <w:t>b</w:t>
             </w:r>
             <w:proofErr w:type="spellEnd"/>
+            <w:r>
+              <w:rPr>
+                <w:rFonts w:ascii="Tahoma" w:hAnsi="Tahoma" w:cs="Tahoma"/>
+                <w:b w:val="0"/>
+                <w:bCs/>
+                <w:sz w:val="22"/>
+                <w:szCs w:val="22"/>
+                <w:lang w:val="en-ID"/>
+              </w:rPr>
+              <w:t>}</w:t>
+            </w:r>
           </w:p>
         </w:tc>
       </w:tr>
       <w:tr>
         <w:tc>
           <w:tcPr>
-            <w:tcW w:w="455" w:type="dxa"/>
+            <w:tcW w:w="426" w:type="dxa"/>
           </w:tcPr>
           <w:p>
             <w:pPr>
@@ -12789,7 +12388,7 @@
         </w:tc>
         <w:tc>
           <w:tcPr>
-            <w:tcW w:w="2090" w:type="dxa"/>
+            <w:tcW w:w="3184" w:type="dxa"/>
           </w:tcPr>
           <w:p>
             <w:pPr>
@@ -12854,7 +12453,7 @@
         </w:tc>
         <w:tc>
           <w:tcPr>
-            <w:tcW w:w="5955" w:type="dxa"/>
+            <w:tcW w:w="4890" w:type="dxa"/>
           </w:tcPr>
           <w:p>
             <w:pPr>
@@ -12870,25 +12469,70 @@
                 <w:lang w:val="id-ID"/>
               </w:rPr>
             </w:pPr>
+            <w:r>
+              <w:rPr>
+                <w:rFonts w:ascii="Tahoma" w:hAnsi="Tahoma" w:cs="Tahoma"/>
+                <w:b w:val="0"/>
+                <w:bCs/>
+                <w:sz w:val="22"/>
+                <w:szCs w:val="22"/>
+                <w:lang w:val="en-ID"/>
+              </w:rPr>
+              <w:t>{</w:t>
+            </w:r>
             <w:proofErr w:type="spellStart"/>
             <w:r>
               <w:rPr>
                 <w:rFonts w:ascii="Tahoma" w:hAnsi="Tahoma" w:cs="Tahoma"/>
                 <w:b w:val="0"/>
-                <w:color w:val="auto"/>
-                <w:sz w:val="22"/>
-                <w:szCs w:val="22"/>
-              </w:rPr>
-              <w:t>Disesuaikan</w:t>
+                <w:bCs/>
+                <w:sz w:val="22"/>
+                <w:szCs w:val="22"/>
+                <w:lang w:val="en-ID"/>
+              </w:rPr>
+              <w:t>kondisi_fisik_</w:t>
+            </w:r>
+            <w:r>
+              <w:rPr>
+                <w:rFonts w:ascii="Tahoma" w:hAnsi="Tahoma" w:cs="Tahoma"/>
+                <w:b w:val="0"/>
+                <w:bCs/>
+                <w:sz w:val="22"/>
+                <w:szCs w:val="22"/>
+                <w:lang w:val="en-ID"/>
+              </w:rPr>
+              <w:t>p</w:t>
+            </w:r>
+            <w:r>
+              <w:rPr>
+                <w:rFonts w:ascii="Tahoma" w:hAnsi="Tahoma" w:cs="Tahoma"/>
+                <w:b w:val="0"/>
+                <w:bCs/>
+                <w:sz w:val="22"/>
+                <w:szCs w:val="22"/>
+                <w:lang w:val="en-ID"/>
+              </w:rPr>
+              <w:t>b</w:t>
             </w:r>
             <w:proofErr w:type="spellEnd"/>
+            <w:r>
+              <w:rPr>
+                <w:rFonts w:ascii="Tahoma" w:hAnsi="Tahoma" w:cs="Tahoma"/>
+                <w:b w:val="0"/>
+                <w:bCs/>
+                <w:sz w:val="22"/>
+                <w:szCs w:val="22"/>
+                <w:lang w:val="en-ID"/>
+              </w:rPr>
+              <w:t>}</w:t>
+            </w:r>
           </w:p>
         </w:tc>
       </w:tr>
       <w:tr>
         <w:tc>
           <w:tcPr>
-            <w:tcW w:w="455" w:type="dxa"/>
+            <w:tcW w:w="426" w:type="dxa"/>
           </w:tcPr>
           <w:p>
             <w:pPr>
@@ -12904,7 +12548,7 @@
         </w:tc>
         <w:tc>
           <w:tcPr>
-            <w:tcW w:w="2090" w:type="dxa"/>
+            <w:tcW w:w="3184" w:type="dxa"/>
           </w:tcPr>
           <w:p>
             <w:pPr>
@@ -12969,7 +12613,7 @@
         </w:tc>
         <w:tc>
           <w:tcPr>
-            <w:tcW w:w="5955" w:type="dxa"/>
+            <w:tcW w:w="4890" w:type="dxa"/>
           </w:tcPr>
           <w:p>
             <w:pPr>
@@ -12985,25 +12629,59 @@
                 <w:lang w:val="id-ID"/>
               </w:rPr>
             </w:pPr>
+            <w:r>
+              <w:rPr>
+                <w:rFonts w:ascii="Tahoma" w:hAnsi="Tahoma" w:cs="Tahoma"/>
+                <w:b w:val="0"/>
+                <w:bCs/>
+                <w:sz w:val="22"/>
+                <w:szCs w:val="22"/>
+                <w:lang w:val="en-ID"/>
+              </w:rPr>
+              <w:t>{</w:t>
+            </w:r>
             <w:proofErr w:type="spellStart"/>
             <w:r>
               <w:rPr>
                 <w:rFonts w:ascii="Tahoma" w:hAnsi="Tahoma" w:cs="Tahoma"/>
                 <w:b w:val="0"/>
-                <w:color w:val="auto"/>
-                <w:sz w:val="22"/>
-                <w:szCs w:val="22"/>
-              </w:rPr>
-              <w:t>Disesuaikan</w:t>
+                <w:bCs/>
+                <w:sz w:val="22"/>
+                <w:szCs w:val="22"/>
+                <w:lang w:val="en-ID"/>
+              </w:rPr>
+              <w:t>kondisi_fisik_</w:t>
+            </w:r>
+            <w:r>
+              <w:rPr>
+                <w:rFonts w:ascii="Tahoma" w:hAnsi="Tahoma" w:cs="Tahoma"/>
+                <w:b w:val="0"/>
+                <w:bCs/>
+                <w:sz w:val="22"/>
+                <w:szCs w:val="22"/>
+                <w:lang w:val="en-ID"/>
+              </w:rPr>
+              <w:t>tampilan</w:t>
             </w:r>
             <w:proofErr w:type="spellEnd"/>
+            <w:r>
+              <w:rPr>
+                <w:rFonts w:ascii="Tahoma" w:hAnsi="Tahoma" w:cs="Tahoma"/>
+                <w:b w:val="0"/>
+                <w:bCs/>
+                <w:sz w:val="22"/>
+                <w:szCs w:val="22"/>
+                <w:lang w:val="en-ID"/>
+              </w:rPr>
+              <w:t>}</w:t>
+            </w:r>
           </w:p>
         </w:tc>
       </w:tr>
       <w:tr>
         <w:tc>
           <w:tcPr>
-            <w:tcW w:w="455" w:type="dxa"/>
+            <w:tcW w:w="426" w:type="dxa"/>
           </w:tcPr>
           <w:p>
             <w:pPr>
@@ -13019,7 +12697,7 @@
         </w:tc>
         <w:tc>
           <w:tcPr>
-            <w:tcW w:w="2090" w:type="dxa"/>
+            <w:tcW w:w="3184" w:type="dxa"/>
           </w:tcPr>
           <w:p>
             <w:pPr>
@@ -13096,7 +12774,7 @@
         </w:tc>
         <w:tc>
           <w:tcPr>
-            <w:tcW w:w="5955" w:type="dxa"/>
+            <w:tcW w:w="4890" w:type="dxa"/>
           </w:tcPr>
           <w:p>
             <w:pPr>
@@ -13106,37 +12784,69 @@
               <w:rPr>
                 <w:rFonts w:ascii="Tahoma" w:hAnsi="Tahoma" w:cs="Tahoma"/>
                 <w:b w:val="0"/>
-                <w:bCs/>
-                <w:color w:val="auto"/>
-                <w:szCs w:val="20"/>
-                <w:lang w:val="id-ID"/>
-              </w:rPr>
-            </w:pPr>
+                <w:color w:val="auto"/>
+                <w:sz w:val="22"/>
+                <w:szCs w:val="22"/>
+              </w:rPr>
+            </w:pPr>
+            <w:r>
+              <w:rPr>
+                <w:rFonts w:ascii="Tahoma" w:hAnsi="Tahoma" w:cs="Tahoma"/>
+                <w:b w:val="0"/>
+                <w:bCs/>
+                <w:sz w:val="22"/>
+                <w:szCs w:val="22"/>
+                <w:lang w:val="en-ID"/>
+              </w:rPr>
+              <w:t>{</w:t>
+            </w:r>
             <w:proofErr w:type="spellStart"/>
             <w:r>
               <w:rPr>
                 <w:rFonts w:ascii="Tahoma" w:hAnsi="Tahoma" w:cs="Tahoma"/>
                 <w:b w:val="0"/>
-                <w:color w:val="auto"/>
-                <w:sz w:val="22"/>
-                <w:szCs w:val="22"/>
-              </w:rPr>
-              <w:t>Disesuaikan</w:t>
+                <w:bCs/>
+                <w:sz w:val="22"/>
+                <w:szCs w:val="22"/>
+                <w:lang w:val="en-ID"/>
+              </w:rPr>
+              <w:t>kondisi_fisik_</w:t>
+            </w:r>
+            <w:r>
+              <w:rPr>
+                <w:rFonts w:ascii="Tahoma" w:hAnsi="Tahoma" w:cs="Tahoma"/>
+                <w:b w:val="0"/>
+                <w:bCs/>
+                <w:sz w:val="22"/>
+                <w:szCs w:val="22"/>
+                <w:lang w:val="en-ID"/>
+              </w:rPr>
+              <w:t>keadaan</w:t>
             </w:r>
             <w:proofErr w:type="spellEnd"/>
+            <w:r>
+              <w:rPr>
+                <w:rFonts w:ascii="Tahoma" w:hAnsi="Tahoma" w:cs="Tahoma"/>
+                <w:b w:val="0"/>
+                <w:bCs/>
+                <w:sz w:val="22"/>
+                <w:szCs w:val="22"/>
+                <w:lang w:val="en-ID"/>
+              </w:rPr>
+              <w:t>}</w:t>
+            </w:r>
           </w:p>
         </w:tc>
       </w:tr>
       <w:tr>
         <w:tc>
           <w:tcPr>
-            <w:tcW w:w="455" w:type="dxa"/>
+            <w:tcW w:w="426" w:type="dxa"/>
           </w:tcPr>
           <w:p>
             <w:pPr>
               <w:pStyle w:val="NormalWeb"/>
               <w:spacing w:beforeLines="0" w:before="60" w:afterLines="0" w:after="60"/>
-              <w:jc w:val="center"/>
               <w:rPr>
                 <w:rFonts w:ascii="Tahoma" w:hAnsi="Tahoma" w:cs="Tahoma"/>
                 <w:bCs/>
@@ -13148,12 +12858,19 @@
                 <w:bCs/>
               </w:rPr>
               <w:t>g</w:t>
+            </w:r>
+            <w:r>
+              <w:rPr>
+                <w:rFonts w:ascii="Tahoma" w:hAnsi="Tahoma" w:cs="Tahoma"/>
+                <w:bCs/>
+              </w:rPr>
+              <w:t>.</w:t>
             </w:r>
           </w:p>
         </w:tc>
         <w:tc>
           <w:tcPr>
-            <w:tcW w:w="2090" w:type="dxa"/>
+            <w:tcW w:w="3184" w:type="dxa"/>
           </w:tcPr>
           <w:p>
             <w:pPr>
@@ -13231,7 +12948,7 @@
         </w:tc>
         <w:tc>
           <w:tcPr>
-            <w:tcW w:w="5955" w:type="dxa"/>
+            <w:tcW w:w="4890" w:type="dxa"/>
           </w:tcPr>
           <w:p>
             <w:pPr>
@@ -13242,431 +12959,97 @@
                 <w:rFonts w:ascii="Tahoma" w:hAnsi="Tahoma" w:cs="Tahoma"/>
                 <w:b w:val="0"/>
                 <w:bCs/>
-                <w:color w:val="auto"/>
-                <w:szCs w:val="20"/>
-                <w:lang w:val="id-ID"/>
-              </w:rPr>
-            </w:pPr>
-            <w:r>
-              <w:rPr>
-                <w:rFonts w:ascii="Tahoma" w:hAnsi="Tahoma" w:cs="Tahoma"/>
-                <w:b w:val="0"/>
-                <w:bCs/>
-                <w:sz w:val="22"/>
-                <w:szCs w:val="22"/>
-              </w:rPr>
-              <w:t xml:space="preserve">D0 = </w:t>
-            </w:r>
-            <w:proofErr w:type="spellStart"/>
-            <w:r>
-              <w:rPr>
-                <w:rFonts w:ascii="Tahoma" w:hAnsi="Tahoma" w:cs="Tahoma"/>
-                <w:b w:val="0"/>
-                <w:bCs/>
-                <w:sz w:val="22"/>
-                <w:szCs w:val="22"/>
-              </w:rPr>
-              <w:t>Memadukan</w:t>
-            </w:r>
-            <w:proofErr w:type="spellEnd"/>
-            <w:r>
-              <w:rPr>
-                <w:rFonts w:ascii="Tahoma" w:hAnsi="Tahoma" w:cs="Tahoma"/>
-                <w:b w:val="0"/>
-                <w:bCs/>
-                <w:sz w:val="22"/>
-                <w:szCs w:val="22"/>
-              </w:rPr>
-              <w:t xml:space="preserve"> Data</w:t>
-            </w:r>
-          </w:p>
-        </w:tc>
-      </w:tr>
-      <w:tr>
-        <w:tc>
-          <w:tcPr>
-            <w:tcW w:w="455" w:type="dxa"/>
-          </w:tcPr>
-          <w:p>
-            <w:pPr>
-              <w:pStyle w:val="NormalWeb"/>
-              <w:spacing w:beforeLines="0" w:before="120" w:afterLines="0" w:after="120"/>
-              <w:jc w:val="center"/>
-              <w:rPr>
-                <w:rFonts w:ascii="Tahoma" w:hAnsi="Tahoma" w:cs="Tahoma"/>
-                <w:bCs/>
-                <w:lang w:val="sv-SE"/>
-              </w:rPr>
-            </w:pPr>
-            <w:r>
-              <w:rPr>
-                <w:rFonts w:ascii="Tahoma" w:hAnsi="Tahoma" w:cs="Tahoma"/>
-                <w:bCs/>
-                <w:lang w:val="sv-SE"/>
-              </w:rPr>
-              <w:br w:type="page"/>
-            </w:r>
-          </w:p>
-        </w:tc>
-        <w:tc>
-          <w:tcPr>
-            <w:tcW w:w="2090" w:type="dxa"/>
-          </w:tcPr>
-          <w:p>
-            <w:pPr>
-              <w:pStyle w:val="NormalWeb"/>
-              <w:spacing w:beforeLines="0" w:before="120" w:afterLines="0" w:after="120"/>
-              <w:rPr>
-                <w:rFonts w:ascii="Tahoma" w:hAnsi="Tahoma" w:cs="Tahoma"/>
-                <w:bCs/>
-                <w:lang w:val="sv-SE"/>
-              </w:rPr>
-            </w:pPr>
-          </w:p>
-        </w:tc>
-        <w:tc>
-          <w:tcPr>
-            <w:tcW w:w="344" w:type="dxa"/>
-          </w:tcPr>
-          <w:p>
-            <w:pPr>
-              <w:spacing w:before="120" w:after="120"/>
-              <w:ind w:left="1735" w:right="57" w:hanging="1735"/>
-              <w:jc w:val="both"/>
-              <w:rPr>
-                <w:rFonts w:ascii="Tahoma" w:hAnsi="Tahoma" w:cs="Tahoma"/>
-                <w:b w:val="0"/>
-                <w:bCs/>
-                <w:color w:val="auto"/>
-                <w:szCs w:val="20"/>
-                <w:lang w:val="sv-SE"/>
-              </w:rPr>
-            </w:pPr>
-          </w:p>
-        </w:tc>
-        <w:tc>
-          <w:tcPr>
-            <w:tcW w:w="5955" w:type="dxa"/>
-          </w:tcPr>
-          <w:p>
-            <w:pPr>
-              <w:spacing w:before="120" w:after="120"/>
-              <w:ind w:left="1735" w:right="57" w:hanging="1735"/>
-              <w:jc w:val="both"/>
-              <w:rPr>
-                <w:rFonts w:ascii="Tahoma" w:hAnsi="Tahoma" w:cs="Tahoma"/>
-                <w:b w:val="0"/>
-                <w:bCs/>
-                <w:color w:val="auto"/>
-                <w:szCs w:val="20"/>
-                <w:lang w:val="id-ID"/>
-              </w:rPr>
-            </w:pPr>
-            <w:r>
-              <w:rPr>
-                <w:rFonts w:ascii="Tahoma" w:hAnsi="Tahoma" w:cs="Tahoma"/>
-                <w:b w:val="0"/>
-                <w:bCs/>
-                <w:sz w:val="22"/>
-                <w:szCs w:val="22"/>
-              </w:rPr>
-              <w:t xml:space="preserve">D1 = </w:t>
-            </w:r>
-            <w:proofErr w:type="spellStart"/>
-            <w:r>
-              <w:rPr>
-                <w:rFonts w:ascii="Tahoma" w:hAnsi="Tahoma" w:cs="Tahoma"/>
-                <w:b w:val="0"/>
-                <w:bCs/>
-                <w:sz w:val="22"/>
-                <w:szCs w:val="22"/>
-              </w:rPr>
-              <w:t>Mengkoordinasi</w:t>
-            </w:r>
-            <w:proofErr w:type="spellEnd"/>
-            <w:r>
-              <w:rPr>
-                <w:rFonts w:ascii="Tahoma" w:hAnsi="Tahoma" w:cs="Tahoma"/>
-                <w:b w:val="0"/>
-                <w:bCs/>
-                <w:sz w:val="22"/>
-                <w:szCs w:val="22"/>
-              </w:rPr>
-              <w:t xml:space="preserve"> Data</w:t>
-            </w:r>
-          </w:p>
-        </w:tc>
-      </w:tr>
-      <w:tr>
-        <w:tc>
-          <w:tcPr>
-            <w:tcW w:w="455" w:type="dxa"/>
-          </w:tcPr>
-          <w:p>
-            <w:pPr>
-              <w:pStyle w:val="NormalWeb"/>
-              <w:spacing w:beforeLines="0" w:before="120" w:afterLines="0" w:after="120"/>
-              <w:jc w:val="center"/>
-              <w:rPr>
-                <w:rFonts w:ascii="Tahoma" w:hAnsi="Tahoma" w:cs="Tahoma"/>
-                <w:bCs/>
-                <w:lang w:val="sv-SE"/>
-              </w:rPr>
-            </w:pPr>
-          </w:p>
-        </w:tc>
-        <w:tc>
-          <w:tcPr>
-            <w:tcW w:w="2090" w:type="dxa"/>
-          </w:tcPr>
-          <w:p>
-            <w:pPr>
-              <w:pStyle w:val="NormalWeb"/>
-              <w:spacing w:beforeLines="0" w:before="120" w:afterLines="0" w:after="120"/>
-              <w:rPr>
-                <w:rFonts w:ascii="Tahoma" w:hAnsi="Tahoma" w:cs="Tahoma"/>
-                <w:bCs/>
-                <w:lang w:val="sv-SE"/>
-              </w:rPr>
-            </w:pPr>
-          </w:p>
-        </w:tc>
-        <w:tc>
-          <w:tcPr>
-            <w:tcW w:w="344" w:type="dxa"/>
-          </w:tcPr>
-          <w:p>
-            <w:pPr>
-              <w:spacing w:before="120" w:after="120"/>
-              <w:ind w:left="1735" w:right="57" w:hanging="1735"/>
-              <w:jc w:val="both"/>
-              <w:rPr>
-                <w:rFonts w:ascii="Tahoma" w:hAnsi="Tahoma" w:cs="Tahoma"/>
-                <w:b w:val="0"/>
-                <w:bCs/>
-                <w:color w:val="auto"/>
-                <w:szCs w:val="20"/>
-                <w:lang w:val="sv-SE"/>
-              </w:rPr>
-            </w:pPr>
-          </w:p>
-        </w:tc>
-        <w:tc>
-          <w:tcPr>
-            <w:tcW w:w="5955" w:type="dxa"/>
-          </w:tcPr>
-          <w:p>
-            <w:pPr>
-              <w:spacing w:before="120" w:after="120"/>
-              <w:ind w:left="1735" w:right="57" w:hanging="1735"/>
-              <w:jc w:val="both"/>
-              <w:rPr>
-                <w:rFonts w:ascii="Tahoma" w:hAnsi="Tahoma" w:cs="Tahoma"/>
-                <w:b w:val="0"/>
-                <w:bCs/>
-                <w:sz w:val="22"/>
-                <w:szCs w:val="22"/>
-              </w:rPr>
-            </w:pPr>
-            <w:r>
-              <w:rPr>
-                <w:rFonts w:ascii="Tahoma" w:hAnsi="Tahoma" w:cs="Tahoma"/>
-                <w:b w:val="0"/>
-                <w:bCs/>
-                <w:sz w:val="22"/>
-                <w:szCs w:val="22"/>
-              </w:rPr>
-              <w:t xml:space="preserve">D2 = </w:t>
-            </w:r>
-            <w:proofErr w:type="spellStart"/>
-            <w:r>
-              <w:rPr>
-                <w:rFonts w:ascii="Tahoma" w:hAnsi="Tahoma" w:cs="Tahoma"/>
-                <w:b w:val="0"/>
-                <w:bCs/>
-                <w:sz w:val="22"/>
-                <w:szCs w:val="22"/>
-              </w:rPr>
-              <w:t>Menganalisis</w:t>
-            </w:r>
-            <w:proofErr w:type="spellEnd"/>
-            <w:r>
-              <w:rPr>
-                <w:rFonts w:ascii="Tahoma" w:hAnsi="Tahoma" w:cs="Tahoma"/>
-                <w:b w:val="0"/>
-                <w:bCs/>
-                <w:sz w:val="22"/>
-                <w:szCs w:val="22"/>
-              </w:rPr>
-              <w:t xml:space="preserve"> Data</w:t>
-            </w:r>
-          </w:p>
-        </w:tc>
-      </w:tr>
-      <w:tr>
-        <w:tc>
-          <w:tcPr>
-            <w:tcW w:w="455" w:type="dxa"/>
-          </w:tcPr>
-          <w:p>
-            <w:pPr>
-              <w:pStyle w:val="NormalWeb"/>
-              <w:spacing w:beforeLines="0" w:before="120" w:afterLines="0" w:after="120"/>
-              <w:jc w:val="center"/>
-              <w:rPr>
-                <w:rFonts w:ascii="Tahoma" w:hAnsi="Tahoma" w:cs="Tahoma"/>
-                <w:bCs/>
-                <w:lang w:val="sv-SE"/>
-              </w:rPr>
-            </w:pPr>
-          </w:p>
-        </w:tc>
-        <w:tc>
-          <w:tcPr>
-            <w:tcW w:w="2090" w:type="dxa"/>
-          </w:tcPr>
-          <w:p>
-            <w:pPr>
-              <w:pStyle w:val="NormalWeb"/>
-              <w:spacing w:beforeLines="0" w:before="120" w:afterLines="0" w:after="120"/>
-              <w:rPr>
-                <w:rFonts w:ascii="Tahoma" w:hAnsi="Tahoma" w:cs="Tahoma"/>
-                <w:bCs/>
-                <w:lang w:val="sv-SE"/>
-              </w:rPr>
-            </w:pPr>
-          </w:p>
-        </w:tc>
-        <w:tc>
-          <w:tcPr>
-            <w:tcW w:w="344" w:type="dxa"/>
-          </w:tcPr>
-          <w:p>
-            <w:pPr>
-              <w:spacing w:before="120" w:after="120"/>
-              <w:ind w:left="1735" w:right="57" w:hanging="1735"/>
-              <w:jc w:val="both"/>
-              <w:rPr>
-                <w:rFonts w:ascii="Tahoma" w:hAnsi="Tahoma" w:cs="Tahoma"/>
-                <w:b w:val="0"/>
-                <w:bCs/>
-                <w:color w:val="auto"/>
-                <w:szCs w:val="20"/>
-                <w:lang w:val="sv-SE"/>
-              </w:rPr>
-            </w:pPr>
-          </w:p>
-        </w:tc>
-        <w:tc>
-          <w:tcPr>
-            <w:tcW w:w="5955" w:type="dxa"/>
-          </w:tcPr>
-          <w:p>
-            <w:pPr>
-              <w:spacing w:before="120" w:after="120"/>
-              <w:ind w:left="1735" w:right="57" w:hanging="1735"/>
-              <w:jc w:val="both"/>
-              <w:rPr>
-                <w:rFonts w:ascii="Tahoma" w:hAnsi="Tahoma" w:cs="Tahoma"/>
-                <w:b w:val="0"/>
-                <w:bCs/>
-                <w:sz w:val="22"/>
-                <w:szCs w:val="22"/>
-              </w:rPr>
-            </w:pPr>
-            <w:r>
-              <w:rPr>
-                <w:rFonts w:ascii="Tahoma" w:hAnsi="Tahoma" w:cs="Tahoma"/>
-                <w:b w:val="0"/>
-                <w:bCs/>
-                <w:sz w:val="22"/>
-                <w:szCs w:val="22"/>
-              </w:rPr>
-              <w:t>D3 = Menyusun Data</w:t>
-            </w:r>
-          </w:p>
-        </w:tc>
-      </w:tr>
-      <w:tr>
-        <w:tc>
-          <w:tcPr>
-            <w:tcW w:w="455" w:type="dxa"/>
-          </w:tcPr>
-          <w:p>
-            <w:pPr>
-              <w:pStyle w:val="NormalWeb"/>
-              <w:spacing w:beforeLines="0" w:before="120" w:afterLines="0" w:after="120"/>
-              <w:jc w:val="center"/>
-              <w:rPr>
-                <w:rFonts w:ascii="Tahoma" w:hAnsi="Tahoma" w:cs="Tahoma"/>
-                <w:bCs/>
-                <w:lang w:val="sv-SE"/>
-              </w:rPr>
-            </w:pPr>
-          </w:p>
-        </w:tc>
-        <w:tc>
-          <w:tcPr>
-            <w:tcW w:w="2090" w:type="dxa"/>
-          </w:tcPr>
-          <w:p>
-            <w:pPr>
-              <w:pStyle w:val="NormalWeb"/>
-              <w:spacing w:beforeLines="0" w:before="120" w:afterLines="0" w:after="120"/>
-              <w:rPr>
-                <w:rFonts w:ascii="Tahoma" w:hAnsi="Tahoma" w:cs="Tahoma"/>
-                <w:bCs/>
-                <w:lang w:val="sv-SE"/>
-              </w:rPr>
-            </w:pPr>
-          </w:p>
-        </w:tc>
-        <w:tc>
-          <w:tcPr>
-            <w:tcW w:w="344" w:type="dxa"/>
-          </w:tcPr>
-          <w:p>
-            <w:pPr>
-              <w:spacing w:before="120" w:after="120"/>
+                <w:sz w:val="22"/>
+                <w:szCs w:val="22"/>
+                <w:lang w:val="en-ID"/>
+              </w:rPr>
+            </w:pPr>
+            <w:r>
+              <w:rPr>
+                <w:rFonts w:ascii="Tahoma" w:hAnsi="Tahoma" w:cs="Tahoma"/>
+                <w:b w:val="0"/>
+                <w:bCs/>
+                <w:sz w:val="22"/>
+                <w:szCs w:val="22"/>
+                <w:lang w:val="en-ID"/>
+              </w:rPr>
+              <w:t>{#fungsi_pekerja}</w:t>
+            </w:r>
+          </w:p>
+          <w:p>
+            <w:pPr>
+              <w:spacing w:before="60" w:after="60"/>
               <w:ind w:right="57"/>
               <w:jc w:val="both"/>
               <w:rPr>
                 <w:rFonts w:ascii="Tahoma" w:hAnsi="Tahoma" w:cs="Tahoma"/>
                 <w:b w:val="0"/>
                 <w:bCs/>
-                <w:color w:val="auto"/>
-                <w:szCs w:val="20"/>
-              </w:rPr>
-            </w:pPr>
-          </w:p>
-        </w:tc>
-        <w:tc>
-          <w:tcPr>
-            <w:tcW w:w="5955" w:type="dxa"/>
-          </w:tcPr>
-          <w:p>
-            <w:pPr>
-              <w:spacing w:before="120" w:after="120"/>
+                <w:sz w:val="22"/>
+                <w:szCs w:val="22"/>
+                <w:lang w:val="en-ID"/>
+              </w:rPr>
+            </w:pPr>
+            <w:r>
+              <w:rPr>
+                <w:rFonts w:ascii="Tahoma" w:hAnsi="Tahoma" w:cs="Tahoma"/>
+                <w:b w:val="0"/>
+                <w:bCs/>
+                <w:sz w:val="22"/>
+                <w:szCs w:val="22"/>
+                <w:lang w:val="en-ID"/>
+              </w:rPr>
+              <w:t>{</w:t>
+            </w:r>
+            <w:proofErr w:type="spellStart"/>
+            <w:r>
+              <w:rPr>
+                <w:rFonts w:ascii="Tahoma" w:hAnsi="Tahoma" w:cs="Tahoma"/>
+                <w:b w:val="0"/>
+                <w:bCs/>
+                <w:sz w:val="22"/>
+                <w:szCs w:val="22"/>
+                <w:lang w:val="en-ID"/>
+              </w:rPr>
+              <w:t>teks</w:t>
+            </w:r>
+            <w:proofErr w:type="spellEnd"/>
+            <w:r>
+              <w:rPr>
+                <w:rFonts w:ascii="Tahoma" w:hAnsi="Tahoma" w:cs="Tahoma"/>
+                <w:b w:val="0"/>
+                <w:bCs/>
+                <w:sz w:val="22"/>
+                <w:szCs w:val="22"/>
+                <w:lang w:val="en-ID"/>
+              </w:rPr>
+              <w:t>}</w:t>
+            </w:r>
+          </w:p>
+          <w:p>
+            <w:pPr>
+              <w:spacing w:before="60" w:after="60"/>
               <w:ind w:right="57"/>
               <w:jc w:val="both"/>
               <w:rPr>
                 <w:rFonts w:ascii="Tahoma" w:hAnsi="Tahoma" w:cs="Tahoma"/>
                 <w:b w:val="0"/>
                 <w:bCs/>
-                <w:color w:val="auto"/>
-                <w:szCs w:val="20"/>
-              </w:rPr>
-            </w:pPr>
-            <w:r>
-              <w:rPr>
-                <w:rFonts w:ascii="Tahoma" w:hAnsi="Tahoma" w:cs="Tahoma"/>
-                <w:b w:val="0"/>
-                <w:bCs/>
-                <w:color w:val="auto"/>
-                <w:sz w:val="22"/>
-                <w:szCs w:val="22"/>
-              </w:rPr>
-              <w:t xml:space="preserve">D4 = </w:t>
+                <w:sz w:val="22"/>
+                <w:szCs w:val="22"/>
+                <w:lang w:val="en-ID"/>
+              </w:rPr>
+            </w:pPr>
+            <w:r>
+              <w:rPr>
+                <w:rFonts w:ascii="Tahoma" w:hAnsi="Tahoma" w:cs="Tahoma"/>
+                <w:b w:val="0"/>
+                <w:bCs/>
+                <w:sz w:val="22"/>
+                <w:szCs w:val="22"/>
+                <w:lang w:val="en-ID"/>
+              </w:rPr>
+              <w:t>{/</w:t>
             </w:r>
             <w:proofErr w:type="spellStart"/>
             <w:r>
@@ -13674,11 +13057,11 @@
                 <w:rFonts w:ascii="Tahoma" w:hAnsi="Tahoma" w:cs="Tahoma"/>
                 <w:b w:val="0"/>
                 <w:bCs/>
-                <w:color w:val="auto"/>
-                <w:sz w:val="22"/>
-                <w:szCs w:val="22"/>
-              </w:rPr>
-              <w:t>Menghitung</w:t>
+                <w:sz w:val="22"/>
+                <w:szCs w:val="22"/>
+                <w:lang w:val="en-ID"/>
+              </w:rPr>
+              <w:t>fungsi_pekerja</w:t>
             </w:r>
             <w:proofErr w:type="spellEnd"/>
             <w:r>
@@ -13686,96 +13069,22 @@
                 <w:rFonts w:ascii="Tahoma" w:hAnsi="Tahoma" w:cs="Tahoma"/>
                 <w:b w:val="0"/>
                 <w:bCs/>
-                <w:color w:val="auto"/>
-                <w:sz w:val="22"/>
-                <w:szCs w:val="22"/>
-              </w:rPr>
-              <w:t xml:space="preserve"> data</w:t>
-            </w:r>
-          </w:p>
-        </w:tc>
-      </w:tr>
-      <w:tr>
-        <w:tc>
-          <w:tcPr>
-            <w:tcW w:w="455" w:type="dxa"/>
-          </w:tcPr>
-          <w:p>
-            <w:pPr>
-              <w:pStyle w:val="NormalWeb"/>
-              <w:spacing w:beforeLines="0" w:before="120" w:afterLines="0" w:after="120"/>
-              <w:jc w:val="center"/>
-              <w:rPr>
-                <w:rFonts w:ascii="Tahoma" w:hAnsi="Tahoma" w:cs="Tahoma"/>
-                <w:bCs/>
-                <w:lang w:val="sv-SE"/>
-              </w:rPr>
-            </w:pPr>
-          </w:p>
-        </w:tc>
-        <w:tc>
-          <w:tcPr>
-            <w:tcW w:w="2090" w:type="dxa"/>
-          </w:tcPr>
-          <w:p>
-            <w:pPr>
-              <w:pStyle w:val="NormalWeb"/>
-              <w:spacing w:beforeLines="0" w:before="120" w:afterLines="0" w:after="120"/>
-              <w:rPr>
-                <w:rFonts w:ascii="Tahoma" w:hAnsi="Tahoma" w:cs="Tahoma"/>
-                <w:bCs/>
-                <w:lang w:val="sv-SE"/>
-              </w:rPr>
-            </w:pPr>
-          </w:p>
-        </w:tc>
-        <w:tc>
-          <w:tcPr>
-            <w:tcW w:w="344" w:type="dxa"/>
-          </w:tcPr>
-          <w:p>
-            <w:pPr>
-              <w:spacing w:before="120" w:after="120"/>
-              <w:ind w:right="57"/>
-              <w:jc w:val="both"/>
-              <w:rPr>
-                <w:rFonts w:ascii="Tahoma" w:hAnsi="Tahoma" w:cs="Tahoma"/>
-                <w:b w:val="0"/>
-                <w:bCs/>
-                <w:color w:val="auto"/>
-                <w:szCs w:val="20"/>
-              </w:rPr>
-            </w:pPr>
-          </w:p>
-        </w:tc>
-        <w:tc>
-          <w:tcPr>
-            <w:tcW w:w="5955" w:type="dxa"/>
-          </w:tcPr>
-          <w:p>
-            <w:pPr>
-              <w:spacing w:before="120" w:after="120"/>
-              <w:ind w:right="57"/>
-              <w:jc w:val="both"/>
-              <w:rPr>
-                <w:rFonts w:ascii="Tahoma" w:hAnsi="Tahoma" w:cs="Tahoma"/>
-                <w:b w:val="0"/>
-                <w:bCs/>
-                <w:color w:val="auto"/>
-                <w:sz w:val="22"/>
-                <w:szCs w:val="22"/>
-              </w:rPr>
-            </w:pPr>
-            <w:r>
-              <w:rPr>
-                <w:rFonts w:ascii="Tahoma" w:hAnsi="Tahoma" w:cs="Tahoma"/>
-                <w:b w:val="0"/>
-                <w:bCs/>
-                <w:color w:val="auto"/>
-                <w:sz w:val="22"/>
-                <w:szCs w:val="22"/>
-              </w:rPr>
-              <w:t xml:space="preserve">D5 = </w:t>
+                <w:sz w:val="22"/>
+                <w:szCs w:val="22"/>
+                <w:lang w:val="en-ID"/>
+              </w:rPr>
+              <w:t>}</w:t>
+            </w:r>
+            <w:r>
+              <w:rPr>
+                <w:rFonts w:ascii="Tahoma" w:hAnsi="Tahoma" w:cs="Tahoma"/>
+                <w:b w:val="0"/>
+                <w:bCs/>
+                <w:sz w:val="22"/>
+                <w:szCs w:val="22"/>
+                <w:lang w:val="en-ID"/>
+              </w:rPr>
+              <w:t>{/</w:t>
             </w:r>
             <w:proofErr w:type="spellStart"/>
             <w:r>
@@ -13783,11 +13092,11 @@
                 <w:rFonts w:ascii="Tahoma" w:hAnsi="Tahoma" w:cs="Tahoma"/>
                 <w:b w:val="0"/>
                 <w:bCs/>
-                <w:color w:val="auto"/>
-                <w:sz w:val="22"/>
-                <w:szCs w:val="22"/>
-              </w:rPr>
-              <w:t>Menyalin</w:t>
+                <w:sz w:val="22"/>
+                <w:szCs w:val="22"/>
+                <w:lang w:val="en-ID"/>
+              </w:rPr>
+              <w:t>syarat_jabatan</w:t>
             </w:r>
             <w:proofErr w:type="spellEnd"/>
             <w:r>
@@ -13795,341 +13104,12 @@
                 <w:rFonts w:ascii="Tahoma" w:hAnsi="Tahoma" w:cs="Tahoma"/>
                 <w:b w:val="0"/>
                 <w:bCs/>
-                <w:color w:val="auto"/>
-                <w:sz w:val="22"/>
-                <w:szCs w:val="22"/>
-              </w:rPr>
-              <w:t xml:space="preserve"> Data</w:t>
-            </w:r>
-          </w:p>
-        </w:tc>
-      </w:tr>
-      <w:tr>
-        <w:tc>
-          <w:tcPr>
-            <w:tcW w:w="455" w:type="dxa"/>
-          </w:tcPr>
-          <w:p>
-            <w:pPr>
-              <w:pStyle w:val="NormalWeb"/>
-              <w:spacing w:beforeLines="0" w:before="120" w:afterLines="0" w:after="120"/>
-              <w:jc w:val="center"/>
-              <w:rPr>
-                <w:rFonts w:ascii="Tahoma" w:hAnsi="Tahoma" w:cs="Tahoma"/>
-                <w:bCs/>
-                <w:lang w:val="sv-SE"/>
-              </w:rPr>
-            </w:pPr>
-          </w:p>
-        </w:tc>
-        <w:tc>
-          <w:tcPr>
-            <w:tcW w:w="2090" w:type="dxa"/>
-          </w:tcPr>
-          <w:p>
-            <w:pPr>
-              <w:pStyle w:val="NormalWeb"/>
-              <w:spacing w:beforeLines="0" w:before="120" w:afterLines="0" w:after="120"/>
-              <w:rPr>
-                <w:rFonts w:ascii="Tahoma" w:hAnsi="Tahoma" w:cs="Tahoma"/>
-                <w:bCs/>
-                <w:lang w:val="sv-SE"/>
-              </w:rPr>
-            </w:pPr>
-          </w:p>
-        </w:tc>
-        <w:tc>
-          <w:tcPr>
-            <w:tcW w:w="344" w:type="dxa"/>
-          </w:tcPr>
-          <w:p>
-            <w:pPr>
-              <w:spacing w:before="120" w:after="120"/>
-              <w:ind w:right="57"/>
-              <w:jc w:val="both"/>
-              <w:rPr>
-                <w:rFonts w:ascii="Tahoma" w:hAnsi="Tahoma" w:cs="Tahoma"/>
-                <w:b w:val="0"/>
-                <w:bCs/>
-                <w:color w:val="auto"/>
-                <w:szCs w:val="20"/>
-              </w:rPr>
-            </w:pPr>
-          </w:p>
-        </w:tc>
-        <w:tc>
-          <w:tcPr>
-            <w:tcW w:w="5955" w:type="dxa"/>
-          </w:tcPr>
-          <w:p>
-            <w:pPr>
-              <w:spacing w:before="120" w:after="120"/>
-              <w:ind w:right="57"/>
-              <w:jc w:val="both"/>
-              <w:rPr>
-                <w:rFonts w:ascii="Tahoma" w:hAnsi="Tahoma" w:cs="Tahoma"/>
-                <w:b w:val="0"/>
-                <w:bCs/>
-                <w:color w:val="auto"/>
-                <w:sz w:val="22"/>
-                <w:szCs w:val="22"/>
-              </w:rPr>
-            </w:pPr>
-            <w:r>
-              <w:rPr>
-                <w:rFonts w:ascii="Tahoma" w:hAnsi="Tahoma" w:cs="Tahoma"/>
-                <w:b w:val="0"/>
-                <w:bCs/>
-                <w:color w:val="auto"/>
-                <w:sz w:val="22"/>
-                <w:szCs w:val="22"/>
-              </w:rPr>
-              <w:t xml:space="preserve">D6 = </w:t>
-            </w:r>
-            <w:proofErr w:type="spellStart"/>
-            <w:r>
-              <w:rPr>
-                <w:rFonts w:ascii="Tahoma" w:hAnsi="Tahoma" w:cs="Tahoma"/>
-                <w:b w:val="0"/>
-                <w:bCs/>
-                <w:color w:val="auto"/>
-                <w:sz w:val="22"/>
-                <w:szCs w:val="22"/>
-              </w:rPr>
-              <w:t>Membandingkan</w:t>
-            </w:r>
-            <w:proofErr w:type="spellEnd"/>
-            <w:r>
-              <w:rPr>
-                <w:rFonts w:ascii="Tahoma" w:hAnsi="Tahoma" w:cs="Tahoma"/>
-                <w:b w:val="0"/>
-                <w:bCs/>
-                <w:color w:val="auto"/>
-                <w:sz w:val="22"/>
-                <w:szCs w:val="22"/>
-              </w:rPr>
-              <w:t xml:space="preserve"> Data</w:t>
-            </w:r>
-          </w:p>
-        </w:tc>
-      </w:tr>
-      <w:tr>
-        <w:tc>
-          <w:tcPr>
-            <w:tcW w:w="455" w:type="dxa"/>
-          </w:tcPr>
-          <w:p>
-            <w:pPr>
-              <w:pStyle w:val="NormalWeb"/>
-              <w:spacing w:beforeLines="0" w:before="120" w:afterLines="0" w:after="120"/>
-              <w:jc w:val="center"/>
-              <w:rPr>
-                <w:rFonts w:ascii="Tahoma" w:hAnsi="Tahoma" w:cs="Tahoma"/>
-                <w:bCs/>
-                <w:lang w:val="sv-SE"/>
-              </w:rPr>
-            </w:pPr>
-          </w:p>
-        </w:tc>
-        <w:tc>
-          <w:tcPr>
-            <w:tcW w:w="2090" w:type="dxa"/>
-          </w:tcPr>
-          <w:p>
-            <w:pPr>
-              <w:pStyle w:val="NormalWeb"/>
-              <w:spacing w:beforeLines="0" w:before="120" w:afterLines="0" w:after="120"/>
-              <w:rPr>
-                <w:rFonts w:ascii="Tahoma" w:hAnsi="Tahoma" w:cs="Tahoma"/>
-                <w:bCs/>
-                <w:lang w:val="sv-SE"/>
-              </w:rPr>
-            </w:pPr>
-          </w:p>
-        </w:tc>
-        <w:tc>
-          <w:tcPr>
-            <w:tcW w:w="344" w:type="dxa"/>
-          </w:tcPr>
-          <w:p>
-            <w:pPr>
-              <w:spacing w:before="120" w:after="120"/>
-              <w:ind w:right="57"/>
-              <w:jc w:val="both"/>
-              <w:rPr>
-                <w:rFonts w:ascii="Tahoma" w:hAnsi="Tahoma" w:cs="Tahoma"/>
-                <w:b w:val="0"/>
-                <w:bCs/>
-                <w:color w:val="auto"/>
-                <w:szCs w:val="20"/>
-              </w:rPr>
-            </w:pPr>
-          </w:p>
-        </w:tc>
-        <w:tc>
-          <w:tcPr>
-            <w:tcW w:w="5955" w:type="dxa"/>
-          </w:tcPr>
-          <w:p>
-            <w:pPr>
-              <w:spacing w:before="120" w:after="120"/>
-              <w:ind w:right="57"/>
-              <w:jc w:val="both"/>
-              <w:rPr>
-                <w:rFonts w:ascii="Tahoma" w:hAnsi="Tahoma" w:cs="Tahoma"/>
-                <w:b w:val="0"/>
-                <w:bCs/>
-                <w:color w:val="auto"/>
-                <w:sz w:val="22"/>
-                <w:szCs w:val="22"/>
-              </w:rPr>
-            </w:pPr>
-            <w:r>
-              <w:rPr>
-                <w:rFonts w:ascii="Tahoma" w:hAnsi="Tahoma" w:cs="Tahoma"/>
-                <w:b w:val="0"/>
-                <w:bCs/>
-                <w:color w:val="auto"/>
-                <w:sz w:val="22"/>
-                <w:szCs w:val="22"/>
-              </w:rPr>
-              <w:t xml:space="preserve">O = 1: </w:t>
-            </w:r>
-            <w:proofErr w:type="spellStart"/>
-            <w:r>
-              <w:rPr>
-                <w:rFonts w:ascii="Tahoma" w:hAnsi="Tahoma" w:cs="Tahoma"/>
-                <w:b w:val="0"/>
-                <w:bCs/>
-                <w:color w:val="auto"/>
-                <w:sz w:val="22"/>
-                <w:szCs w:val="22"/>
-              </w:rPr>
-              <w:t>Berunding</w:t>
-            </w:r>
-            <w:proofErr w:type="spellEnd"/>
-          </w:p>
-        </w:tc>
-      </w:tr>
-      <w:tr>
-        <w:tc>
-          <w:tcPr>
-            <w:tcW w:w="455" w:type="dxa"/>
-          </w:tcPr>
-          <w:p>
-            <w:pPr>
-              <w:pStyle w:val="NormalWeb"/>
-              <w:spacing w:beforeLines="0" w:before="120" w:afterLines="0" w:after="120"/>
-              <w:jc w:val="center"/>
-              <w:rPr>
-                <w:rFonts w:ascii="Tahoma" w:hAnsi="Tahoma" w:cs="Tahoma"/>
-                <w:bCs/>
-                <w:lang w:val="sv-SE"/>
-              </w:rPr>
-            </w:pPr>
-          </w:p>
-        </w:tc>
-        <w:tc>
-          <w:tcPr>
-            <w:tcW w:w="2090" w:type="dxa"/>
-          </w:tcPr>
-          <w:p>
-            <w:pPr>
-              <w:pStyle w:val="NormalWeb"/>
-              <w:spacing w:beforeLines="0" w:before="120" w:afterLines="0" w:after="120"/>
-              <w:rPr>
-                <w:rFonts w:ascii="Tahoma" w:hAnsi="Tahoma" w:cs="Tahoma"/>
-                <w:bCs/>
-                <w:lang w:val="sv-SE"/>
-              </w:rPr>
-            </w:pPr>
-          </w:p>
-        </w:tc>
-        <w:tc>
-          <w:tcPr>
-            <w:tcW w:w="344" w:type="dxa"/>
-          </w:tcPr>
-          <w:p>
-            <w:pPr>
-              <w:spacing w:before="120" w:after="120"/>
-              <w:ind w:right="57"/>
-              <w:jc w:val="both"/>
-              <w:rPr>
-                <w:rFonts w:ascii="Tahoma" w:hAnsi="Tahoma" w:cs="Tahoma"/>
-                <w:b w:val="0"/>
-                <w:bCs/>
-                <w:color w:val="auto"/>
-                <w:szCs w:val="20"/>
-              </w:rPr>
-            </w:pPr>
-          </w:p>
-        </w:tc>
-        <w:tc>
-          <w:tcPr>
-            <w:tcW w:w="5955" w:type="dxa"/>
-          </w:tcPr>
-          <w:p>
-            <w:pPr>
-              <w:spacing w:before="120" w:after="120"/>
-              <w:ind w:right="57"/>
-              <w:jc w:val="both"/>
-              <w:rPr>
-                <w:rFonts w:ascii="Tahoma" w:hAnsi="Tahoma" w:cs="Tahoma"/>
-                <w:b w:val="0"/>
-                <w:bCs/>
-                <w:color w:val="auto"/>
-                <w:sz w:val="22"/>
-                <w:szCs w:val="22"/>
-              </w:rPr>
-            </w:pPr>
-            <w:r>
-              <w:rPr>
-                <w:rFonts w:ascii="Tahoma" w:hAnsi="Tahoma" w:cs="Tahoma"/>
-                <w:b w:val="0"/>
-                <w:bCs/>
-                <w:color w:val="auto"/>
-                <w:sz w:val="22"/>
-                <w:szCs w:val="22"/>
-              </w:rPr>
-              <w:t xml:space="preserve">O = 8: </w:t>
-            </w:r>
-            <w:proofErr w:type="spellStart"/>
-            <w:r>
-              <w:rPr>
-                <w:rFonts w:ascii="Tahoma" w:hAnsi="Tahoma" w:cs="Tahoma"/>
-                <w:b w:val="0"/>
-                <w:bCs/>
-                <w:color w:val="auto"/>
-                <w:sz w:val="22"/>
-                <w:szCs w:val="22"/>
-              </w:rPr>
-              <w:t>Menerima</w:t>
-            </w:r>
-            <w:proofErr w:type="spellEnd"/>
-            <w:r>
-              <w:rPr>
-                <w:rFonts w:ascii="Tahoma" w:hAnsi="Tahoma" w:cs="Tahoma"/>
-                <w:b w:val="0"/>
-                <w:bCs/>
-                <w:color w:val="auto"/>
-                <w:sz w:val="22"/>
-                <w:szCs w:val="22"/>
-              </w:rPr>
-              <w:t xml:space="preserve"> </w:t>
-            </w:r>
-            <w:proofErr w:type="spellStart"/>
-            <w:r>
-              <w:rPr>
-                <w:rFonts w:ascii="Tahoma" w:hAnsi="Tahoma" w:cs="Tahoma"/>
-                <w:b w:val="0"/>
-                <w:bCs/>
-                <w:color w:val="auto"/>
-                <w:sz w:val="22"/>
-                <w:szCs w:val="22"/>
-              </w:rPr>
-              <w:t>instruksi</w:t>
-            </w:r>
-            <w:proofErr w:type="spellEnd"/>
+                <w:sz w:val="22"/>
+                <w:szCs w:val="22"/>
+                <w:lang w:val="en-ID"/>
+              </w:rPr>
+              <w:t>}</w:t>
+            </w:r>
           </w:p>
         </w:tc>
       </w:tr>
@@ -14155,12 +13135,13 @@
     <w:p>
       <w:pPr>
         <w:pStyle w:val="NormalWeb"/>
+        <w:keepNext/>
         <w:numPr>
           <w:ilvl w:val="0"/>
           <w:numId w:val="2"/>
         </w:numPr>
         <w:spacing w:beforeLines="0" w:before="120" w:afterLines="0" w:after="120"/>
-        <w:ind w:left="426" w:hanging="426"/>
+        <w:ind w:left="425" w:hanging="425"/>
         <w:jc w:val="both"/>
         <w:rPr>
           <w:rFonts w:ascii="Tahoma" w:hAnsi="Tahoma" w:cs="Tahoma"/>
@@ -14185,6 +13166,15 @@
           <w:bCs/>
           <w:sz w:val="22"/>
           <w:szCs w:val="22"/>
+        </w:rPr>
+        <w:t xml:space="preserve"> </w:t>
+      </w:r>
+      <w:r>
+        <w:rPr>
+          <w:rFonts w:ascii="Tahoma" w:hAnsi="Tahoma" w:cs="Tahoma"/>
+          <w:bCs/>
+          <w:sz w:val="22"/>
+          <w:szCs w:val="22"/>
           <w:lang w:val="id-ID"/>
         </w:rPr>
         <w:t>:</w:t>
@@ -14207,10 +13197,36 @@
         <w:rPr>
           <w:rFonts w:ascii="Tahoma" w:hAnsi="Tahoma" w:cs="Tahoma"/>
           <w:bCs/>
+          <w:color w:val="000000"/>
           <w:sz w:val="22"/>
           <w:szCs w:val="22"/>
+          <w:lang w:val="en-ID"/>
         </w:rPr>
-        <w:t>Baik</w:t>
+        <w:t>{</w:t>
+      </w:r>
+      <w:proofErr w:type="spellStart"/>
+      <w:r>
+        <w:rPr>
+          <w:rFonts w:ascii="Tahoma" w:hAnsi="Tahoma" w:cs="Tahoma"/>
+          <w:bCs/>
+          <w:color w:val="000000"/>
+          <w:sz w:val="22"/>
+          <w:szCs w:val="22"/>
+          <w:lang w:val="en-ID"/>
+        </w:rPr>
+        <w:t>prestasi_diharapkan</w:t>
+      </w:r>
+      <w:proofErr w:type="spellEnd"/>
+      <w:r>
+        <w:rPr>
+          <w:rFonts w:ascii="Tahoma" w:hAnsi="Tahoma" w:cs="Tahoma"/>
+          <w:bCs/>
+          <w:color w:val="000000"/>
+          <w:sz w:val="22"/>
+          <w:szCs w:val="22"/>
+          <w:lang w:val="en-ID"/>
+        </w:rPr>
+        <w:t>}</w:t>
       </w:r>
     </w:p>
     <w:p>
@@ -14230,12 +13246,13 @@
     <w:p>
       <w:pPr>
         <w:pStyle w:val="NormalWeb"/>
+        <w:keepNext/>
         <w:numPr>
           <w:ilvl w:val="0"/>
           <w:numId w:val="2"/>
         </w:numPr>
         <w:spacing w:beforeLines="0" w:before="120" w:afterLines="0" w:after="120"/>
-        <w:ind w:left="426" w:hanging="426"/>
+        <w:ind w:left="425" w:hanging="425"/>
         <w:jc w:val="both"/>
         <w:rPr>
           <w:rFonts w:ascii="Tahoma" w:hAnsi="Tahoma" w:cs="Tahoma"/>
@@ -14253,10 +13270,18 @@
           <w:sz w:val="22"/>
           <w:szCs w:val="22"/>
         </w:rPr>
-        <w:lastRenderedPageBreak/>
         <w:t>KELAS JABATAN</w:t>
       </w:r>
       <w:bookmarkEnd w:id="0"/>
+      <w:r>
+        <w:rPr>
+          <w:rFonts w:ascii="Tahoma" w:hAnsi="Tahoma" w:cs="Tahoma"/>
+          <w:bCs/>
+          <w:sz w:val="22"/>
+          <w:szCs w:val="22"/>
+        </w:rPr>
+        <w:t xml:space="preserve"> </w:t>
+      </w:r>
       <w:r>
         <w:rPr>
           <w:rFonts w:ascii="Tahoma" w:hAnsi="Tahoma" w:cs="Tahoma"/>
@@ -14280,12 +13305,8 @@
     <w:p>
       <w:pPr>
         <w:pStyle w:val="NormalWeb"/>
-        <w:numPr>
-          <w:ilvl w:val="0"/>
-          <w:numId w:val="11"/>
-        </w:numPr>
         <w:spacing w:beforeLines="0" w:before="120" w:afterLines="0" w:after="120"/>
-        <w:ind w:left="810"/>
+        <w:ind w:firstLine="425"/>
         <w:jc w:val="both"/>
         <w:rPr>
           <w:rFonts w:ascii="Tahoma" w:hAnsi="Tahoma" w:cs="Tahoma"/>
@@ -14294,66 +13315,40 @@
           <w:szCs w:val="22"/>
         </w:rPr>
       </w:pPr>
+      <w:r>
+        <w:rPr>
+          <w:rFonts w:ascii="Tahoma" w:hAnsi="Tahoma" w:cs="Tahoma"/>
+          <w:bCs/>
+          <w:color w:val="000000"/>
+          <w:sz w:val="22"/>
+          <w:szCs w:val="22"/>
+          <w:lang w:val="en-ID"/>
+        </w:rPr>
+        <w:t>{</w:t>
+      </w:r>
       <w:proofErr w:type="spellStart"/>
       <w:r>
         <w:rPr>
           <w:rFonts w:ascii="Tahoma" w:hAnsi="Tahoma" w:cs="Tahoma"/>
           <w:bCs/>
+          <w:color w:val="000000"/>
           <w:sz w:val="22"/>
           <w:szCs w:val="22"/>
+          <w:lang w:val="en-ID"/>
         </w:rPr>
-        <w:t>Kelas</w:t>
+        <w:t>kelas_jabatan</w:t>
       </w:r>
       <w:proofErr w:type="spellEnd"/>
       <w:r>
         <w:rPr>
           <w:rFonts w:ascii="Tahoma" w:hAnsi="Tahoma" w:cs="Tahoma"/>
           <w:bCs/>
+          <w:color w:val="000000"/>
           <w:sz w:val="22"/>
           <w:szCs w:val="22"/>
+          <w:lang w:val="en-ID"/>
         </w:rPr>
-        <w:t xml:space="preserve"> </w:t>
-      </w:r>
-      <w:r>
-        <w:rPr>
-          <w:rFonts w:ascii="Tahoma" w:hAnsi="Tahoma" w:cs="Tahoma"/>
-          <w:bCs/>
-          <w:sz w:val="22"/>
-          <w:szCs w:val="22"/>
-          <w:lang w:val="en-GB"/>
-        </w:rPr>
-        <w:t>7</w:t>
-      </w:r>
-      <w:r>
-        <w:rPr>
-          <w:rFonts w:ascii="Tahoma" w:hAnsi="Tahoma" w:cs="Tahoma"/>
-          <w:bCs/>
-          <w:sz w:val="22"/>
-          <w:szCs w:val="22"/>
-        </w:rPr>
-        <w:t xml:space="preserve"> (</w:t>
-      </w:r>
-      <w:proofErr w:type="spellStart"/>
-      <w:r>
-        <w:rPr>
-          <w:rFonts w:ascii="Tahoma" w:hAnsi="Tahoma" w:cs="Tahoma"/>
-          <w:bCs/>
-          <w:sz w:val="22"/>
-          <w:szCs w:val="22"/>
-          <w:lang w:val="en-GB"/>
-        </w:rPr>
-        <w:t>Tujuh</w:t>
-      </w:r>
-      <w:proofErr w:type="spellEnd"/>
-      <w:r>
-        <w:rPr>
-          <w:rFonts w:ascii="Tahoma" w:hAnsi="Tahoma" w:cs="Tahoma"/>
-          <w:bCs/>
-          <w:sz w:val="22"/>
-          <w:szCs w:val="22"/>
-          <w:lang w:val="id-ID"/>
-        </w:rPr>
-        <w:t>)</w:t>
+        <w:t>}</w:t>
       </w:r>
     </w:p>
     <w:p>
@@ -19138,6 +18133,11 @@
       <w:shd w:val="clear" w:color="auto" w:fill="E1DFDD"/>
     </w:rPr>
   </w:style>
+  <w:style w:type="character" w:customStyle="1" w:styleId="mtk1">
+    <w:name w:val="mtk1"/>
+    <w:basedOn w:val="DefaultParagraphFont"/>
+    <w:rsid w:val="00AA4FA6"/>
+  </w:style>
 </w:styles>
 </file>
 

</xml_diff>

<commit_message>
Fix Anjab PDF Viewer
</commit_message>
<xml_diff>
--- a/public/templates/anjab.docx
+++ b/public/templates/anjab.docx
@@ -6357,12 +6357,13 @@
           <w:insideH w:val="single" w:sz="4" w:space="0" w:color="auto"/>
           <w:insideV w:val="single" w:sz="4" w:space="0" w:color="auto"/>
         </w:tblBorders>
+        <w:tblLayout w:type="fixed"/>
         <w:tblLook w:val="04A0" w:firstRow="1" w:lastRow="0" w:firstColumn="1" w:lastColumn="0" w:noHBand="0" w:noVBand="1"/>
       </w:tblPr>
       <w:tblGrid>
-        <w:gridCol w:w="1972"/>
-        <w:gridCol w:w="3675"/>
-        <w:gridCol w:w="3283"/>
+        <w:gridCol w:w="567"/>
+        <w:gridCol w:w="4677"/>
+        <w:gridCol w:w="3686"/>
       </w:tblGrid>
       <w:tr>
         <w:trPr>
@@ -7351,11 +7352,12 @@
           <w:insideH w:val="single" w:sz="4" w:space="0" w:color="auto"/>
           <w:insideV w:val="single" w:sz="4" w:space="0" w:color="auto"/>
         </w:tblBorders>
+        <w:tblLayout w:type="fixed"/>
         <w:tblLook w:val="04A0" w:firstRow="1" w:lastRow="0" w:firstColumn="1" w:lastColumn="0" w:noHBand="0" w:noVBand="1"/>
       </w:tblPr>
       <w:tblGrid>
-        <w:gridCol w:w="1972"/>
-        <w:gridCol w:w="6958"/>
+        <w:gridCol w:w="595"/>
+        <w:gridCol w:w="8335"/>
       </w:tblGrid>
       <w:tr>
         <w:trPr>
@@ -8114,12 +8116,13 @@
           <w:insideH w:val="single" w:sz="4" w:space="0" w:color="auto"/>
           <w:insideV w:val="single" w:sz="4" w:space="0" w:color="auto"/>
         </w:tblBorders>
+        <w:tblLayout w:type="fixed"/>
         <w:tblLook w:val="04A0" w:firstRow="1" w:lastRow="0" w:firstColumn="1" w:lastColumn="0" w:noHBand="0" w:noVBand="1"/>
       </w:tblPr>
       <w:tblGrid>
-        <w:gridCol w:w="2118"/>
-        <w:gridCol w:w="3351"/>
-        <w:gridCol w:w="3461"/>
+        <w:gridCol w:w="567"/>
+        <w:gridCol w:w="4677"/>
+        <w:gridCol w:w="3686"/>
       </w:tblGrid>
       <w:tr>
         <w:trPr>
@@ -8950,12 +8953,13 @@
           <w:insideH w:val="single" w:sz="4" w:space="0" w:color="auto"/>
           <w:insideV w:val="single" w:sz="4" w:space="0" w:color="auto"/>
         </w:tblBorders>
+        <w:tblLayout w:type="fixed"/>
         <w:tblLook w:val="04A0" w:firstRow="1" w:lastRow="0" w:firstColumn="1" w:lastColumn="0" w:noHBand="0" w:noVBand="1"/>
       </w:tblPr>
       <w:tblGrid>
-        <w:gridCol w:w="2461"/>
-        <w:gridCol w:w="2857"/>
-        <w:gridCol w:w="3612"/>
+        <w:gridCol w:w="567"/>
+        <w:gridCol w:w="4677"/>
+        <w:gridCol w:w="3686"/>
       </w:tblGrid>
       <w:tr>
         <w:trPr>
@@ -9097,7 +9101,15 @@
                 <w:rFonts w:ascii="Tahoma" w:hAnsi="Tahoma" w:cs="Tahoma"/>
                 <w:bCs/>
               </w:rPr>
-              <w:t>perangkat</w:t>
+              <w:t>perang</w:t>
+            </w:r>
+            <w:r>
+              <w:rPr>
+                <w:rFonts w:ascii="Tahoma" w:hAnsi="Tahoma" w:cs="Tahoma"/>
+                <w:bCs/>
+              </w:rPr>
+              <w:lastRenderedPageBreak/>
+              <w:t>kat</w:t>
             </w:r>
             <w:r>
               <w:rPr>
@@ -9153,6 +9165,7 @@
                 <w:szCs w:val="22"/>
                 <w:lang w:val="en-ID"/>
               </w:rPr>
+              <w:lastRenderedPageBreak/>
               <w:t>{#</w:t>
             </w:r>
             <w:r>
@@ -9871,11 +9884,12 @@
           <w:insideH w:val="single" w:sz="4" w:space="0" w:color="auto"/>
           <w:insideV w:val="single" w:sz="4" w:space="0" w:color="auto"/>
         </w:tblBorders>
+        <w:tblLayout w:type="fixed"/>
         <w:tblLook w:val="04A0" w:firstRow="1" w:lastRow="0" w:firstColumn="1" w:lastColumn="0" w:noHBand="0" w:noVBand="1"/>
       </w:tblPr>
       <w:tblGrid>
-        <w:gridCol w:w="2500"/>
-        <w:gridCol w:w="6430"/>
+        <w:gridCol w:w="595"/>
+        <w:gridCol w:w="8335"/>
       </w:tblGrid>
       <w:tr>
         <w:trPr>
@@ -10183,11 +10197,12 @@
           <w:insideH w:val="single" w:sz="4" w:space="0" w:color="auto"/>
           <w:insideV w:val="single" w:sz="4" w:space="0" w:color="auto"/>
         </w:tblBorders>
+        <w:tblLayout w:type="fixed"/>
         <w:tblLook w:val="04A0" w:firstRow="1" w:lastRow="0" w:firstColumn="1" w:lastColumn="0" w:noHBand="0" w:noVBand="1"/>
       </w:tblPr>
       <w:tblGrid>
-        <w:gridCol w:w="1973"/>
-        <w:gridCol w:w="6957"/>
+        <w:gridCol w:w="595"/>
+        <w:gridCol w:w="8335"/>
       </w:tblGrid>
       <w:tr>
         <w:trPr>
@@ -10480,13 +10495,14 @@
           <w:insideH w:val="single" w:sz="4" w:space="0" w:color="auto"/>
           <w:insideV w:val="single" w:sz="4" w:space="0" w:color="auto"/>
         </w:tblBorders>
+        <w:tblLayout w:type="fixed"/>
         <w:tblLook w:val="04A0" w:firstRow="1" w:lastRow="0" w:firstColumn="1" w:lastColumn="0" w:noHBand="0" w:noVBand="1"/>
       </w:tblPr>
       <w:tblGrid>
-        <w:gridCol w:w="1698"/>
-        <w:gridCol w:w="2343"/>
-        <w:gridCol w:w="2434"/>
-        <w:gridCol w:w="2455"/>
+        <w:gridCol w:w="595"/>
+        <w:gridCol w:w="2552"/>
+        <w:gridCol w:w="2835"/>
+        <w:gridCol w:w="2948"/>
       </w:tblGrid>
       <w:tr>
         <w:trPr>
@@ -11209,12 +11225,13 @@
           <w:insideH w:val="single" w:sz="4" w:space="0" w:color="auto"/>
           <w:insideV w:val="single" w:sz="4" w:space="0" w:color="auto"/>
         </w:tblBorders>
+        <w:tblLayout w:type="fixed"/>
         <w:tblLook w:val="04A0" w:firstRow="1" w:lastRow="0" w:firstColumn="1" w:lastColumn="0" w:noHBand="0" w:noVBand="1"/>
       </w:tblPr>
       <w:tblGrid>
-        <w:gridCol w:w="1638"/>
-        <w:gridCol w:w="3947"/>
-        <w:gridCol w:w="3345"/>
+        <w:gridCol w:w="567"/>
+        <w:gridCol w:w="4677"/>
+        <w:gridCol w:w="3686"/>
       </w:tblGrid>
       <w:tr>
         <w:trPr>
@@ -11606,12 +11623,13 @@
           <w:insideH w:val="single" w:sz="4" w:space="0" w:color="auto"/>
           <w:insideV w:val="single" w:sz="4" w:space="0" w:color="auto"/>
         </w:tblBorders>
+        <w:tblLayout w:type="fixed"/>
         <w:tblLook w:val="04A0" w:firstRow="1" w:lastRow="0" w:firstColumn="1" w:lastColumn="0" w:noHBand="0" w:noVBand="1"/>
       </w:tblPr>
       <w:tblGrid>
-        <w:gridCol w:w="1488"/>
-        <w:gridCol w:w="4059"/>
-        <w:gridCol w:w="3383"/>
+        <w:gridCol w:w="567"/>
+        <w:gridCol w:w="4677"/>
+        <w:gridCol w:w="3686"/>
       </w:tblGrid>
       <w:tr>
         <w:trPr>
@@ -11730,7 +11748,15 @@
                 <w:rFonts w:ascii="Tahoma" w:hAnsi="Tahoma" w:cs="Tahoma"/>
                 <w:bCs/>
               </w:rPr>
-              <w:t>risiko</w:t>
+              <w:t>risik</w:t>
+            </w:r>
+            <w:r>
+              <w:rPr>
+                <w:rFonts w:ascii="Tahoma" w:hAnsi="Tahoma" w:cs="Tahoma"/>
+                <w:bCs/>
+              </w:rPr>
+              <w:lastRenderedPageBreak/>
+              <w:t>o</w:t>
             </w:r>
             <w:r>
               <w:rPr>
@@ -11779,6 +11805,7 @@
                 <w:szCs w:val="22"/>
                 <w:lang w:val="en-ID"/>
               </w:rPr>
+              <w:lastRenderedPageBreak/>
               <w:t>{</w:t>
             </w:r>
             <w:proofErr w:type="spellStart"/>
@@ -12790,7 +12817,6 @@
                 <w:sz w:val="22"/>
                 <w:szCs w:val="22"/>
               </w:rPr>
-              <w:lastRenderedPageBreak/>
               <w:t>d.</w:t>
             </w:r>
           </w:p>

</xml_diff>

<commit_message>
Fix Template and hide Word Download
</commit_message>
<xml_diff>
--- a/public/templates/anjab.docx
+++ b/public/templates/anjab.docx
@@ -612,17 +612,7 @@
                 <w:sz w:val="22"/>
                 <w:szCs w:val="22"/>
               </w:rPr>
-              <w:t xml:space="preserve">  </w:t>
-            </w:r>
-            <w:r>
-              <w:rPr>
-                <w:rFonts w:ascii="Tahoma" w:hAnsi="Tahoma" w:cs="Tahoma"/>
-                <w:b w:val="0"/>
-                <w:bCs/>
-                <w:sz w:val="22"/>
-                <w:szCs w:val="22"/>
-              </w:rPr>
-              <w:t xml:space="preserve"> </w:t>
+              <w:tab/>
             </w:r>
             <w:r>
               <w:rPr>
@@ -792,27 +782,17 @@
                 <w:sz w:val="22"/>
                 <w:szCs w:val="22"/>
               </w:rPr>
-              <w:t xml:space="preserve">   </w:t>
-            </w:r>
-            <w:r>
-              <w:rPr>
-                <w:rFonts w:ascii="Tahoma" w:hAnsi="Tahoma" w:cs="Tahoma"/>
-                <w:b w:val="0"/>
-                <w:bCs/>
-                <w:sz w:val="22"/>
-                <w:szCs w:val="22"/>
-              </w:rPr>
-              <w:t xml:space="preserve">JPT </w:t>
-            </w:r>
-            <w:r>
-              <w:rPr>
-                <w:rFonts w:ascii="Tahoma" w:hAnsi="Tahoma" w:cs="Tahoma"/>
-                <w:b w:val="0"/>
-                <w:bCs/>
-                <w:sz w:val="22"/>
-                <w:szCs w:val="22"/>
-              </w:rPr>
-              <w:t>Madya</w:t>
+              <w:tab/>
+            </w:r>
+            <w:r>
+              <w:rPr>
+                <w:rFonts w:ascii="Tahoma" w:hAnsi="Tahoma" w:cs="Tahoma"/>
+                <w:b w:val="0"/>
+                <w:bCs/>
+                <w:sz w:val="22"/>
+                <w:szCs w:val="22"/>
+              </w:rPr>
+              <w:t>JPT Madya</w:t>
             </w:r>
           </w:p>
         </w:tc>
@@ -972,27 +952,27 @@
                 <w:sz w:val="22"/>
                 <w:szCs w:val="22"/>
               </w:rPr>
-              <w:t xml:space="preserve">   </w:t>
-            </w:r>
-            <w:r>
-              <w:rPr>
-                <w:rFonts w:ascii="Tahoma" w:hAnsi="Tahoma" w:cs="Tahoma"/>
-                <w:b w:val="0"/>
-                <w:bCs/>
-                <w:sz w:val="22"/>
-                <w:szCs w:val="22"/>
-              </w:rPr>
-              <w:t xml:space="preserve">JPT </w:t>
-            </w:r>
-            <w:r>
-              <w:rPr>
-                <w:rFonts w:ascii="Tahoma" w:hAnsi="Tahoma" w:cs="Tahoma"/>
-                <w:b w:val="0"/>
-                <w:bCs/>
-                <w:sz w:val="22"/>
-                <w:szCs w:val="22"/>
-              </w:rPr>
-              <w:t>Pratama</w:t>
+              <w:t xml:space="preserve"> </w:t>
+            </w:r>
+            <w:r>
+              <w:rPr>
+                <w:rFonts w:ascii="Tahoma" w:hAnsi="Tahoma" w:cs="Tahoma"/>
+                <w:b w:val="0"/>
+                <w:bCs/>
+                <w:sz w:val="22"/>
+                <w:szCs w:val="22"/>
+              </w:rPr>
+              <w:tab/>
+            </w:r>
+            <w:r>
+              <w:rPr>
+                <w:rFonts w:ascii="Tahoma" w:hAnsi="Tahoma" w:cs="Tahoma"/>
+                <w:b w:val="0"/>
+                <w:bCs/>
+                <w:sz w:val="22"/>
+                <w:szCs w:val="22"/>
+              </w:rPr>
+              <w:t>JPT Pratama</w:t>
             </w:r>
           </w:p>
         </w:tc>
@@ -1113,31 +1093,55 @@
               <w:rPr>
                 <w:rStyle w:val="Strong"/>
                 <w:rFonts w:ascii="Tahoma" w:hAnsi="Tahoma" w:cs="Tahoma"/>
-                <w:bCs/>
-                <w:color w:val="auto"/>
-                <w:sz w:val="22"/>
-                <w:szCs w:val="22"/>
-              </w:rPr>
-              <w:t xml:space="preserve">        d</w:t>
-            </w:r>
-            <w:r>
-              <w:rPr>
-                <w:rFonts w:ascii="Tahoma" w:hAnsi="Tahoma" w:cs="Tahoma"/>
-                <w:b w:val="0"/>
+                <w:b/>
+                <w:bCs/>
                 <w:sz w:val="22"/>
                 <w:szCs w:val="22"/>
                 <w:lang w:val="id-ID"/>
               </w:rPr>
+              <w:t xml:space="preserve">        </w:t>
+            </w:r>
+            <w:r>
+              <w:rPr>
+                <w:rFonts w:ascii="Tahoma" w:hAnsi="Tahoma" w:cs="Tahoma"/>
+                <w:b w:val="0"/>
+                <w:bCs/>
+                <w:sz w:val="22"/>
+                <w:szCs w:val="22"/>
+                <w:lang w:val="id-ID"/>
+              </w:rPr>
+              <w:t>d</w:t>
+            </w:r>
+            <w:r>
+              <w:rPr>
+                <w:rFonts w:ascii="Tahoma" w:hAnsi="Tahoma" w:cs="Tahoma"/>
+                <w:b w:val="0"/>
+                <w:bCs/>
+                <w:sz w:val="22"/>
+                <w:szCs w:val="22"/>
+                <w:lang w:val="id-ID"/>
+              </w:rPr>
               <w:t>.</w:t>
             </w:r>
             <w:r>
               <w:rPr>
                 <w:rFonts w:ascii="Tahoma" w:hAnsi="Tahoma" w:cs="Tahoma"/>
-                <w:bCs/>
-                <w:sz w:val="22"/>
-                <w:szCs w:val="22"/>
-              </w:rPr>
-              <w:t xml:space="preserve">   </w:t>
+                <w:b w:val="0"/>
+                <w:bCs/>
+                <w:sz w:val="22"/>
+                <w:szCs w:val="22"/>
+              </w:rPr>
+              <w:t xml:space="preserve"> </w:t>
+            </w:r>
+            <w:r>
+              <w:rPr>
+                <w:rFonts w:ascii="Tahoma" w:hAnsi="Tahoma" w:cs="Tahoma"/>
+                <w:b w:val="0"/>
+                <w:bCs/>
+                <w:sz w:val="22"/>
+                <w:szCs w:val="22"/>
+              </w:rPr>
+              <w:tab/>
             </w:r>
             <w:r>
               <w:rPr>
@@ -1239,30 +1243,55 @@
               <w:rPr>
                 <w:rStyle w:val="Strong"/>
                 <w:rFonts w:ascii="Tahoma" w:hAnsi="Tahoma" w:cs="Tahoma"/>
-                <w:bCs/>
-                <w:color w:val="auto"/>
-                <w:sz w:val="22"/>
-                <w:szCs w:val="22"/>
-              </w:rPr>
-              <w:t xml:space="preserve">        e</w:t>
-            </w:r>
-            <w:r>
-              <w:rPr>
-                <w:rFonts w:ascii="Tahoma" w:hAnsi="Tahoma" w:cs="Tahoma"/>
-                <w:b w:val="0"/>
+                <w:b/>
+                <w:bCs/>
                 <w:sz w:val="22"/>
                 <w:szCs w:val="22"/>
                 <w:lang w:val="id-ID"/>
               </w:rPr>
+              <w:t xml:space="preserve">        </w:t>
+            </w:r>
+            <w:r>
+              <w:rPr>
+                <w:rFonts w:ascii="Tahoma" w:hAnsi="Tahoma" w:cs="Tahoma"/>
+                <w:b w:val="0"/>
+                <w:bCs/>
+                <w:sz w:val="22"/>
+                <w:szCs w:val="22"/>
+                <w:lang w:val="id-ID"/>
+              </w:rPr>
+              <w:t>e</w:t>
+            </w:r>
+            <w:r>
+              <w:rPr>
+                <w:rFonts w:ascii="Tahoma" w:hAnsi="Tahoma" w:cs="Tahoma"/>
+                <w:b w:val="0"/>
+                <w:bCs/>
+                <w:sz w:val="22"/>
+                <w:szCs w:val="22"/>
+                <w:lang w:val="id-ID"/>
+              </w:rPr>
               <w:t>.</w:t>
             </w:r>
             <w:r>
               <w:rPr>
                 <w:rFonts w:ascii="Tahoma" w:hAnsi="Tahoma" w:cs="Tahoma"/>
-                <w:sz w:val="22"/>
-                <w:szCs w:val="22"/>
-              </w:rPr>
-              <w:t xml:space="preserve">   </w:t>
+                <w:b w:val="0"/>
+                <w:bCs/>
+                <w:sz w:val="22"/>
+                <w:szCs w:val="22"/>
+              </w:rPr>
+              <w:t xml:space="preserve"> </w:t>
+            </w:r>
+            <w:r>
+              <w:rPr>
+                <w:rFonts w:ascii="Tahoma" w:hAnsi="Tahoma" w:cs="Tahoma"/>
+                <w:b w:val="0"/>
+                <w:bCs/>
+                <w:sz w:val="22"/>
+                <w:szCs w:val="22"/>
+              </w:rPr>
+              <w:tab/>
             </w:r>
             <w:proofErr w:type="spellStart"/>
             <w:r>
@@ -1394,40 +1423,55 @@
               <w:rPr>
                 <w:rStyle w:val="Strong"/>
                 <w:rFonts w:ascii="Tahoma" w:hAnsi="Tahoma" w:cs="Tahoma"/>
-                <w:bCs/>
-                <w:color w:val="auto"/>
-                <w:sz w:val="22"/>
-                <w:szCs w:val="22"/>
-              </w:rPr>
-              <w:t xml:space="preserve">        f</w:t>
-            </w:r>
-            <w:r>
-              <w:rPr>
-                <w:rFonts w:ascii="Tahoma" w:hAnsi="Tahoma" w:cs="Tahoma"/>
-                <w:b w:val="0"/>
+                <w:b/>
+                <w:bCs/>
                 <w:sz w:val="22"/>
                 <w:szCs w:val="22"/>
                 <w:lang w:val="id-ID"/>
               </w:rPr>
+              <w:t xml:space="preserve">        </w:t>
+            </w:r>
+            <w:r>
+              <w:rPr>
+                <w:rFonts w:ascii="Tahoma" w:hAnsi="Tahoma" w:cs="Tahoma"/>
+                <w:b w:val="0"/>
+                <w:bCs/>
+                <w:sz w:val="22"/>
+                <w:szCs w:val="22"/>
+                <w:lang w:val="id-ID"/>
+              </w:rPr>
+              <w:t>f</w:t>
+            </w:r>
+            <w:r>
+              <w:rPr>
+                <w:rFonts w:ascii="Tahoma" w:hAnsi="Tahoma" w:cs="Tahoma"/>
+                <w:b w:val="0"/>
+                <w:bCs/>
+                <w:sz w:val="22"/>
+                <w:szCs w:val="22"/>
+                <w:lang w:val="id-ID"/>
+              </w:rPr>
               <w:t>.</w:t>
             </w:r>
             <w:r>
               <w:rPr>
                 <w:rFonts w:ascii="Tahoma" w:hAnsi="Tahoma" w:cs="Tahoma"/>
-                <w:bCs/>
-                <w:sz w:val="22"/>
-                <w:szCs w:val="22"/>
-              </w:rPr>
-              <w:t xml:space="preserve">   </w:t>
-            </w:r>
-            <w:r>
-              <w:rPr>
-                <w:rFonts w:ascii="Tahoma" w:hAnsi="Tahoma" w:cs="Tahoma"/>
+                <w:b w:val="0"/>
                 <w:bCs/>
                 <w:sz w:val="22"/>
                 <w:szCs w:val="22"/>
               </w:rPr>
               <w:t xml:space="preserve"> </w:t>
+            </w:r>
+            <w:r>
+              <w:rPr>
+                <w:rFonts w:ascii="Tahoma" w:hAnsi="Tahoma" w:cs="Tahoma"/>
+                <w:b w:val="0"/>
+                <w:bCs/>
+                <w:sz w:val="22"/>
+                <w:szCs w:val="22"/>
+              </w:rPr>
+              <w:tab/>
             </w:r>
             <w:proofErr w:type="spellStart"/>
             <w:r>
@@ -1559,59 +1603,56 @@
               <w:rPr>
                 <w:rStyle w:val="Strong"/>
                 <w:rFonts w:ascii="Tahoma" w:hAnsi="Tahoma" w:cs="Tahoma"/>
-                <w:bCs/>
-                <w:color w:val="auto"/>
-                <w:sz w:val="22"/>
-                <w:szCs w:val="22"/>
-              </w:rPr>
-              <w:t xml:space="preserve">        g</w:t>
-            </w:r>
-            <w:r>
-              <w:rPr>
-                <w:rStyle w:val="Strong"/>
-                <w:rFonts w:ascii="Tahoma" w:hAnsi="Tahoma" w:cs="Tahoma"/>
-                <w:bCs/>
-                <w:color w:val="auto"/>
-                <w:sz w:val="22"/>
-                <w:szCs w:val="22"/>
-              </w:rPr>
-              <w:t xml:space="preserve">.   </w:t>
+                <w:b/>
+                <w:bCs/>
+                <w:sz w:val="22"/>
+                <w:szCs w:val="22"/>
+                <w:lang w:val="id-ID"/>
+              </w:rPr>
+              <w:t xml:space="preserve">        </w:t>
+            </w:r>
+            <w:r>
+              <w:rPr>
+                <w:rFonts w:ascii="Tahoma" w:hAnsi="Tahoma" w:cs="Tahoma"/>
+                <w:b w:val="0"/>
+                <w:bCs/>
+                <w:sz w:val="22"/>
+                <w:szCs w:val="22"/>
+                <w:lang w:val="id-ID"/>
+              </w:rPr>
+              <w:t>g</w:t>
+            </w:r>
+            <w:r>
+              <w:rPr>
+                <w:rFonts w:ascii="Tahoma" w:hAnsi="Tahoma" w:cs="Tahoma"/>
+                <w:b w:val="0"/>
+                <w:bCs/>
+                <w:sz w:val="22"/>
+                <w:szCs w:val="22"/>
+                <w:lang w:val="id-ID"/>
+              </w:rPr>
+              <w:t>.</w:t>
+            </w:r>
+            <w:r>
+              <w:rPr>
+                <w:rFonts w:ascii="Tahoma" w:hAnsi="Tahoma" w:cs="Tahoma"/>
+                <w:b w:val="0"/>
+                <w:bCs/>
+                <w:sz w:val="22"/>
+                <w:szCs w:val="22"/>
+                <w:lang w:val="id-ID"/>
+              </w:rPr>
+              <w:tab/>
             </w:r>
             <w:proofErr w:type="spellStart"/>
             <w:r>
               <w:rPr>
-                <w:rStyle w:val="Strong"/>
-                <w:rFonts w:ascii="Tahoma" w:hAnsi="Tahoma" w:cs="Tahoma"/>
-                <w:bCs/>
-                <w:color w:val="auto"/>
-                <w:sz w:val="22"/>
-                <w:szCs w:val="22"/>
-              </w:rPr>
-              <w:t>Jabatan</w:t>
-            </w:r>
-            <w:proofErr w:type="spellEnd"/>
-            <w:r>
-              <w:rPr>
-                <w:rStyle w:val="Strong"/>
-                <w:rFonts w:ascii="Tahoma" w:hAnsi="Tahoma" w:cs="Tahoma"/>
-                <w:bCs/>
-                <w:color w:val="auto"/>
-                <w:sz w:val="22"/>
-                <w:szCs w:val="22"/>
-              </w:rPr>
-              <w:t xml:space="preserve"> </w:t>
-            </w:r>
-            <w:proofErr w:type="spellStart"/>
-            <w:r>
-              <w:rPr>
-                <w:rStyle w:val="Strong"/>
-                <w:rFonts w:ascii="Tahoma" w:hAnsi="Tahoma" w:cs="Tahoma"/>
-                <w:bCs/>
-                <w:color w:val="auto"/>
-                <w:sz w:val="22"/>
-                <w:szCs w:val="22"/>
-              </w:rPr>
-              <w:t>Fungsional</w:t>
+                <w:rFonts w:ascii="Tahoma" w:hAnsi="Tahoma" w:cs="Tahoma"/>
+                <w:b w:val="0"/>
+                <w:sz w:val="22"/>
+                <w:szCs w:val="22"/>
+              </w:rPr>
+              <w:t>Pelaksana</w:t>
             </w:r>
             <w:proofErr w:type="spellEnd"/>
           </w:p>
@@ -1913,6 +1954,7 @@
         </w:rPr>
         <w:t xml:space="preserve">KUALIFIKASI </w:t>
       </w:r>
+      <w:proofErr w:type="gramStart"/>
       <w:r>
         <w:rPr>
           <w:rFonts w:ascii="Tahoma" w:hAnsi="Tahoma" w:cs="Tahoma"/>
@@ -1935,6 +1977,7 @@
         </w:rPr>
         <w:t xml:space="preserve"> :</w:t>
       </w:r>
+      <w:proofErr w:type="gramEnd"/>
     </w:p>
     <w:tbl>
       <w:tblPr>
@@ -2012,17 +2055,41 @@
                 <w:szCs w:val="22"/>
                 <w:lang w:eastAsia="id-ID"/>
               </w:rPr>
-              <w:t>{#kualifikasi}</w:t>
-            </w:r>
-            <w:r>
-              <w:rPr>
-                <w:rFonts w:ascii="Tahoma" w:hAnsi="Tahoma" w:cs="Tahoma"/>
-                <w:b w:val="0"/>
-                <w:bCs/>
-                <w:sz w:val="22"/>
-                <w:szCs w:val="22"/>
-              </w:rPr>
-              <w:t>Pendidikan Formal</w:t>
+              <w:t>{#</w:t>
+            </w:r>
+            <w:proofErr w:type="gramStart"/>
+            <w:r>
+              <w:rPr>
+                <w:rFonts w:ascii="Tahoma" w:eastAsia="Times New Roman" w:hAnsi="Tahoma" w:cs="Tahoma"/>
+                <w:b w:val="0"/>
+                <w:iCs/>
+                <w:color w:val="auto"/>
+                <w:sz w:val="22"/>
+                <w:szCs w:val="22"/>
+                <w:lang w:eastAsia="id-ID"/>
+              </w:rPr>
+              <w:t>kualifikasi}</w:t>
+            </w:r>
+            <w:r>
+              <w:rPr>
+                <w:rFonts w:ascii="Tahoma" w:hAnsi="Tahoma" w:cs="Tahoma"/>
+                <w:b w:val="0"/>
+                <w:bCs/>
+                <w:sz w:val="22"/>
+                <w:szCs w:val="22"/>
+              </w:rPr>
+              <w:t>Pendidikan</w:t>
+            </w:r>
+            <w:proofErr w:type="gramEnd"/>
+            <w:r>
+              <w:rPr>
+                <w:rFonts w:ascii="Tahoma" w:hAnsi="Tahoma" w:cs="Tahoma"/>
+                <w:b w:val="0"/>
+                <w:bCs/>
+                <w:sz w:val="22"/>
+                <w:szCs w:val="22"/>
+              </w:rPr>
+              <w:t xml:space="preserve"> Formal</w:t>
             </w:r>
           </w:p>
         </w:tc>
@@ -4305,6 +4372,7 @@
               <w:t>{/</w:t>
             </w:r>
             <w:proofErr w:type="spellStart"/>
+            <w:proofErr w:type="gramStart"/>
             <w:r>
               <w:rPr>
                 <w:rFonts w:ascii="Tahoma" w:hAnsi="Tahoma" w:cs="Tahoma"/>
@@ -4336,7 +4404,18 @@
                 <w:sz w:val="22"/>
                 <w:szCs w:val="22"/>
               </w:rPr>
-              <w:t>{/</w:t>
+              <w:t>{</w:t>
+            </w:r>
+            <w:proofErr w:type="gramEnd"/>
+            <w:r>
+              <w:rPr>
+                <w:rFonts w:ascii="Tahoma" w:hAnsi="Tahoma" w:cs="Tahoma"/>
+                <w:b w:val="0"/>
+                <w:color w:val="auto"/>
+                <w:sz w:val="22"/>
+                <w:szCs w:val="22"/>
+              </w:rPr>
+              <w:t>/</w:t>
             </w:r>
             <w:proofErr w:type="spellStart"/>
             <w:r>
@@ -4432,7 +4511,17 @@
           <w:sz w:val="22"/>
           <w:szCs w:val="22"/>
         </w:rPr>
-        <w:t>TUGAS POKOK</w:t>
+        <w:t xml:space="preserve">TUGAS </w:t>
+      </w:r>
+      <w:proofErr w:type="gramStart"/>
+      <w:r>
+        <w:rPr>
+          <w:rFonts w:ascii="Tahoma" w:hAnsi="Tahoma" w:cs="Tahoma"/>
+          <w:bCs/>
+          <w:sz w:val="22"/>
+          <w:szCs w:val="22"/>
+        </w:rPr>
+        <w:t>POKOK</w:t>
       </w:r>
       <w:r>
         <w:rPr>
@@ -4455,6 +4544,7 @@
         </w:rPr>
         <w:t>:</w:t>
       </w:r>
+      <w:proofErr w:type="gramEnd"/>
     </w:p>
     <w:tbl>
       <w:tblPr>
@@ -5878,7 +5968,19 @@
                 <w:szCs w:val="22"/>
                 <w:lang w:val="en-ID"/>
               </w:rPr>
-              <w:t>kebutuhan_pegawai</w:t>
+              <w:t>kebutuhan_</w:t>
+            </w:r>
+            <w:proofErr w:type="gramStart"/>
+            <w:r>
+              <w:rPr>
+                <w:rFonts w:ascii="Tahoma" w:eastAsia="Tahoma" w:hAnsi="Tahoma" w:cs="Tahoma"/>
+                <w:b w:val="0"/>
+                <w:bCs/>
+                <w:sz w:val="22"/>
+                <w:szCs w:val="22"/>
+                <w:lang w:val="en-ID"/>
+              </w:rPr>
+              <w:t>pegawai</w:t>
             </w:r>
             <w:proofErr w:type="spellEnd"/>
             <w:r>
@@ -5890,7 +5992,19 @@
                 <w:szCs w:val="22"/>
                 <w:lang w:val="en-ID"/>
               </w:rPr>
-              <w:t>}{/</w:t>
+              <w:t>}{</w:t>
+            </w:r>
+            <w:proofErr w:type="gramEnd"/>
+            <w:r>
+              <w:rPr>
+                <w:rFonts w:ascii="Tahoma" w:eastAsia="Tahoma" w:hAnsi="Tahoma" w:cs="Tahoma"/>
+                <w:b w:val="0"/>
+                <w:bCs/>
+                <w:sz w:val="22"/>
+                <w:szCs w:val="22"/>
+                <w:lang w:val="en-ID"/>
+              </w:rPr>
+              <w:t>/</w:t>
             </w:r>
             <w:proofErr w:type="spellStart"/>
             <w:r>
@@ -6183,7 +6297,17 @@
           <w:sz w:val="22"/>
           <w:szCs w:val="22"/>
         </w:rPr>
-        <w:t>HASIL KERJA</w:t>
+        <w:t xml:space="preserve">HASIL </w:t>
+      </w:r>
+      <w:proofErr w:type="gramStart"/>
+      <w:r>
+        <w:rPr>
+          <w:rFonts w:ascii="Tahoma" w:hAnsi="Tahoma" w:cs="Tahoma"/>
+          <w:bCs/>
+          <w:sz w:val="22"/>
+          <w:szCs w:val="22"/>
+        </w:rPr>
+        <w:t>KERJA</w:t>
       </w:r>
       <w:r>
         <w:rPr>
@@ -6206,6 +6330,7 @@
         </w:rPr>
         <w:t>:</w:t>
       </w:r>
+      <w:proofErr w:type="gramEnd"/>
     </w:p>
     <w:p>
       <w:pPr>
@@ -6354,7 +6479,23 @@
                 <w:rFonts w:ascii="Tahoma" w:hAnsi="Tahoma" w:cs="Tahoma"/>
                 <w:bCs/>
               </w:rPr>
-              <w:t>{#hasil_kerja}{no}.</w:t>
+              <w:t>{#hasil_</w:t>
+            </w:r>
+            <w:proofErr w:type="gramStart"/>
+            <w:r>
+              <w:rPr>
+                <w:rFonts w:ascii="Tahoma" w:hAnsi="Tahoma" w:cs="Tahoma"/>
+                <w:bCs/>
+              </w:rPr>
+              <w:t>kerja}{</w:t>
+            </w:r>
+            <w:proofErr w:type="gramEnd"/>
+            <w:r>
+              <w:rPr>
+                <w:rFonts w:ascii="Tahoma" w:hAnsi="Tahoma" w:cs="Tahoma"/>
+                <w:bCs/>
+              </w:rPr>
+              <w:t>no}.</w:t>
             </w:r>
           </w:p>
         </w:tc>
@@ -7074,6 +7215,7 @@
               <w:t>{/</w:t>
             </w:r>
             <w:proofErr w:type="spellStart"/>
+            <w:proofErr w:type="gramStart"/>
             <w:r>
               <w:rPr>
                 <w:rFonts w:ascii="Tahoma" w:eastAsia="Tahoma" w:hAnsi="Tahoma" w:cs="Tahoma"/>
@@ -7095,7 +7237,19 @@
                 <w:szCs w:val="22"/>
                 <w:lang w:val="en-ID"/>
               </w:rPr>
-              <w:t>}{/</w:t>
+              <w:t>}{</w:t>
+            </w:r>
+            <w:proofErr w:type="gramEnd"/>
+            <w:r>
+              <w:rPr>
+                <w:rFonts w:ascii="Tahoma" w:eastAsia="Tahoma" w:hAnsi="Tahoma" w:cs="Tahoma"/>
+                <w:b w:val="0"/>
+                <w:bCs/>
+                <w:sz w:val="22"/>
+                <w:szCs w:val="22"/>
+                <w:lang w:val="en-ID"/>
+              </w:rPr>
+              <w:t>/</w:t>
             </w:r>
             <w:proofErr w:type="spellStart"/>
             <w:r>
@@ -7294,7 +7448,23 @@
                 <w:rFonts w:ascii="Tahoma" w:hAnsi="Tahoma" w:cs="Tahoma"/>
                 <w:bCs/>
               </w:rPr>
-              <w:t>{#hasil_kerja}{no}.</w:t>
+              <w:t>{#hasil_</w:t>
+            </w:r>
+            <w:proofErr w:type="gramStart"/>
+            <w:r>
+              <w:rPr>
+                <w:rFonts w:ascii="Tahoma" w:hAnsi="Tahoma" w:cs="Tahoma"/>
+                <w:bCs/>
+              </w:rPr>
+              <w:t>kerja}{</w:t>
+            </w:r>
+            <w:proofErr w:type="gramEnd"/>
+            <w:r>
+              <w:rPr>
+                <w:rFonts w:ascii="Tahoma" w:hAnsi="Tahoma" w:cs="Tahoma"/>
+                <w:bCs/>
+              </w:rPr>
+              <w:t>no}.</w:t>
             </w:r>
           </w:p>
         </w:tc>
@@ -7760,6 +7930,7 @@
               <w:t>{/</w:t>
             </w:r>
             <w:proofErr w:type="spellStart"/>
+            <w:proofErr w:type="gramStart"/>
             <w:r>
               <w:rPr>
                 <w:rFonts w:ascii="Tahoma" w:hAnsi="Tahoma" w:cs="Tahoma"/>
@@ -7782,7 +7953,19 @@
                 <w:szCs w:val="22"/>
                 <w:lang w:val="en-ID"/>
               </w:rPr>
-              <w:t>}{/</w:t>
+              <w:t>}{</w:t>
+            </w:r>
+            <w:proofErr w:type="gramEnd"/>
+            <w:r>
+              <w:rPr>
+                <w:rFonts w:ascii="Tahoma" w:eastAsia="Tahoma" w:hAnsi="Tahoma" w:cs="Tahoma"/>
+                <w:b w:val="0"/>
+                <w:bCs/>
+                <w:sz w:val="22"/>
+                <w:szCs w:val="22"/>
+                <w:lang w:val="en-ID"/>
+              </w:rPr>
+              <w:t>/</w:t>
             </w:r>
             <w:proofErr w:type="spellStart"/>
             <w:r>
@@ -8076,7 +8259,23 @@
                 <w:rFonts w:ascii="Tahoma" w:hAnsi="Tahoma" w:cs="Tahoma"/>
                 <w:bCs/>
               </w:rPr>
-              <w:t>_kerja}{no}.</w:t>
+              <w:t>_</w:t>
+            </w:r>
+            <w:proofErr w:type="gramStart"/>
+            <w:r>
+              <w:rPr>
+                <w:rFonts w:ascii="Tahoma" w:hAnsi="Tahoma" w:cs="Tahoma"/>
+                <w:bCs/>
+              </w:rPr>
+              <w:t>kerja}{</w:t>
+            </w:r>
+            <w:proofErr w:type="gramEnd"/>
+            <w:r>
+              <w:rPr>
+                <w:rFonts w:ascii="Tahoma" w:hAnsi="Tahoma" w:cs="Tahoma"/>
+                <w:bCs/>
+              </w:rPr>
+              <w:t>no}.</w:t>
             </w:r>
           </w:p>
         </w:tc>
@@ -8590,6 +8789,7 @@
               <w:t>{/</w:t>
             </w:r>
             <w:proofErr w:type="spellStart"/>
+            <w:proofErr w:type="gramStart"/>
             <w:r>
               <w:rPr>
                 <w:rFonts w:ascii="Tahoma" w:hAnsi="Tahoma" w:cs="Tahoma"/>
@@ -8611,7 +8811,19 @@
                 <w:szCs w:val="22"/>
                 <w:lang w:val="en-ID"/>
               </w:rPr>
-              <w:t>}{/</w:t>
+              <w:t>}{</w:t>
+            </w:r>
+            <w:proofErr w:type="gramEnd"/>
+            <w:r>
+              <w:rPr>
+                <w:rFonts w:ascii="Tahoma" w:hAnsi="Tahoma" w:cs="Tahoma"/>
+                <w:b w:val="0"/>
+                <w:bCs/>
+                <w:sz w:val="22"/>
+                <w:szCs w:val="22"/>
+                <w:lang w:val="en-ID"/>
+              </w:rPr>
+              <w:t>/</w:t>
             </w:r>
             <w:proofErr w:type="spellStart"/>
             <w:r>
@@ -8703,7 +8915,17 @@
           <w:sz w:val="22"/>
           <w:szCs w:val="22"/>
         </w:rPr>
-        <w:t>PERANGKAT KERJA</w:t>
+        <w:t xml:space="preserve">PERANGKAT </w:t>
+      </w:r>
+      <w:proofErr w:type="gramStart"/>
+      <w:r>
+        <w:rPr>
+          <w:rFonts w:ascii="Tahoma" w:hAnsi="Tahoma" w:cs="Tahoma"/>
+          <w:bCs/>
+          <w:sz w:val="22"/>
+          <w:szCs w:val="22"/>
+        </w:rPr>
+        <w:t>KERJA</w:t>
       </w:r>
       <w:r>
         <w:rPr>
@@ -8726,6 +8948,7 @@
         </w:rPr>
         <w:t>:</w:t>
       </w:r>
+      <w:proofErr w:type="gramEnd"/>
     </w:p>
     <w:tbl>
       <w:tblPr>
@@ -8902,7 +9125,23 @@
                 <w:rFonts w:ascii="Tahoma" w:hAnsi="Tahoma" w:cs="Tahoma"/>
                 <w:bCs/>
               </w:rPr>
-              <w:t>_kerja}{no}.</w:t>
+              <w:t>_</w:t>
+            </w:r>
+            <w:proofErr w:type="gramStart"/>
+            <w:r>
+              <w:rPr>
+                <w:rFonts w:ascii="Tahoma" w:hAnsi="Tahoma" w:cs="Tahoma"/>
+                <w:bCs/>
+              </w:rPr>
+              <w:t>kerja}{</w:t>
+            </w:r>
+            <w:proofErr w:type="gramEnd"/>
+            <w:r>
+              <w:rPr>
+                <w:rFonts w:ascii="Tahoma" w:hAnsi="Tahoma" w:cs="Tahoma"/>
+                <w:bCs/>
+              </w:rPr>
+              <w:t>no}.</w:t>
             </w:r>
           </w:p>
         </w:tc>
@@ -9480,6 +9719,7 @@
               <w:t>{/</w:t>
             </w:r>
             <w:proofErr w:type="spellStart"/>
+            <w:proofErr w:type="gramStart"/>
             <w:r>
               <w:rPr>
                 <w:rFonts w:ascii="Tahoma" w:hAnsi="Tahoma" w:cs="Tahoma"/>
@@ -9501,7 +9741,19 @@
                 <w:szCs w:val="22"/>
                 <w:lang w:val="en-ID"/>
               </w:rPr>
-              <w:t>}{/</w:t>
+              <w:t>}{</w:t>
+            </w:r>
+            <w:proofErr w:type="gramEnd"/>
+            <w:r>
+              <w:rPr>
+                <w:rFonts w:ascii="Tahoma" w:hAnsi="Tahoma" w:cs="Tahoma"/>
+                <w:b w:val="0"/>
+                <w:bCs/>
+                <w:sz w:val="22"/>
+                <w:szCs w:val="22"/>
+                <w:lang w:val="en-ID"/>
+              </w:rPr>
+              <w:t>/</w:t>
             </w:r>
             <w:proofErr w:type="spellStart"/>
             <w:r>
@@ -9744,6 +9996,7 @@
               </w:rPr>
               <w:t>_</w:t>
             </w:r>
+            <w:proofErr w:type="gramStart"/>
             <w:r>
               <w:rPr>
                 <w:rFonts w:ascii="Tahoma" w:hAnsi="Tahoma" w:cs="Tahoma"/>
@@ -9756,7 +10009,15 @@
                 <w:rFonts w:ascii="Tahoma" w:hAnsi="Tahoma" w:cs="Tahoma"/>
                 <w:bCs/>
               </w:rPr>
-              <w:t>}{no}.</w:t>
+              <w:t>}{</w:t>
+            </w:r>
+            <w:proofErr w:type="gramEnd"/>
+            <w:r>
+              <w:rPr>
+                <w:rFonts w:ascii="Tahoma" w:hAnsi="Tahoma" w:cs="Tahoma"/>
+                <w:bCs/>
+              </w:rPr>
+              <w:t>no}.</w:t>
             </w:r>
           </w:p>
         </w:tc>
@@ -10034,6 +10295,7 @@
               </w:rPr>
               <w:t>{#</w:t>
             </w:r>
+            <w:proofErr w:type="gramStart"/>
             <w:r>
               <w:rPr>
                 <w:rFonts w:ascii="Tahoma" w:hAnsi="Tahoma" w:cs="Tahoma"/>
@@ -10046,7 +10308,15 @@
                 <w:rFonts w:ascii="Tahoma" w:hAnsi="Tahoma" w:cs="Tahoma"/>
                 <w:bCs/>
               </w:rPr>
-              <w:t>}{no}.</w:t>
+              <w:t>}{</w:t>
+            </w:r>
+            <w:proofErr w:type="gramEnd"/>
+            <w:r>
+              <w:rPr>
+                <w:rFonts w:ascii="Tahoma" w:hAnsi="Tahoma" w:cs="Tahoma"/>
+                <w:bCs/>
+              </w:rPr>
+              <w:t>no}.</w:t>
             </w:r>
           </w:p>
         </w:tc>
@@ -10378,6 +10648,7 @@
               </w:rPr>
               <w:t>{#</w:t>
             </w:r>
+            <w:proofErr w:type="gramStart"/>
             <w:r>
               <w:rPr>
                 <w:rFonts w:ascii="Tahoma" w:hAnsi="Tahoma" w:cs="Tahoma"/>
@@ -10390,7 +10661,15 @@
                 <w:rFonts w:ascii="Tahoma" w:hAnsi="Tahoma" w:cs="Tahoma"/>
                 <w:bCs/>
               </w:rPr>
-              <w:t>}{no}.</w:t>
+              <w:t>}{</w:t>
+            </w:r>
+            <w:proofErr w:type="gramEnd"/>
+            <w:r>
+              <w:rPr>
+                <w:rFonts w:ascii="Tahoma" w:hAnsi="Tahoma" w:cs="Tahoma"/>
+                <w:bCs/>
+              </w:rPr>
+              <w:t>no}.</w:t>
             </w:r>
           </w:p>
         </w:tc>
@@ -11070,6 +11349,7 @@
               </w:rPr>
               <w:t>{#</w:t>
             </w:r>
+            <w:proofErr w:type="gramStart"/>
             <w:r>
               <w:rPr>
                 <w:rFonts w:ascii="Tahoma" w:hAnsi="Tahoma" w:cs="Tahoma"/>
@@ -11082,7 +11362,15 @@
                 <w:rFonts w:ascii="Tahoma" w:hAnsi="Tahoma" w:cs="Tahoma"/>
                 <w:bCs/>
               </w:rPr>
-              <w:t>}{no}.</w:t>
+              <w:t>}{</w:t>
+            </w:r>
+            <w:proofErr w:type="gramEnd"/>
+            <w:r>
+              <w:rPr>
+                <w:rFonts w:ascii="Tahoma" w:hAnsi="Tahoma" w:cs="Tahoma"/>
+                <w:bCs/>
+              </w:rPr>
+              <w:t>no}.</w:t>
             </w:r>
           </w:p>
         </w:tc>
@@ -11463,6 +11751,7 @@
               </w:rPr>
               <w:t>{#</w:t>
             </w:r>
+            <w:proofErr w:type="gramStart"/>
             <w:r>
               <w:rPr>
                 <w:rFonts w:ascii="Tahoma" w:hAnsi="Tahoma" w:cs="Tahoma"/>
@@ -11483,7 +11772,15 @@
                 <w:rFonts w:ascii="Tahoma" w:hAnsi="Tahoma" w:cs="Tahoma"/>
                 <w:bCs/>
               </w:rPr>
-              <w:t>}{no}.</w:t>
+              <w:t>}{</w:t>
+            </w:r>
+            <w:proofErr w:type="gramEnd"/>
+            <w:r>
+              <w:rPr>
+                <w:rFonts w:ascii="Tahoma" w:hAnsi="Tahoma" w:cs="Tahoma"/>
+                <w:bCs/>
+              </w:rPr>
+              <w:t>no}.</w:t>
             </w:r>
           </w:p>
         </w:tc>
@@ -11783,16 +12080,37 @@
                 <w:szCs w:val="22"/>
                 <w:lang w:val="en-ID"/>
               </w:rPr>
-              <w:t>{#syarat_jabatan}</w:t>
-            </w:r>
-            <w:r>
-              <w:rPr>
-                <w:rFonts w:ascii="Tahoma" w:hAnsi="Tahoma" w:cs="Tahoma"/>
-                <w:bCs/>
-                <w:sz w:val="22"/>
-                <w:szCs w:val="22"/>
-              </w:rPr>
-              <w:t xml:space="preserve">Keterampilan Kerja </w:t>
+              <w:t>{#syarat_</w:t>
+            </w:r>
+            <w:proofErr w:type="gramStart"/>
+            <w:r>
+              <w:rPr>
+                <w:rFonts w:ascii="Tahoma" w:hAnsi="Tahoma" w:cs="Tahoma"/>
+                <w:bCs/>
+                <w:sz w:val="22"/>
+                <w:szCs w:val="22"/>
+                <w:lang w:val="en-ID"/>
+              </w:rPr>
+              <w:t>jabatan}</w:t>
+            </w:r>
+            <w:r>
+              <w:rPr>
+                <w:rFonts w:ascii="Tahoma" w:hAnsi="Tahoma" w:cs="Tahoma"/>
+                <w:bCs/>
+                <w:sz w:val="22"/>
+                <w:szCs w:val="22"/>
+              </w:rPr>
+              <w:t>Keterampilan</w:t>
+            </w:r>
+            <w:proofErr w:type="gramEnd"/>
+            <w:r>
+              <w:rPr>
+                <w:rFonts w:ascii="Tahoma" w:hAnsi="Tahoma" w:cs="Tahoma"/>
+                <w:bCs/>
+                <w:sz w:val="22"/>
+                <w:szCs w:val="22"/>
+              </w:rPr>
+              <w:t xml:space="preserve"> Kerja </w:t>
             </w:r>
           </w:p>
         </w:tc>
@@ -14450,7 +14768,19 @@
                 <w:szCs w:val="22"/>
                 <w:lang w:val="en-ID"/>
               </w:rPr>
-              <w:t>fungsi_pekerja</w:t>
+              <w:t>fungsi_</w:t>
+            </w:r>
+            <w:proofErr w:type="gramStart"/>
+            <w:r>
+              <w:rPr>
+                <w:rFonts w:ascii="Tahoma" w:hAnsi="Tahoma" w:cs="Tahoma"/>
+                <w:b w:val="0"/>
+                <w:bCs/>
+                <w:sz w:val="22"/>
+                <w:szCs w:val="22"/>
+                <w:lang w:val="en-ID"/>
+              </w:rPr>
+              <w:t>pekerja</w:t>
             </w:r>
             <w:proofErr w:type="spellEnd"/>
             <w:r>
@@ -14473,7 +14803,19 @@
                 <w:szCs w:val="22"/>
                 <w:lang w:val="en-ID"/>
               </w:rPr>
-              <w:t>{/</w:t>
+              <w:t>{</w:t>
+            </w:r>
+            <w:proofErr w:type="gramEnd"/>
+            <w:r>
+              <w:rPr>
+                <w:rFonts w:ascii="Tahoma" w:hAnsi="Tahoma" w:cs="Tahoma"/>
+                <w:b w:val="0"/>
+                <w:bCs/>
+                <w:sz w:val="22"/>
+                <w:szCs w:val="22"/>
+                <w:lang w:val="en-ID"/>
+              </w:rPr>
+              <w:t>/</w:t>
             </w:r>
             <w:proofErr w:type="spellStart"/>
             <w:r>
@@ -14568,7 +14910,17 @@
           <w:sz w:val="22"/>
           <w:szCs w:val="22"/>
         </w:rPr>
-        <w:t>PRESTASI YANG DIHARAPKAN</w:t>
+        <w:t xml:space="preserve">PRESTASI YANG </w:t>
+      </w:r>
+      <w:proofErr w:type="gramStart"/>
+      <w:r>
+        <w:rPr>
+          <w:rFonts w:ascii="Tahoma" w:hAnsi="Tahoma" w:cs="Tahoma"/>
+          <w:bCs/>
+          <w:sz w:val="22"/>
+          <w:szCs w:val="22"/>
+        </w:rPr>
+        <w:t>DIHARAPKAN</w:t>
       </w:r>
       <w:r>
         <w:rPr>
@@ -14591,6 +14943,7 @@
         </w:rPr>
         <w:t>:</w:t>
       </w:r>
+      <w:proofErr w:type="gramEnd"/>
     </w:p>
     <w:p>
       <w:pPr>
@@ -14703,7 +15056,17 @@
           <w:sz w:val="22"/>
           <w:szCs w:val="22"/>
         </w:rPr>
-        <w:t>KELAS JABATAN</w:t>
+        <w:t xml:space="preserve">KELAS </w:t>
+      </w:r>
+      <w:proofErr w:type="gramStart"/>
+      <w:r>
+        <w:rPr>
+          <w:rFonts w:ascii="Tahoma" w:hAnsi="Tahoma" w:cs="Tahoma"/>
+          <w:bCs/>
+          <w:sz w:val="22"/>
+          <w:szCs w:val="22"/>
+        </w:rPr>
+        <w:t>JABATAN</w:t>
       </w:r>
       <w:r>
         <w:rPr>
@@ -14726,6 +15089,7 @@
         </w:rPr>
         <w:t>:</w:t>
       </w:r>
+      <w:proofErr w:type="gramEnd"/>
     </w:p>
     <w:bookmarkEnd w:id="0"/>
     <w:p>

</xml_diff>